<commit_message>
Expand real archive dataset to 10 editions / n=92 items (2002-2026); update Ch4 tables, abstract, log
Co-authored-by: arena-agent <297053741+arena-agent@users.noreply.github.com>
</commit_message>
<xml_diff>
--- a/research-proposal/New-Vision-40-Years-RESEARCH-PROPOSAL-FINAL.docx
+++ b/research-proposal/New-Vision-40-Years-RESEARCH-PROPOSAL-FINAL.docx
@@ -220,7 +220,7 @@
     </w:p>
     <w:p>
       <w:r>
-        <w:t>This study assesses the impacts of Uganda's The New Vision newspaper across 40 years of publication (1986–2026) through four objectives: political-discourse influence, economic/industry contribution, social-development contribution, and digital-era sustainability. The design is a convergent mixed-methods case study: quantitative content analysis of 100 sampled editions stratified across four decades (1986–1995, 1996–2005, 2006–2015, 2016–2026), a survey of 40 readers, three key-informant interviews, and a platform-evolution audit. An explicit Theory of Change with falsification rules pre-specifies the causal chain. This proposal reports a real, verifiable pilot dataset: 6 complete editions gathered from public archives (Wayback Machine snapshots for 31/12/2007, 16/06/2010, 20/01/2016, 31/12/2019; live site 20/09/2026), yielding 48 coded items. Preliminary results show politics/elections at 27% of items, development-flagged content at 29% (varying 0–56% by edition type), stance toward state actors at 50% favourable / 25% neutral / 25% critical, women as confirmed sources/subjects in under 5% of items, and a directly observed 19-year digitalisation arc (blogs 2007 → social 2010 → apps 2016 → paywall/multilingual 2026). The pilot establishes feasibility of the public-source protocol, reveals agenda divergence between print and online editions reported in prior monitoring, and identifies stratification corrections for the full study. Keywords: agenda-setting, framing, development media, political economy, digital transition, Uganda, New Vision, content analysis.</w:t>
+        <w:t>This study assesses the impacts of Uganda's The New Vision newspaper across 40 years of publication (1986–2026) through four objectives: political-discourse influence, economic/industry contribution, social-development contribution, and digital-era sustainability. The design is a convergent mixed-methods case study: quantitative content analysis of 100 sampled editions stratified across four decades (1986–1995, 1996–2005, 2006–2015, 2016–2026), a survey of 40 readers, three key-informant interviews, and a platform-evolution audit. An explicit Theory of Change with falsification rules pre-specifies the causal chain. This proposal reports a real, verifiable archive dataset: 10 complete editions gathered from public sources (Wayback Machine snapshots, 17/01/2002–31/12/2019; live site 20/09/2026), yielding 92 coded items, each traceable to its archived URL. Preliminary results show politics/elections at 32% of items (43% in the restricted Movement era), development-flagged content at 26% (varying 0–56% by edition type), stance toward state actors at 34% favourable / 41% neutral / 24% accountability-critical, women as confirmed sources/subjects in about 7% of items, and a directly observed 24-year digitalisation arc (bulletin boards 2002 → mass forums 2005 → blogs/social 2007–2010 → apps/podcasts 2016 → paywall/multilingual 2026). The pilot establishes feasibility of the public-source protocol, shows print–online agenda divergence against prior monitoring, and identifies stratification corrections for the full study. Keywords: agenda-setting, framing, development media, political economy, digital transition, Uganda, New Vision, content analysis.</w:t>
       </w:r>
     </w:p>
     <w:p>
@@ -6515,7 +6515,7 @@
         <w:pStyle w:val="Heading3"/>
       </w:pPr>
       <w:r>
-        <w:t>4.3.4 Researcher's content results — first 6 editions coded (REAL, n=48 items)</w:t>
+        <w:t>4.3.4 Researcher's content results — first 10 editions coded (REAL, n=92 items)</w:t>
       </w:r>
     </w:p>
     <w:p>
@@ -6523,9 +6523,1884 @@
         <w:rPr>
           <w:i/>
         </w:rPr>
-        <w:t>Full item lists and URLs: `Gathered-Editions-Log.md`; structured dataset: `Dataset-NewVision-Editions-PILOT.csv` (one row per item, fieldwork-continuable). Coding by Edition Coding Sheet (Instrument 1); single-coded — double-coding scheduled at n=20.</w:t>
-      </w:r>
-    </w:p>
+        <w:t>Full item lists and URLs: `Gathered-Editions-Log.md`; structured dataset: `Dataset-NewVision-Editions-PILOT.csv` (one row per item, fieldwork-continuable). Editions span 2002–2026; 1986–1999 requires the library rung (Wayback's earliest capture is March 2000). Coding by Edition Coding Sheet (Instrument 1); single-coded — double-coding scheduled at n=20.</w:t>
+      </w:r>
+    </w:p>
+    <w:p>
+      <w:r>
+        <w:rPr>
+          <w:b/>
+        </w:rPr>
+        <w:t>Table 4.3a (REAL): Edition register</w:t>
+      </w:r>
+    </w:p>
+    <w:tbl>
+      <w:tblPr>
+        <w:tblStyle w:val="TableGrid"/>
+        <w:tblW w:type="auto" w:w="0"/>
+        <w:tblLook w:firstColumn="1" w:firstRow="1" w:lastColumn="0" w:lastRow="0" w:noHBand="0" w:noVBand="1" w:val="04A0"/>
+      </w:tblPr>
+      <w:tblGrid>
+        <w:gridCol w:w="1728"/>
+        <w:gridCol w:w="1728"/>
+        <w:gridCol w:w="1728"/>
+        <w:gridCol w:w="1728"/>
+        <w:gridCol w:w="1728"/>
+      </w:tblGrid>
+      <w:tr>
+        <w:tc>
+          <w:tcPr>
+            <w:tcW w:type="dxa" w:w="1728"/>
+          </w:tcPr>
+          <w:p>
+            <w:r>
+              <w:rPr>
+                <w:b/>
+                <w:sz w:val="20"/>
+              </w:rPr>
+              <w:t>Edition (date)</w:t>
+            </w:r>
+          </w:p>
+        </w:tc>
+        <w:tc>
+          <w:tcPr>
+            <w:tcW w:type="dxa" w:w="1728"/>
+          </w:tcPr>
+          <w:p>
+            <w:r>
+              <w:rPr>
+                <w:b/>
+                <w:sz w:val="20"/>
+              </w:rPr>
+              <w:t>Era/context</w:t>
+            </w:r>
+          </w:p>
+        </w:tc>
+        <w:tc>
+          <w:tcPr>
+            <w:tcW w:type="dxa" w:w="1728"/>
+          </w:tcPr>
+          <w:p>
+            <w:r>
+              <w:rPr>
+                <w:b/>
+                <w:sz w:val="20"/>
+              </w:rPr>
+              <w:t>Items</w:t>
+            </w:r>
+          </w:p>
+        </w:tc>
+        <w:tc>
+          <w:tcPr>
+            <w:tcW w:type="dxa" w:w="1728"/>
+          </w:tcPr>
+          <w:p>
+            <w:r>
+              <w:rPr>
+                <w:b/>
+                <w:sz w:val="20"/>
+              </w:rPr>
+              <w:t>Politics+Elections</w:t>
+            </w:r>
+          </w:p>
+        </w:tc>
+        <w:tc>
+          <w:tcPr>
+            <w:tcW w:type="dxa" w:w="1728"/>
+          </w:tcPr>
+          <w:p>
+            <w:r>
+              <w:rPr>
+                <w:b/>
+                <w:sz w:val="20"/>
+              </w:rPr>
+              <w:t>Development-flagged</w:t>
+            </w:r>
+          </w:p>
+        </w:tc>
+      </w:tr>
+      <w:tr>
+        <w:tc>
+          <w:tcPr>
+            <w:tcW w:type="dxa" w:w="1728"/>
+          </w:tcPr>
+          <w:p>
+            <w:r>
+              <w:rPr>
+                <w:sz w:val="20"/>
+              </w:rPr>
+              <w:t>2002-01-17</w:t>
+            </w:r>
+          </w:p>
+        </w:tc>
+        <w:tc>
+          <w:tcPr>
+            <w:tcW w:type="dxa" w:w="1728"/>
+          </w:tcPr>
+          <w:p>
+            <w:r>
+              <w:rPr>
+                <w:sz w:val="20"/>
+              </w:rPr>
+              <w:t>Movement era (party activity restricted)</w:t>
+            </w:r>
+          </w:p>
+        </w:tc>
+        <w:tc>
+          <w:tcPr>
+            <w:tcW w:type="dxa" w:w="1728"/>
+          </w:tcPr>
+          <w:p>
+            <w:r>
+              <w:rPr>
+                <w:sz w:val="20"/>
+              </w:rPr>
+              <w:t>5</w:t>
+            </w:r>
+          </w:p>
+        </w:tc>
+        <w:tc>
+          <w:tcPr>
+            <w:tcW w:type="dxa" w:w="1728"/>
+          </w:tcPr>
+          <w:p>
+            <w:r>
+              <w:rPr>
+                <w:sz w:val="20"/>
+              </w:rPr>
+              <w:t>2</w:t>
+            </w:r>
+          </w:p>
+        </w:tc>
+        <w:tc>
+          <w:tcPr>
+            <w:tcW w:type="dxa" w:w="1728"/>
+          </w:tcPr>
+          <w:p>
+            <w:r>
+              <w:rPr>
+                <w:sz w:val="20"/>
+              </w:rPr>
+              <w:t>2</w:t>
+            </w:r>
+          </w:p>
+        </w:tc>
+      </w:tr>
+      <w:tr>
+        <w:tc>
+          <w:tcPr>
+            <w:tcW w:type="dxa" w:w="1728"/>
+          </w:tcPr>
+          <w:p>
+            <w:r>
+              <w:rPr>
+                <w:sz w:val="20"/>
+              </w:rPr>
+              <w:t>2005-01-01</w:t>
+            </w:r>
+          </w:p>
+        </w:tc>
+        <w:tc>
+          <w:tcPr>
+            <w:tcW w:type="dxa" w:w="1728"/>
+          </w:tcPr>
+          <w:p>
+            <w:r>
+              <w:rPr>
+                <w:sz w:val="20"/>
+              </w:rPr>
+              <w:t>3rd-term debate; LRA talks</w:t>
+            </w:r>
+          </w:p>
+        </w:tc>
+        <w:tc>
+          <w:tcPr>
+            <w:tcW w:type="dxa" w:w="1728"/>
+          </w:tcPr>
+          <w:p>
+            <w:r>
+              <w:rPr>
+                <w:sz w:val="20"/>
+              </w:rPr>
+              <w:t>9</w:t>
+            </w:r>
+          </w:p>
+        </w:tc>
+        <w:tc>
+          <w:tcPr>
+            <w:tcW w:type="dxa" w:w="1728"/>
+          </w:tcPr>
+          <w:p>
+            <w:r>
+              <w:rPr>
+                <w:sz w:val="20"/>
+              </w:rPr>
+              <w:t>4</w:t>
+            </w:r>
+          </w:p>
+        </w:tc>
+        <w:tc>
+          <w:tcPr>
+            <w:tcW w:type="dxa" w:w="1728"/>
+          </w:tcPr>
+          <w:p>
+            <w:r>
+              <w:rPr>
+                <w:sz w:val="20"/>
+              </w:rPr>
+              <w:t>3</w:t>
+            </w:r>
+          </w:p>
+        </w:tc>
+      </w:tr>
+      <w:tr>
+        <w:tc>
+          <w:tcPr>
+            <w:tcW w:type="dxa" w:w="1728"/>
+          </w:tcPr>
+          <w:p>
+            <w:r>
+              <w:rPr>
+                <w:sz w:val="20"/>
+              </w:rPr>
+              <w:t>2007-12-31</w:t>
+            </w:r>
+          </w:p>
+        </w:tc>
+        <w:tc>
+          <w:tcPr>
+            <w:tcW w:type="dxa" w:w="1728"/>
+          </w:tcPr>
+          <w:p>
+            <w:r>
+              <w:rPr>
+                <w:sz w:val="20"/>
+              </w:rPr>
+              <w:t>Post-2006 polls; Kenya crisis</w:t>
+            </w:r>
+          </w:p>
+        </w:tc>
+        <w:tc>
+          <w:tcPr>
+            <w:tcW w:type="dxa" w:w="1728"/>
+          </w:tcPr>
+          <w:p>
+            <w:r>
+              <w:rPr>
+                <w:sz w:val="20"/>
+              </w:rPr>
+              <w:t>11</w:t>
+            </w:r>
+          </w:p>
+        </w:tc>
+        <w:tc>
+          <w:tcPr>
+            <w:tcW w:type="dxa" w:w="1728"/>
+          </w:tcPr>
+          <w:p>
+            <w:r>
+              <w:rPr>
+                <w:sz w:val="20"/>
+              </w:rPr>
+              <w:t>3</w:t>
+            </w:r>
+          </w:p>
+        </w:tc>
+        <w:tc>
+          <w:tcPr>
+            <w:tcW w:type="dxa" w:w="1728"/>
+          </w:tcPr>
+          <w:p>
+            <w:r>
+              <w:rPr>
+                <w:sz w:val="20"/>
+              </w:rPr>
+              <w:t>2</w:t>
+            </w:r>
+          </w:p>
+        </w:tc>
+      </w:tr>
+      <w:tr>
+        <w:tc>
+          <w:tcPr>
+            <w:tcW w:type="dxa" w:w="1728"/>
+          </w:tcPr>
+          <w:p>
+            <w:r>
+              <w:rPr>
+                <w:sz w:val="20"/>
+              </w:rPr>
+              <w:t>2008-12-30</w:t>
+            </w:r>
+          </w:p>
+        </w:tc>
+        <w:tc>
+          <w:tcPr>
+            <w:tcW w:type="dxa" w:w="1728"/>
+          </w:tcPr>
+          <w:p>
+            <w:r>
+              <w:rPr>
+                <w:sz w:val="20"/>
+              </w:rPr>
+              <w:t>By-elections; LRA offensive</w:t>
+            </w:r>
+          </w:p>
+        </w:tc>
+        <w:tc>
+          <w:tcPr>
+            <w:tcW w:type="dxa" w:w="1728"/>
+          </w:tcPr>
+          <w:p>
+            <w:r>
+              <w:rPr>
+                <w:sz w:val="20"/>
+              </w:rPr>
+              <w:t>12</w:t>
+            </w:r>
+          </w:p>
+        </w:tc>
+        <w:tc>
+          <w:tcPr>
+            <w:tcW w:type="dxa" w:w="1728"/>
+          </w:tcPr>
+          <w:p>
+            <w:r>
+              <w:rPr>
+                <w:sz w:val="20"/>
+              </w:rPr>
+              <w:t>3</w:t>
+            </w:r>
+          </w:p>
+        </w:tc>
+        <w:tc>
+          <w:tcPr>
+            <w:tcW w:type="dxa" w:w="1728"/>
+          </w:tcPr>
+          <w:p>
+            <w:r>
+              <w:rPr>
+                <w:sz w:val="20"/>
+              </w:rPr>
+              <w:t>2</w:t>
+            </w:r>
+          </w:p>
+        </w:tc>
+      </w:tr>
+      <w:tr>
+        <w:tc>
+          <w:tcPr>
+            <w:tcW w:type="dxa" w:w="1728"/>
+          </w:tcPr>
+          <w:p>
+            <w:r>
+              <w:rPr>
+                <w:sz w:val="20"/>
+              </w:rPr>
+              <w:t>2010-01-05</w:t>
+            </w:r>
+          </w:p>
+        </w:tc>
+        <w:tc>
+          <w:tcPr>
+            <w:tcW w:type="dxa" w:w="1728"/>
+          </w:tcPr>
+          <w:p>
+            <w:r>
+              <w:rPr>
+                <w:sz w:val="20"/>
+              </w:rPr>
+              <w:t>Land/corruption scandals</w:t>
+            </w:r>
+          </w:p>
+        </w:tc>
+        <w:tc>
+          <w:tcPr>
+            <w:tcW w:type="dxa" w:w="1728"/>
+          </w:tcPr>
+          <w:p>
+            <w:r>
+              <w:rPr>
+                <w:sz w:val="20"/>
+              </w:rPr>
+              <w:t>11</w:t>
+            </w:r>
+          </w:p>
+        </w:tc>
+        <w:tc>
+          <w:tcPr>
+            <w:tcW w:type="dxa" w:w="1728"/>
+          </w:tcPr>
+          <w:p>
+            <w:r>
+              <w:rPr>
+                <w:sz w:val="20"/>
+              </w:rPr>
+              <w:t>5</w:t>
+            </w:r>
+          </w:p>
+        </w:tc>
+        <w:tc>
+          <w:tcPr>
+            <w:tcW w:type="dxa" w:w="1728"/>
+          </w:tcPr>
+          <w:p>
+            <w:r>
+              <w:rPr>
+                <w:sz w:val="20"/>
+              </w:rPr>
+              <w:t>1</w:t>
+            </w:r>
+          </w:p>
+        </w:tc>
+      </w:tr>
+      <w:tr>
+        <w:tc>
+          <w:tcPr>
+            <w:tcW w:type="dxa" w:w="1728"/>
+          </w:tcPr>
+          <w:p>
+            <w:r>
+              <w:rPr>
+                <w:sz w:val="20"/>
+              </w:rPr>
+              <w:t>2010-06-16</w:t>
+            </w:r>
+          </w:p>
+        </w:tc>
+        <w:tc>
+          <w:tcPr>
+            <w:tcW w:type="dxa" w:w="1728"/>
+          </w:tcPr>
+          <w:p>
+            <w:r>
+              <w:rPr>
+                <w:sz w:val="20"/>
+              </w:rPr>
+              <w:t>Pre-2011 polls year</w:t>
+            </w:r>
+          </w:p>
+        </w:tc>
+        <w:tc>
+          <w:tcPr>
+            <w:tcW w:type="dxa" w:w="1728"/>
+          </w:tcPr>
+          <w:p>
+            <w:r>
+              <w:rPr>
+                <w:sz w:val="20"/>
+              </w:rPr>
+              <w:t>8</w:t>
+            </w:r>
+          </w:p>
+        </w:tc>
+        <w:tc>
+          <w:tcPr>
+            <w:tcW w:type="dxa" w:w="1728"/>
+          </w:tcPr>
+          <w:p>
+            <w:r>
+              <w:rPr>
+                <w:sz w:val="20"/>
+              </w:rPr>
+              <w:t>2</w:t>
+            </w:r>
+          </w:p>
+        </w:tc>
+        <w:tc>
+          <w:tcPr>
+            <w:tcW w:type="dxa" w:w="1728"/>
+          </w:tcPr>
+          <w:p>
+            <w:r>
+              <w:rPr>
+                <w:sz w:val="20"/>
+              </w:rPr>
+              <w:t>4</w:t>
+            </w:r>
+          </w:p>
+        </w:tc>
+      </w:tr>
+      <w:tr>
+        <w:tc>
+          <w:tcPr>
+            <w:tcW w:type="dxa" w:w="1728"/>
+          </w:tcPr>
+          <w:p>
+            <w:r>
+              <w:rPr>
+                <w:sz w:val="20"/>
+              </w:rPr>
+              <w:t>2011-07-15</w:t>
+            </w:r>
+          </w:p>
+        </w:tc>
+        <w:tc>
+          <w:tcPr>
+            <w:tcW w:type="dxa" w:w="1728"/>
+          </w:tcPr>
+          <w:p>
+            <w:r>
+              <w:rPr>
+                <w:sz w:val="20"/>
+              </w:rPr>
+              <w:t>Post-polls; food crisis</w:t>
+            </w:r>
+          </w:p>
+        </w:tc>
+        <w:tc>
+          <w:tcPr>
+            <w:tcW w:type="dxa" w:w="1728"/>
+          </w:tcPr>
+          <w:p>
+            <w:r>
+              <w:rPr>
+                <w:sz w:val="20"/>
+              </w:rPr>
+              <w:t>7</w:t>
+            </w:r>
+          </w:p>
+        </w:tc>
+        <w:tc>
+          <w:tcPr>
+            <w:tcW w:type="dxa" w:w="1728"/>
+          </w:tcPr>
+          <w:p>
+            <w:r>
+              <w:rPr>
+                <w:sz w:val="20"/>
+              </w:rPr>
+              <w:t>2</w:t>
+            </w:r>
+          </w:p>
+        </w:tc>
+        <w:tc>
+          <w:tcPr>
+            <w:tcW w:type="dxa" w:w="1728"/>
+          </w:tcPr>
+          <w:p>
+            <w:r>
+              <w:rPr>
+                <w:sz w:val="20"/>
+              </w:rPr>
+              <w:t>2</w:t>
+            </w:r>
+          </w:p>
+        </w:tc>
+      </w:tr>
+      <w:tr>
+        <w:tc>
+          <w:tcPr>
+            <w:tcW w:type="dxa" w:w="1728"/>
+          </w:tcPr>
+          <w:p>
+            <w:r>
+              <w:rPr>
+                <w:sz w:val="20"/>
+              </w:rPr>
+              <w:t>2016-01-20</w:t>
+            </w:r>
+          </w:p>
+        </w:tc>
+        <w:tc>
+          <w:tcPr>
+            <w:tcW w:type="dxa" w:w="1728"/>
+          </w:tcPr>
+          <w:p>
+            <w:r>
+              <w:rPr>
+                <w:sz w:val="20"/>
+              </w:rPr>
+              <w:t>29 days to Feb 2016 polls</w:t>
+            </w:r>
+          </w:p>
+        </w:tc>
+        <w:tc>
+          <w:tcPr>
+            <w:tcW w:type="dxa" w:w="1728"/>
+          </w:tcPr>
+          <w:p>
+            <w:r>
+              <w:rPr>
+                <w:sz w:val="20"/>
+              </w:rPr>
+              <w:t>9</w:t>
+            </w:r>
+          </w:p>
+        </w:tc>
+        <w:tc>
+          <w:tcPr>
+            <w:tcW w:type="dxa" w:w="1728"/>
+          </w:tcPr>
+          <w:p>
+            <w:r>
+              <w:rPr>
+                <w:sz w:val="20"/>
+              </w:rPr>
+              <w:t>3</w:t>
+            </w:r>
+          </w:p>
+        </w:tc>
+        <w:tc>
+          <w:tcPr>
+            <w:tcW w:type="dxa" w:w="1728"/>
+          </w:tcPr>
+          <w:p>
+            <w:r>
+              <w:rPr>
+                <w:sz w:val="20"/>
+              </w:rPr>
+              <w:t>5</w:t>
+            </w:r>
+          </w:p>
+        </w:tc>
+      </w:tr>
+      <w:tr>
+        <w:tc>
+          <w:tcPr>
+            <w:tcW w:type="dxa" w:w="1728"/>
+          </w:tcPr>
+          <w:p>
+            <w:r>
+              <w:rPr>
+                <w:sz w:val="20"/>
+              </w:rPr>
+              <w:t>2019-12-31</w:t>
+            </w:r>
+          </w:p>
+        </w:tc>
+        <w:tc>
+          <w:tcPr>
+            <w:tcW w:type="dxa" w:w="1728"/>
+          </w:tcPr>
+          <w:p>
+            <w:r>
+              <w:rPr>
+                <w:sz w:val="20"/>
+              </w:rPr>
+              <w:t>Year-end review edition</w:t>
+            </w:r>
+          </w:p>
+        </w:tc>
+        <w:tc>
+          <w:tcPr>
+            <w:tcW w:type="dxa" w:w="1728"/>
+          </w:tcPr>
+          <w:p>
+            <w:r>
+              <w:rPr>
+                <w:sz w:val="20"/>
+              </w:rPr>
+              <w:t>8</w:t>
+            </w:r>
+          </w:p>
+        </w:tc>
+        <w:tc>
+          <w:tcPr>
+            <w:tcW w:type="dxa" w:w="1728"/>
+          </w:tcPr>
+          <w:p>
+            <w:r>
+              <w:rPr>
+                <w:sz w:val="20"/>
+              </w:rPr>
+              <w:t>2</w:t>
+            </w:r>
+          </w:p>
+        </w:tc>
+        <w:tc>
+          <w:tcPr>
+            <w:tcW w:type="dxa" w:w="1728"/>
+          </w:tcPr>
+          <w:p>
+            <w:r>
+              <w:rPr>
+                <w:sz w:val="20"/>
+              </w:rPr>
+              <w:t>0</w:t>
+            </w:r>
+          </w:p>
+        </w:tc>
+      </w:tr>
+      <w:tr>
+        <w:tc>
+          <w:tcPr>
+            <w:tcW w:type="dxa" w:w="1728"/>
+          </w:tcPr>
+          <w:p>
+            <w:r>
+              <w:rPr>
+                <w:sz w:val="20"/>
+              </w:rPr>
+              <w:t>2026-09-20</w:t>
+            </w:r>
+          </w:p>
+        </w:tc>
+        <w:tc>
+          <w:tcPr>
+            <w:tcW w:type="dxa" w:w="1728"/>
+          </w:tcPr>
+          <w:p>
+            <w:r>
+              <w:rPr>
+                <w:sz w:val="20"/>
+              </w:rPr>
+              <w:t>Pre-2026 polls; live site</w:t>
+            </w:r>
+          </w:p>
+        </w:tc>
+        <w:tc>
+          <w:tcPr>
+            <w:tcW w:type="dxa" w:w="1728"/>
+          </w:tcPr>
+          <w:p>
+            <w:r>
+              <w:rPr>
+                <w:sz w:val="20"/>
+              </w:rPr>
+              <w:t>12</w:t>
+            </w:r>
+          </w:p>
+        </w:tc>
+        <w:tc>
+          <w:tcPr>
+            <w:tcW w:type="dxa" w:w="1728"/>
+          </w:tcPr>
+          <w:p>
+            <w:r>
+              <w:rPr>
+                <w:sz w:val="20"/>
+              </w:rPr>
+              <w:t>3</w:t>
+            </w:r>
+          </w:p>
+        </w:tc>
+        <w:tc>
+          <w:tcPr>
+            <w:tcW w:type="dxa" w:w="1728"/>
+          </w:tcPr>
+          <w:p>
+            <w:r>
+              <w:rPr>
+                <w:sz w:val="20"/>
+              </w:rPr>
+              <w:t>3</w:t>
+            </w:r>
+          </w:p>
+        </w:tc>
+      </w:tr>
+      <w:tr>
+        <w:tc>
+          <w:tcPr>
+            <w:tcW w:type="dxa" w:w="1728"/>
+          </w:tcPr>
+          <w:p>
+            <w:r>
+              <w:rPr>
+                <w:b/>
+                <w:sz w:val="20"/>
+              </w:rPr>
+              <w:t>Total</w:t>
+            </w:r>
+          </w:p>
+        </w:tc>
+        <w:tc>
+          <w:tcPr>
+            <w:tcW w:type="dxa" w:w="1728"/>
+          </w:tcPr>
+          <w:p>
+            <w:r>
+              <w:rPr>
+                <w:b/>
+                <w:sz w:val="20"/>
+              </w:rPr>
+              <w:t>10 editions</w:t>
+            </w:r>
+          </w:p>
+        </w:tc>
+        <w:tc>
+          <w:tcPr>
+            <w:tcW w:type="dxa" w:w="1728"/>
+          </w:tcPr>
+          <w:p>
+            <w:r>
+              <w:rPr>
+                <w:b/>
+                <w:sz w:val="20"/>
+              </w:rPr>
+              <w:t>92</w:t>
+            </w:r>
+          </w:p>
+        </w:tc>
+        <w:tc>
+          <w:tcPr>
+            <w:tcW w:type="dxa" w:w="1728"/>
+          </w:tcPr>
+          <w:p>
+            <w:r>
+              <w:rPr>
+                <w:b/>
+                <w:sz w:val="20"/>
+              </w:rPr>
+              <w:t>29 (32%)</w:t>
+            </w:r>
+          </w:p>
+        </w:tc>
+        <w:tc>
+          <w:tcPr>
+            <w:tcW w:type="dxa" w:w="1728"/>
+          </w:tcPr>
+          <w:p>
+            <w:r>
+              <w:rPr>
+                <w:b/>
+                <w:sz w:val="20"/>
+              </w:rPr>
+              <w:t>24 (26%)</w:t>
+            </w:r>
+          </w:p>
+        </w:tc>
+      </w:tr>
+    </w:tbl>
+    <w:p/>
+    <w:p>
+      <w:r>
+        <w:rPr>
+          <w:b/>
+        </w:rPr>
+        <w:t>Table 4.3b (REAL): Issue distribution by decade</w:t>
+      </w:r>
+    </w:p>
+    <w:tbl>
+      <w:tblPr>
+        <w:tblStyle w:val="TableGrid"/>
+        <w:tblW w:type="auto" w:w="0"/>
+        <w:tblLook w:firstColumn="1" w:firstRow="1" w:lastColumn="0" w:lastRow="0" w:noHBand="0" w:noVBand="1" w:val="04A0"/>
+      </w:tblPr>
+      <w:tblGrid>
+        <w:gridCol w:w="1728"/>
+        <w:gridCol w:w="1728"/>
+        <w:gridCol w:w="1728"/>
+        <w:gridCol w:w="1728"/>
+        <w:gridCol w:w="1728"/>
+      </w:tblGrid>
+      <w:tr>
+        <w:tc>
+          <w:tcPr>
+            <w:tcW w:type="dxa" w:w="1728"/>
+          </w:tcPr>
+          <w:p>
+            <w:r>
+              <w:rPr>
+                <w:b/>
+                <w:sz w:val="20"/>
+              </w:rPr>
+              <w:t>Issue</w:t>
+            </w:r>
+          </w:p>
+        </w:tc>
+        <w:tc>
+          <w:tcPr>
+            <w:tcW w:type="dxa" w:w="1728"/>
+          </w:tcPr>
+          <w:p>
+            <w:r>
+              <w:rPr>
+                <w:b/>
+                <w:sz w:val="20"/>
+              </w:rPr>
+              <w:t>1996–2005 (n=14)</w:t>
+            </w:r>
+          </w:p>
+        </w:tc>
+        <w:tc>
+          <w:tcPr>
+            <w:tcW w:type="dxa" w:w="1728"/>
+          </w:tcPr>
+          <w:p>
+            <w:r>
+              <w:rPr>
+                <w:b/>
+                <w:sz w:val="20"/>
+              </w:rPr>
+              <w:t>2006–2015 (n=49)</w:t>
+            </w:r>
+          </w:p>
+        </w:tc>
+        <w:tc>
+          <w:tcPr>
+            <w:tcW w:type="dxa" w:w="1728"/>
+          </w:tcPr>
+          <w:p>
+            <w:r>
+              <w:rPr>
+                <w:b/>
+                <w:sz w:val="20"/>
+              </w:rPr>
+              <w:t>2016–2026 (n=29)</w:t>
+            </w:r>
+          </w:p>
+        </w:tc>
+        <w:tc>
+          <w:tcPr>
+            <w:tcW w:type="dxa" w:w="1728"/>
+          </w:tcPr>
+          <w:p>
+            <w:r>
+              <w:rPr>
+                <w:b/>
+                <w:sz w:val="20"/>
+              </w:rPr>
+              <w:t>Total (n=92)</w:t>
+            </w:r>
+          </w:p>
+        </w:tc>
+      </w:tr>
+      <w:tr>
+        <w:tc>
+          <w:tcPr>
+            <w:tcW w:type="dxa" w:w="1728"/>
+          </w:tcPr>
+          <w:p>
+            <w:r>
+              <w:rPr>
+                <w:sz w:val="20"/>
+              </w:rPr>
+              <w:t>Politics (POL)</w:t>
+            </w:r>
+          </w:p>
+        </w:tc>
+        <w:tc>
+          <w:tcPr>
+            <w:tcW w:type="dxa" w:w="1728"/>
+          </w:tcPr>
+          <w:p>
+            <w:r>
+              <w:rPr>
+                <w:sz w:val="20"/>
+              </w:rPr>
+              <w:t>6 (43%)</w:t>
+            </w:r>
+          </w:p>
+        </w:tc>
+        <w:tc>
+          <w:tcPr>
+            <w:tcW w:type="dxa" w:w="1728"/>
+          </w:tcPr>
+          <w:p>
+            <w:r>
+              <w:rPr>
+                <w:sz w:val="20"/>
+              </w:rPr>
+              <w:t>15 (31%)</w:t>
+            </w:r>
+          </w:p>
+        </w:tc>
+        <w:tc>
+          <w:tcPr>
+            <w:tcW w:type="dxa" w:w="1728"/>
+          </w:tcPr>
+          <w:p>
+            <w:r>
+              <w:rPr>
+                <w:sz w:val="20"/>
+              </w:rPr>
+              <w:t>5 (17%)</w:t>
+            </w:r>
+          </w:p>
+        </w:tc>
+        <w:tc>
+          <w:tcPr>
+            <w:tcW w:type="dxa" w:w="1728"/>
+          </w:tcPr>
+          <w:p>
+            <w:r>
+              <w:rPr>
+                <w:sz w:val="20"/>
+              </w:rPr>
+              <w:t>26 (28%)</w:t>
+            </w:r>
+          </w:p>
+        </w:tc>
+      </w:tr>
+      <w:tr>
+        <w:tc>
+          <w:tcPr>
+            <w:tcW w:type="dxa" w:w="1728"/>
+          </w:tcPr>
+          <w:p>
+            <w:r>
+              <w:rPr>
+                <w:sz w:val="20"/>
+              </w:rPr>
+              <w:t>Elections (ELE)</w:t>
+            </w:r>
+          </w:p>
+        </w:tc>
+        <w:tc>
+          <w:tcPr>
+            <w:tcW w:type="dxa" w:w="1728"/>
+          </w:tcPr>
+          <w:p>
+            <w:r>
+              <w:rPr>
+                <w:sz w:val="20"/>
+              </w:rPr>
+              <w:t>0</w:t>
+            </w:r>
+          </w:p>
+        </w:tc>
+        <w:tc>
+          <w:tcPr>
+            <w:tcW w:type="dxa" w:w="1728"/>
+          </w:tcPr>
+          <w:p>
+            <w:r>
+              <w:rPr>
+                <w:sz w:val="20"/>
+              </w:rPr>
+              <w:t>0</w:t>
+            </w:r>
+          </w:p>
+        </w:tc>
+        <w:tc>
+          <w:tcPr>
+            <w:tcW w:type="dxa" w:w="1728"/>
+          </w:tcPr>
+          <w:p>
+            <w:r>
+              <w:rPr>
+                <w:sz w:val="20"/>
+              </w:rPr>
+              <w:t>3 (10%)</w:t>
+            </w:r>
+          </w:p>
+        </w:tc>
+        <w:tc>
+          <w:tcPr>
+            <w:tcW w:type="dxa" w:w="1728"/>
+          </w:tcPr>
+          <w:p>
+            <w:r>
+              <w:rPr>
+                <w:sz w:val="20"/>
+              </w:rPr>
+              <w:t>3 (3%)</w:t>
+            </w:r>
+          </w:p>
+        </w:tc>
+      </w:tr>
+      <w:tr>
+        <w:tc>
+          <w:tcPr>
+            <w:tcW w:type="dxa" w:w="1728"/>
+          </w:tcPr>
+          <w:p>
+            <w:r>
+              <w:rPr>
+                <w:sz w:val="20"/>
+              </w:rPr>
+              <w:t>Economy/Business (ECO)</w:t>
+            </w:r>
+          </w:p>
+        </w:tc>
+        <w:tc>
+          <w:tcPr>
+            <w:tcW w:type="dxa" w:w="1728"/>
+          </w:tcPr>
+          <w:p>
+            <w:r>
+              <w:rPr>
+                <w:sz w:val="20"/>
+              </w:rPr>
+              <w:t>2 (14%)</w:t>
+            </w:r>
+          </w:p>
+        </w:tc>
+        <w:tc>
+          <w:tcPr>
+            <w:tcW w:type="dxa" w:w="1728"/>
+          </w:tcPr>
+          <w:p>
+            <w:r>
+              <w:rPr>
+                <w:sz w:val="20"/>
+              </w:rPr>
+              <w:t>11 (22%)</w:t>
+            </w:r>
+          </w:p>
+        </w:tc>
+        <w:tc>
+          <w:tcPr>
+            <w:tcW w:type="dxa" w:w="1728"/>
+          </w:tcPr>
+          <w:p>
+            <w:r>
+              <w:rPr>
+                <w:sz w:val="20"/>
+              </w:rPr>
+              <w:t>1 (3%)</w:t>
+            </w:r>
+          </w:p>
+        </w:tc>
+        <w:tc>
+          <w:tcPr>
+            <w:tcW w:type="dxa" w:w="1728"/>
+          </w:tcPr>
+          <w:p>
+            <w:r>
+              <w:rPr>
+                <w:sz w:val="20"/>
+              </w:rPr>
+              <w:t>14 (15%)</w:t>
+            </w:r>
+          </w:p>
+        </w:tc>
+      </w:tr>
+      <w:tr>
+        <w:tc>
+          <w:tcPr>
+            <w:tcW w:type="dxa" w:w="1728"/>
+          </w:tcPr>
+          <w:p>
+            <w:r>
+              <w:rPr>
+                <w:sz w:val="20"/>
+              </w:rPr>
+              <w:t>Health (HEA)</w:t>
+            </w:r>
+          </w:p>
+        </w:tc>
+        <w:tc>
+          <w:tcPr>
+            <w:tcW w:type="dxa" w:w="1728"/>
+          </w:tcPr>
+          <w:p>
+            <w:r>
+              <w:rPr>
+                <w:sz w:val="20"/>
+              </w:rPr>
+              <w:t>1 (7%)</w:t>
+            </w:r>
+          </w:p>
+        </w:tc>
+        <w:tc>
+          <w:tcPr>
+            <w:tcW w:type="dxa" w:w="1728"/>
+          </w:tcPr>
+          <w:p>
+            <w:r>
+              <w:rPr>
+                <w:sz w:val="20"/>
+              </w:rPr>
+              <w:t>2 (4%)</w:t>
+            </w:r>
+          </w:p>
+        </w:tc>
+        <w:tc>
+          <w:tcPr>
+            <w:tcW w:type="dxa" w:w="1728"/>
+          </w:tcPr>
+          <w:p>
+            <w:r>
+              <w:rPr>
+                <w:sz w:val="20"/>
+              </w:rPr>
+              <w:t>1 (3%)</w:t>
+            </w:r>
+          </w:p>
+        </w:tc>
+        <w:tc>
+          <w:tcPr>
+            <w:tcW w:type="dxa" w:w="1728"/>
+          </w:tcPr>
+          <w:p>
+            <w:r>
+              <w:rPr>
+                <w:sz w:val="20"/>
+              </w:rPr>
+              <w:t>4 (4%)</w:t>
+            </w:r>
+          </w:p>
+        </w:tc>
+      </w:tr>
+      <w:tr>
+        <w:tc>
+          <w:tcPr>
+            <w:tcW w:type="dxa" w:w="1728"/>
+          </w:tcPr>
+          <w:p>
+            <w:r>
+              <w:rPr>
+                <w:sz w:val="20"/>
+              </w:rPr>
+              <w:t>Education (EDU)</w:t>
+            </w:r>
+          </w:p>
+        </w:tc>
+        <w:tc>
+          <w:tcPr>
+            <w:tcW w:type="dxa" w:w="1728"/>
+          </w:tcPr>
+          <w:p>
+            <w:r>
+              <w:rPr>
+                <w:sz w:val="20"/>
+              </w:rPr>
+              <w:t>0</w:t>
+            </w:r>
+          </w:p>
+        </w:tc>
+        <w:tc>
+          <w:tcPr>
+            <w:tcW w:type="dxa" w:w="1728"/>
+          </w:tcPr>
+          <w:p>
+            <w:r>
+              <w:rPr>
+                <w:sz w:val="20"/>
+              </w:rPr>
+              <w:t>0</w:t>
+            </w:r>
+          </w:p>
+        </w:tc>
+        <w:tc>
+          <w:tcPr>
+            <w:tcW w:type="dxa" w:w="1728"/>
+          </w:tcPr>
+          <w:p>
+            <w:r>
+              <w:rPr>
+                <w:sz w:val="20"/>
+              </w:rPr>
+              <w:t>1 (3%)</w:t>
+            </w:r>
+          </w:p>
+        </w:tc>
+        <w:tc>
+          <w:tcPr>
+            <w:tcW w:type="dxa" w:w="1728"/>
+          </w:tcPr>
+          <w:p>
+            <w:r>
+              <w:rPr>
+                <w:sz w:val="20"/>
+              </w:rPr>
+              <w:t>1 (1%)</w:t>
+            </w:r>
+          </w:p>
+        </w:tc>
+      </w:tr>
+      <w:tr>
+        <w:tc>
+          <w:tcPr>
+            <w:tcW w:type="dxa" w:w="1728"/>
+          </w:tcPr>
+          <w:p>
+            <w:r>
+              <w:rPr>
+                <w:sz w:val="20"/>
+              </w:rPr>
+              <w:t>Security/Crime (SEC)</w:t>
+            </w:r>
+          </w:p>
+        </w:tc>
+        <w:tc>
+          <w:tcPr>
+            <w:tcW w:type="dxa" w:w="1728"/>
+          </w:tcPr>
+          <w:p>
+            <w:r>
+              <w:rPr>
+                <w:sz w:val="20"/>
+              </w:rPr>
+              <w:t>0</w:t>
+            </w:r>
+          </w:p>
+        </w:tc>
+        <w:tc>
+          <w:tcPr>
+            <w:tcW w:type="dxa" w:w="1728"/>
+          </w:tcPr>
+          <w:p>
+            <w:r>
+              <w:rPr>
+                <w:sz w:val="20"/>
+              </w:rPr>
+              <w:t>4 (8%)</w:t>
+            </w:r>
+          </w:p>
+        </w:tc>
+        <w:tc>
+          <w:tcPr>
+            <w:tcW w:type="dxa" w:w="1728"/>
+          </w:tcPr>
+          <w:p>
+            <w:r>
+              <w:rPr>
+                <w:sz w:val="20"/>
+              </w:rPr>
+              <w:t>3 (10%)</w:t>
+            </w:r>
+          </w:p>
+        </w:tc>
+        <w:tc>
+          <w:tcPr>
+            <w:tcW w:type="dxa" w:w="1728"/>
+          </w:tcPr>
+          <w:p>
+            <w:r>
+              <w:rPr>
+                <w:sz w:val="20"/>
+              </w:rPr>
+              <w:t>7 (8%)</w:t>
+            </w:r>
+          </w:p>
+        </w:tc>
+      </w:tr>
+      <w:tr>
+        <w:tc>
+          <w:tcPr>
+            <w:tcW w:type="dxa" w:w="1728"/>
+          </w:tcPr>
+          <w:p>
+            <w:r>
+              <w:rPr>
+                <w:sz w:val="20"/>
+              </w:rPr>
+              <w:t>Sport (SPO)</w:t>
+            </w:r>
+          </w:p>
+        </w:tc>
+        <w:tc>
+          <w:tcPr>
+            <w:tcW w:type="dxa" w:w="1728"/>
+          </w:tcPr>
+          <w:p>
+            <w:r>
+              <w:rPr>
+                <w:sz w:val="20"/>
+              </w:rPr>
+              <w:t>3 (21%)</w:t>
+            </w:r>
+          </w:p>
+        </w:tc>
+        <w:tc>
+          <w:tcPr>
+            <w:tcW w:type="dxa" w:w="1728"/>
+          </w:tcPr>
+          <w:p>
+            <w:r>
+              <w:rPr>
+                <w:sz w:val="20"/>
+              </w:rPr>
+              <w:t>7 (14%)</w:t>
+            </w:r>
+          </w:p>
+        </w:tc>
+        <w:tc>
+          <w:tcPr>
+            <w:tcW w:type="dxa" w:w="1728"/>
+          </w:tcPr>
+          <w:p>
+            <w:r>
+              <w:rPr>
+                <w:sz w:val="20"/>
+              </w:rPr>
+              <w:t>3 (10%)</w:t>
+            </w:r>
+          </w:p>
+        </w:tc>
+        <w:tc>
+          <w:tcPr>
+            <w:tcW w:type="dxa" w:w="1728"/>
+          </w:tcPr>
+          <w:p>
+            <w:r>
+              <w:rPr>
+                <w:sz w:val="20"/>
+              </w:rPr>
+              <w:t>13 (14%)</w:t>
+            </w:r>
+          </w:p>
+        </w:tc>
+      </w:tr>
+      <w:tr>
+        <w:tc>
+          <w:tcPr>
+            <w:tcW w:type="dxa" w:w="1728"/>
+          </w:tcPr>
+          <w:p>
+            <w:r>
+              <w:rPr>
+                <w:sz w:val="20"/>
+              </w:rPr>
+              <w:t>Agriculture (AGR)</w:t>
+            </w:r>
+          </w:p>
+        </w:tc>
+        <w:tc>
+          <w:tcPr>
+            <w:tcW w:type="dxa" w:w="1728"/>
+          </w:tcPr>
+          <w:p>
+            <w:r>
+              <w:rPr>
+                <w:sz w:val="20"/>
+              </w:rPr>
+              <w:t>0</w:t>
+            </w:r>
+          </w:p>
+        </w:tc>
+        <w:tc>
+          <w:tcPr>
+            <w:tcW w:type="dxa" w:w="1728"/>
+          </w:tcPr>
+          <w:p>
+            <w:r>
+              <w:rPr>
+                <w:sz w:val="20"/>
+              </w:rPr>
+              <w:t>1 (2%)</w:t>
+            </w:r>
+          </w:p>
+        </w:tc>
+        <w:tc>
+          <w:tcPr>
+            <w:tcW w:type="dxa" w:w="1728"/>
+          </w:tcPr>
+          <w:p>
+            <w:r>
+              <w:rPr>
+                <w:sz w:val="20"/>
+              </w:rPr>
+              <w:t>1 (3%)</w:t>
+            </w:r>
+          </w:p>
+        </w:tc>
+        <w:tc>
+          <w:tcPr>
+            <w:tcW w:type="dxa" w:w="1728"/>
+          </w:tcPr>
+          <w:p>
+            <w:r>
+              <w:rPr>
+                <w:sz w:val="20"/>
+              </w:rPr>
+              <w:t>2 (2%)</w:t>
+            </w:r>
+          </w:p>
+        </w:tc>
+      </w:tr>
+      <w:tr>
+        <w:tc>
+          <w:tcPr>
+            <w:tcW w:type="dxa" w:w="1728"/>
+          </w:tcPr>
+          <w:p>
+            <w:r>
+              <w:rPr>
+                <w:sz w:val="20"/>
+              </w:rPr>
+              <w:t>Tourism (TOUR)</w:t>
+            </w:r>
+          </w:p>
+        </w:tc>
+        <w:tc>
+          <w:tcPr>
+            <w:tcW w:type="dxa" w:w="1728"/>
+          </w:tcPr>
+          <w:p>
+            <w:r>
+              <w:rPr>
+                <w:sz w:val="20"/>
+              </w:rPr>
+              <w:t>0</w:t>
+            </w:r>
+          </w:p>
+        </w:tc>
+        <w:tc>
+          <w:tcPr>
+            <w:tcW w:type="dxa" w:w="1728"/>
+          </w:tcPr>
+          <w:p>
+            <w:r>
+              <w:rPr>
+                <w:sz w:val="20"/>
+              </w:rPr>
+              <w:t>0</w:t>
+            </w:r>
+          </w:p>
+        </w:tc>
+        <w:tc>
+          <w:tcPr>
+            <w:tcW w:type="dxa" w:w="1728"/>
+          </w:tcPr>
+          <w:p>
+            <w:r>
+              <w:rPr>
+                <w:sz w:val="20"/>
+              </w:rPr>
+              <w:t>1 (3%)</w:t>
+            </w:r>
+          </w:p>
+        </w:tc>
+        <w:tc>
+          <w:tcPr>
+            <w:tcW w:type="dxa" w:w="1728"/>
+          </w:tcPr>
+          <w:p>
+            <w:r>
+              <w:rPr>
+                <w:sz w:val="20"/>
+              </w:rPr>
+              <w:t>1 (1%)</w:t>
+            </w:r>
+          </w:p>
+        </w:tc>
+      </w:tr>
+      <w:tr>
+        <w:tc>
+          <w:tcPr>
+            <w:tcW w:type="dxa" w:w="1728"/>
+          </w:tcPr>
+          <w:p>
+            <w:r>
+              <w:rPr>
+                <w:sz w:val="20"/>
+              </w:rPr>
+              <w:t>Environment (ENV)</w:t>
+            </w:r>
+          </w:p>
+        </w:tc>
+        <w:tc>
+          <w:tcPr>
+            <w:tcW w:type="dxa" w:w="1728"/>
+          </w:tcPr>
+          <w:p>
+            <w:r>
+              <w:rPr>
+                <w:sz w:val="20"/>
+              </w:rPr>
+              <w:t>1 (7%)</w:t>
+            </w:r>
+          </w:p>
+        </w:tc>
+        <w:tc>
+          <w:tcPr>
+            <w:tcW w:type="dxa" w:w="1728"/>
+          </w:tcPr>
+          <w:p>
+            <w:r>
+              <w:rPr>
+                <w:sz w:val="20"/>
+              </w:rPr>
+              <w:t>1 (2%)</w:t>
+            </w:r>
+          </w:p>
+        </w:tc>
+        <w:tc>
+          <w:tcPr>
+            <w:tcW w:type="dxa" w:w="1728"/>
+          </w:tcPr>
+          <w:p>
+            <w:r>
+              <w:rPr>
+                <w:sz w:val="20"/>
+              </w:rPr>
+              <w:t>1 (3%)</w:t>
+            </w:r>
+          </w:p>
+        </w:tc>
+        <w:tc>
+          <w:tcPr>
+            <w:tcW w:type="dxa" w:w="1728"/>
+          </w:tcPr>
+          <w:p>
+            <w:r>
+              <w:rPr>
+                <w:sz w:val="20"/>
+              </w:rPr>
+              <w:t>3 (3%)</w:t>
+            </w:r>
+          </w:p>
+        </w:tc>
+      </w:tr>
+      <w:tr>
+        <w:tc>
+          <w:tcPr>
+            <w:tcW w:type="dxa" w:w="1728"/>
+          </w:tcPr>
+          <w:p>
+            <w:r>
+              <w:rPr>
+                <w:sz w:val="20"/>
+              </w:rPr>
+              <w:t>Entertainment (ENT)</w:t>
+            </w:r>
+          </w:p>
+        </w:tc>
+        <w:tc>
+          <w:tcPr>
+            <w:tcW w:type="dxa" w:w="1728"/>
+          </w:tcPr>
+          <w:p>
+            <w:r>
+              <w:rPr>
+                <w:sz w:val="20"/>
+              </w:rPr>
+              <w:t>0</w:t>
+            </w:r>
+          </w:p>
+        </w:tc>
+        <w:tc>
+          <w:tcPr>
+            <w:tcW w:type="dxa" w:w="1728"/>
+          </w:tcPr>
+          <w:p>
+            <w:r>
+              <w:rPr>
+                <w:sz w:val="20"/>
+              </w:rPr>
+              <w:t>0</w:t>
+            </w:r>
+          </w:p>
+        </w:tc>
+        <w:tc>
+          <w:tcPr>
+            <w:tcW w:type="dxa" w:w="1728"/>
+          </w:tcPr>
+          <w:p>
+            <w:r>
+              <w:rPr>
+                <w:sz w:val="20"/>
+              </w:rPr>
+              <w:t>2 (7%)</w:t>
+            </w:r>
+          </w:p>
+        </w:tc>
+        <w:tc>
+          <w:tcPr>
+            <w:tcW w:type="dxa" w:w="1728"/>
+          </w:tcPr>
+          <w:p>
+            <w:r>
+              <w:rPr>
+                <w:sz w:val="20"/>
+              </w:rPr>
+              <w:t>2 (2%)</w:t>
+            </w:r>
+          </w:p>
+        </w:tc>
+      </w:tr>
+      <w:tr>
+        <w:tc>
+          <w:tcPr>
+            <w:tcW w:type="dxa" w:w="1728"/>
+          </w:tcPr>
+          <w:p>
+            <w:r>
+              <w:rPr>
+                <w:sz w:val="20"/>
+              </w:rPr>
+              <w:t>International (INTL)</w:t>
+            </w:r>
+          </w:p>
+        </w:tc>
+        <w:tc>
+          <w:tcPr>
+            <w:tcW w:type="dxa" w:w="1728"/>
+          </w:tcPr>
+          <w:p>
+            <w:r>
+              <w:rPr>
+                <w:sz w:val="20"/>
+              </w:rPr>
+              <w:t>0</w:t>
+            </w:r>
+          </w:p>
+        </w:tc>
+        <w:tc>
+          <w:tcPr>
+            <w:tcW w:type="dxa" w:w="1728"/>
+          </w:tcPr>
+          <w:p>
+            <w:r>
+              <w:rPr>
+                <w:sz w:val="20"/>
+              </w:rPr>
+              <w:t>5 (10%)</w:t>
+            </w:r>
+          </w:p>
+        </w:tc>
+        <w:tc>
+          <w:tcPr>
+            <w:tcW w:type="dxa" w:w="1728"/>
+          </w:tcPr>
+          <w:p>
+            <w:r>
+              <w:rPr>
+                <w:sz w:val="20"/>
+              </w:rPr>
+              <w:t>3 (10%)</w:t>
+            </w:r>
+          </w:p>
+        </w:tc>
+        <w:tc>
+          <w:tcPr>
+            <w:tcW w:type="dxa" w:w="1728"/>
+          </w:tcPr>
+          <w:p>
+            <w:r>
+              <w:rPr>
+                <w:sz w:val="20"/>
+              </w:rPr>
+              <w:t>8 (9%)</w:t>
+            </w:r>
+          </w:p>
+        </w:tc>
+      </w:tr>
+      <w:tr>
+        <w:tc>
+          <w:tcPr>
+            <w:tcW w:type="dxa" w:w="1728"/>
+          </w:tcPr>
+          <w:p>
+            <w:r>
+              <w:rPr>
+                <w:sz w:val="20"/>
+              </w:rPr>
+              <w:t>General/Editorial (GEN)</w:t>
+            </w:r>
+          </w:p>
+        </w:tc>
+        <w:tc>
+          <w:tcPr>
+            <w:tcW w:type="dxa" w:w="1728"/>
+          </w:tcPr>
+          <w:p>
+            <w:r>
+              <w:rPr>
+                <w:sz w:val="20"/>
+              </w:rPr>
+              <w:t>1 (7%)</w:t>
+            </w:r>
+          </w:p>
+        </w:tc>
+        <w:tc>
+          <w:tcPr>
+            <w:tcW w:type="dxa" w:w="1728"/>
+          </w:tcPr>
+          <w:p>
+            <w:r>
+              <w:rPr>
+                <w:sz w:val="20"/>
+              </w:rPr>
+              <w:t>3 (6%)</w:t>
+            </w:r>
+          </w:p>
+        </w:tc>
+        <w:tc>
+          <w:tcPr>
+            <w:tcW w:type="dxa" w:w="1728"/>
+          </w:tcPr>
+          <w:p>
+            <w:r>
+              <w:rPr>
+                <w:sz w:val="20"/>
+              </w:rPr>
+              <w:t>4 (14%)</w:t>
+            </w:r>
+          </w:p>
+        </w:tc>
+        <w:tc>
+          <w:tcPr>
+            <w:tcW w:type="dxa" w:w="1728"/>
+          </w:tcPr>
+          <w:p>
+            <w:r>
+              <w:rPr>
+                <w:sz w:val="20"/>
+              </w:rPr>
+              <w:t>8 (9%)</w:t>
+            </w:r>
+          </w:p>
+        </w:tc>
+      </w:tr>
+      <w:tr>
+        <w:tc>
+          <w:tcPr>
+            <w:tcW w:type="dxa" w:w="1728"/>
+          </w:tcPr>
+          <w:p>
+            <w:r>
+              <w:rPr>
+                <w:b/>
+                <w:sz w:val="20"/>
+              </w:rPr>
+              <w:t>Development-flagged</w:t>
+            </w:r>
+          </w:p>
+        </w:tc>
+        <w:tc>
+          <w:tcPr>
+            <w:tcW w:type="dxa" w:w="1728"/>
+          </w:tcPr>
+          <w:p>
+            <w:r>
+              <w:rPr>
+                <w:b/>
+                <w:sz w:val="20"/>
+              </w:rPr>
+              <w:t>5 (36%)</w:t>
+            </w:r>
+          </w:p>
+        </w:tc>
+        <w:tc>
+          <w:tcPr>
+            <w:tcW w:type="dxa" w:w="1728"/>
+          </w:tcPr>
+          <w:p>
+            <w:r>
+              <w:rPr>
+                <w:b/>
+                <w:sz w:val="20"/>
+              </w:rPr>
+              <w:t>11 (22%)</w:t>
+            </w:r>
+          </w:p>
+        </w:tc>
+        <w:tc>
+          <w:tcPr>
+            <w:tcW w:type="dxa" w:w="1728"/>
+          </w:tcPr>
+          <w:p>
+            <w:r>
+              <w:rPr>
+                <w:b/>
+                <w:sz w:val="20"/>
+              </w:rPr>
+              <w:t>8 (28%)</w:t>
+            </w:r>
+          </w:p>
+        </w:tc>
+        <w:tc>
+          <w:tcPr>
+            <w:tcW w:type="dxa" w:w="1728"/>
+          </w:tcPr>
+          <w:p>
+            <w:r>
+              <w:rPr>
+                <w:b/>
+                <w:sz w:val="20"/>
+              </w:rPr>
+              <w:t>24 (26%)</w:t>
+            </w:r>
+          </w:p>
+        </w:tc>
+      </w:tr>
+    </w:tbl>
+    <w:p/>
     <w:p>
       <w:r>
         <w:rPr>
@@ -8207,10 +10082,10 @@
         <w:rPr>
           <w:b/>
         </w:rPr>
-        <w:t>Women as sources/subjects (REAL, n=48):</w:t>
-      </w:r>
-      <w:r>
-        <w:t xml:space="preserve"> 2 confirmed ("Fake doctor…" 2010 — mother + girl victims; "Drama at Soroti MP Alice Alaso wedding" 2007 — FDC secretary general) + 1 probable (2026 beauty-event story) — directionally consistent with the UMWA/ACME industry baseline of ~20% (§4.3.2); the full 100 will quantify it.</w:t>
+        <w:t>Women as sources/subjects (REAL, n=92):</w:t>
+      </w:r>
+      <w:r>
+        <w:t xml:space="preserve"> 6 confirmed + 1 probable (~7%) — Betty Bigombe (2005 peace mediator), Syda Bbumba (2005, reader-voted worst minister), Alice Alaso (2007), Anifa Kawooya + Beti Kamya (2008), fake-doctor victims (2010), probable: 2026 beauty-event subject — well below the UMWA/ACME industry baseline of ~20% (§4.3.2); the full 100 will quantify it.</w:t>
       </w:r>
     </w:p>
     <w:p>
@@ -8218,7 +10093,7 @@
         <w:rPr>
           <w:b/>
         </w:rPr>
-        <w:t>Preliminary interpretation (6-edition micro-sample — illustrative, NOT conclusive):</w:t>
+        <w:t>Preliminary interpretation (10-edition sample, 2002–2026 — still preliminary, NOT conclusive):</w:t>
       </w:r>
     </w:p>
     <w:p>
@@ -8229,19 +10104,56 @@
         <w:rPr>
           <w:b/>
         </w:rPr>
-        <w:t>Politics+elections = 13/48 (27%)</w:t>
-      </w:r>
-      <w:r>
-        <w:t xml:space="preserve"> — even in an election window (20 Jan 2016, 29 days to polls) the online homepage led with sport, health, education and environment items; and in 2007 accountability content ("Otafiire voted worst minister" from a 3,077-reader survey) led the National section. This nuances the print-front-page bias finding: </w:t>
+        <w:t>Politics+elections = 29/92 (32%)</w:t>
+      </w:r>
+      <w:r>
+        <w:t>, remarkably stable across eras (43% in the restricted Movement era 1996–2005; 31% mid-period; 27% recently) — even in the Movement-era sample the lead story was state control of opposition assembly ("Govt Will Block Next Party Rally", 2002), giving the Political Economy pathway its sharpest test case.</w:t>
+      </w:r>
+    </w:p>
+    <w:p>
+      <w:pPr>
+        <w:pStyle w:val="ListNumber"/>
+      </w:pPr>
+      <w:r>
+        <w:rPr>
+          <w:b/>
+        </w:rPr>
+        <w:t>Development share 24/92 (26%)</w:t>
+      </w:r>
+      <w:r>
+        <w:t>, swinging 0% (2019 year-end edition) to 56% (Jan 2016) by edition type — edition-day selection is a genuine confound; the 100-edition sample must stratify by weekday/season. The Development Media pathway (P3) remains plausible but narrower than the 3-edition snapshot suggested.</w:t>
+      </w:r>
+    </w:p>
+    <w:p>
+      <w:pPr>
+        <w:pStyle w:val="ListNumber"/>
+      </w:pPr>
+      <w:r>
+        <w:rPr>
+          <w:b/>
+        </w:rPr>
+        <w:t>Stance is mixed, not monolithic:</w:t>
+      </w:r>
+      <w:r>
+        <w:t xml:space="preserve"> as the sample grew, neutral items rose to 41% and criticism settled at 24% — and the criticism is </w:t>
       </w:r>
       <w:r>
         <w:rPr>
           <w:i/>
         </w:rPr>
-        <w:t>online homepage agenda ≠ print front-page agenda</w:t>
-      </w:r>
-      <w:r>
-        <w:t xml:space="preserve"> — flagged for the full study.</w:t>
+        <w:t>accountability-typed</w:t>
+      </w:r>
+      <w:r>
+        <w:t xml:space="preserve"> (IGG seizures, reader "worst minister" surveys, court cases, auditor reports) rather than frontal oppositional critique. Two reader-survey accountability stories (Bbumba 2005, Otafiire 2007) show a distinctive NV accountability </w:t>
+      </w:r>
+      <w:r>
+        <w:rPr>
+          <w:i/>
+        </w:rPr>
+        <w:t>format</w:t>
+      </w:r>
+      <w:r>
+        <w:t xml:space="preserve"> worth probing in the full study.</w:t>
       </w:r>
     </w:p>
     <w:p>
@@ -8252,10 +10164,10 @@
         <w:rPr>
           <w:b/>
         </w:rPr>
-        <w:t>Development share varies sharply by edition type: 14/48 (29%) overall</w:t>
-      </w:r>
-      <w:r>
-        <w:t>, ranging from 56% (Jan 2016: health, education, environment) to 0% (31 Dec 2019 year-end review edition) — edition-day selection matters; the 100-edition sample must stratify by weekday/season to avoid cherry-picking.</w:t>
+        <w:t>The state paper hosted contested politics on its own platforms:</w:t>
+      </w:r>
+      <w:r>
+        <w:t xml:space="preserve"> 2005 discussion boards carried 3,510 posts on "Third Term?" and 3,085 on "Federo" — pre-social-media evidence for a bounded-but-real public sphere (P1) and a 24-year digital engagement arc (P4).</w:t>
       </w:r>
     </w:p>
     <w:p>
@@ -8266,40 +10178,139 @@
         <w:rPr>
           <w:b/>
         </w:rPr>
-        <w:t>Stance is mixed, not monolithic:</w:t>
-      </w:r>
-      <w:r>
-        <w:t xml:space="preserve"> 50% favourable coexists with 25% accountability-critical items ("worst minister" 2007; "sh8b unrecovered" and "lacks half of health workers" 2010). First-blush support for the ToC's "bounded, not captured" P1 claim; the full 100 must test whether criticism survives in election windows and on national (vs. local) government.</w:t>
-      </w:r>
-    </w:p>
-    <w:p>
-      <w:pPr>
-        <w:pStyle w:val="ListNumber"/>
+        <w:t>Museveni-visibility check (Jan 2016):</w:t>
+      </w:r>
+      <w:r>
+        <w:t xml:space="preserve"> the archived homepage shows 1 Museveni item of 9 — below ACME's print finding (front-page lead 15/31 days) — consistent with web/print agenda divergence, not contradiction.</w:t>
+      </w:r>
+    </w:p>
+    <w:p>
+      <w:pPr>
+        <w:pStyle w:val="Heading3"/>
+      </w:pPr>
+      <w:r>
+        <w:t>[YOUR DATA — PENDING] Tables to complete at n=100: 4.5 Actor presence by decade; 4.6 Stance by decade × election-window; 4.7 Dominant frames in election items (Entman-lite). Figures: clustered bar chart of issue shares; stance trend line. Pre-registered expected patterns: `Hypothetical-Projections-DO-NOT-SUBMIT.md` (planning only — never submit).</w:t>
+      </w:r>
+    </w:p>
+    <w:p>
+      <w:pPr>
+        <w:pStyle w:val="Heading3"/>
+      </w:pPr>
+      <w:r>
+        <w:t>4.3.5 Survey agenda + trust items [YOUR DATA — PENDING]</w:t>
+      </w:r>
+    </w:p>
+    <w:p>
+      <w:pPr>
+        <w:pStyle w:val="ListBullet"/>
+      </w:pPr>
+      <w:r>
+        <w:t>"Most important problem" ranking vs. coded New Vision agenda (rank comparison table).</w:t>
+      </w:r>
+    </w:p>
+    <w:p>
+      <w:pPr>
+        <w:pStyle w:val="ListBullet"/>
+      </w:pPr>
+      <w:r>
+        <w:t>Trust scores (0–10) per outlet; fairness-during-elections item (Table: Government strongly … Balanced … Don't know).</w:t>
+      </w:r>
+    </w:p>
+    <w:p>
+      <w:pPr>
+        <w:pStyle w:val="ListBullet"/>
+      </w:pPr>
+      <w:r>
+        <w:t>FGD-style open ends (Q on memorable political coverage): 3–5 illustrative quotes.</w:t>
+      </w:r>
+    </w:p>
+    <w:p>
+      <w:pPr>
+        <w:pStyle w:val="Heading3"/>
+      </w:pPr>
+      <w:r>
+        <w:t>4.3.6 KII political-economy evidence [YOUR DATA — PENDING]</w:t>
+      </w:r>
+    </w:p>
+    <w:p>
+      <w:pPr>
+        <w:pStyle w:val="ListBullet"/>
+      </w:pPr>
+      <w:r>
+        <w:t>Thematic matrix (3 informants × ownership pressure / advertiser influence / autonomy episodes / digital verdict), anonymised.</w:t>
+      </w:r>
+    </w:p>
+    <w:p>
+      <w:pPr>
+        <w:pStyle w:val="Heading3"/>
+      </w:pPr>
+      <w:r>
+        <w:t>4.3.7 Objective 1 preliminary synthesis [DRAFT AFTER FIELDWORK]</w:t>
+      </w:r>
+    </w:p>
+    <w:p>
+      <w:pPr>
+        <w:pStyle w:val="ListBullet"/>
+      </w:pPr>
+      <w:r>
+        <w:t>Joint display: strongest desk statistic + strongest own count + strongest quote per sub-finding; convergence/divergence verdict.</w:t>
+      </w:r>
+    </w:p>
+    <w:p>
+      <w:pPr>
+        <w:pStyle w:val="Heading2"/>
+      </w:pPr>
+      <w:r>
+        <w:t>4.4 Findings on Objective 2: Economic Impacts (Desk — REAL + Templates)</w:t>
+      </w:r>
+    </w:p>
+    <w:p>
+      <w:pPr>
+        <w:pStyle w:val="Heading3"/>
+      </w:pPr>
+      <w:r>
+        <w:t>4.4.1 What the public record already shows (REAL)</w:t>
+      </w:r>
+    </w:p>
+    <w:p>
+      <w:pPr>
+        <w:pStyle w:val="ListBullet"/>
       </w:pPr>
       <w:r>
         <w:rPr>
           <w:b/>
         </w:rPr>
-        <w:t>Museveni-visibility check (Jan 2016):</w:t>
-      </w:r>
-      <w:r>
-        <w:t xml:space="preserve"> this homepage shows 1 Museveni item of 9 — below ACME's print finding (front-page lead 15/31 days) — consistent with web/print agenda divergence, not contradiction.</w:t>
-      </w:r>
-    </w:p>
-    <w:p>
-      <w:pPr>
-        <w:pStyle w:val="Heading3"/>
-      </w:pPr>
-      <w:r>
-        <w:t>[YOUR DATA — PENDING] Tables to complete at n=100: 4.5 Actor presence by decade; 4.6 Stance by decade × election-window; 4.7 Dominant frames in election items (Entman-lite). Figures: clustered bar chart of issue shares; stance trend line. Pre-registered expected patterns: `Hypothetical-Projections-DO-NOT-SUBMIT.md` (planning only — never submit).</w:t>
-      </w:r>
-    </w:p>
-    <w:p>
-      <w:pPr>
-        <w:pStyle w:val="Heading3"/>
-      </w:pPr>
-      <w:r>
-        <w:t>4.3.5 Survey agenda + trust items [YOUR DATA — PENDING]</w:t>
+        <w:t>Market leadership (print):</w:t>
+      </w:r>
+      <w:r>
+        <w:t xml:space="preserve"> Q4 2019 — </w:t>
+      </w:r>
+      <w:r>
+        <w:rPr>
+          <w:i/>
+        </w:rPr>
+        <w:t>Bukedde</w:t>
+      </w:r>
+      <w:r>
+        <w:t xml:space="preserve"> 33,289; </w:t>
+      </w:r>
+      <w:r>
+        <w:rPr>
+          <w:i/>
+        </w:rPr>
+        <w:t>New Vision</w:t>
+      </w:r>
+      <w:r>
+        <w:t xml:space="preserve"> 23,636; </w:t>
+      </w:r>
+      <w:r>
+        <w:rPr>
+          <w:i/>
+        </w:rPr>
+        <w:t>Monitor</w:t>
+      </w:r>
+      <w:r>
+        <w:t xml:space="preserve"> 16,169 (ABC via Wikipedia [VERIFY original]).</w:t>
       </w:r>
     </w:p>
     <w:p>
@@ -8307,7 +10318,13 @@
         <w:pStyle w:val="ListBullet"/>
       </w:pPr>
       <w:r>
-        <w:t>"Most important problem" ranking vs. coded New Vision agenda (rank comparison table).</w:t>
+        <w:rPr>
+          <w:b/>
+        </w:rPr>
+        <w:t>Ownership/finance structure:</w:t>
+      </w:r>
+      <w:r>
+        <w:t xml:space="preserve"> state-majority (53.3%) USE-listed (NVL) since 2004 [VERIFY via USE/CMA].</w:t>
       </w:r>
     </w:p>
     <w:p>
@@ -8315,7 +10332,13 @@
         <w:pStyle w:val="ListBullet"/>
       </w:pPr>
       <w:r>
-        <w:t>Trust scores (0–10) per outlet; fairness-during-elections item (Table: Government strongly … Balanced … Don't know).</w:t>
+        <w:rPr>
+          <w:b/>
+        </w:rPr>
+        <w:t>Diversification:</w:t>
+      </w:r>
+      <w:r>
+        <w:t xml:space="preserve"> print → broadcast → digital → commercial printing → expos (launch years to verify per platform).</w:t>
       </w:r>
     </w:p>
     <w:p>
@@ -8323,165 +10346,40 @@
         <w:pStyle w:val="ListBullet"/>
       </w:pPr>
       <w:r>
-        <w:t>FGD-style open ends (Q on memorable political coverage): 3–5 illustrative quotes.</w:t>
-      </w:r>
-    </w:p>
-    <w:p>
-      <w:pPr>
-        <w:pStyle w:val="Heading3"/>
-      </w:pPr>
-      <w:r>
-        <w:t>4.3.6 KII political-economy evidence [YOUR DATA — PENDING]</w:t>
-      </w:r>
-    </w:p>
-    <w:p>
-      <w:pPr>
-        <w:pStyle w:val="ListBullet"/>
-      </w:pPr>
-      <w:r>
-        <w:t>Thematic matrix (3 informants × ownership pressure / advertiser influence / autonomy episodes / digital verdict), anonymised.</w:t>
-      </w:r>
-    </w:p>
-    <w:p>
-      <w:pPr>
-        <w:pStyle w:val="Heading3"/>
-      </w:pPr>
-      <w:r>
-        <w:t>4.3.7 Objective 1 preliminary synthesis [DRAFT AFTER FIELDWORK]</w:t>
-      </w:r>
-    </w:p>
-    <w:p>
-      <w:pPr>
-        <w:pStyle w:val="ListBullet"/>
-      </w:pPr>
-      <w:r>
-        <w:t>Joint display: strongest desk statistic + strongest own count + strongest quote per sub-finding; convergence/divergence verdict.</w:t>
-      </w:r>
-    </w:p>
-    <w:p>
-      <w:pPr>
-        <w:pStyle w:val="Heading2"/>
-      </w:pPr>
-      <w:r>
-        <w:t>4.4 Findings on Objective 2: Economic Impacts (Desk — REAL + Templates)</w:t>
-      </w:r>
-    </w:p>
-    <w:p>
-      <w:pPr>
-        <w:pStyle w:val="Heading3"/>
-      </w:pPr>
-      <w:r>
-        <w:t>4.4.1 What the public record already shows (REAL)</w:t>
-      </w:r>
-    </w:p>
-    <w:p>
-      <w:pPr>
-        <w:pStyle w:val="ListBullet"/>
-      </w:pPr>
-      <w:r>
         <w:rPr>
           <w:b/>
         </w:rPr>
-        <w:t>Market leadership (print):</w:t>
-      </w:r>
-      <w:r>
-        <w:t xml:space="preserve"> Q4 2019 — </w:t>
+        <w:t>Advertising footprint evolution (REAL, 2002→2026):</w:t>
+      </w:r>
+      <w:r>
+        <w:t xml:space="preserve"> 2002 Metropolitan Forex Bureau banner + dedicated banner-advertising page; 2005 ICS/Jomayi; 2007–10 safari, airline (Kenya Airways), govt-campaign (NAADS) and remittance (Dahabshiil) advertisers; 2011 NAADS; 2016 self-service </w:t>
+      </w:r>
+      <w:r>
+        <w:rPr>
+          <w:b/>
+        </w:rPr>
+        <w:t>"Book Advert"</w:t>
+      </w:r>
+      <w:r>
+        <w:t xml:space="preserve">; 2026 </w:t>
+      </w:r>
+      <w:r>
+        <w:rPr>
+          <w:b/>
+        </w:rPr>
+        <w:t>Advertising Rates page</w:t>
+      </w:r>
+      <w:r>
+        <w:t xml:space="preserve">, classifieds vertical, expo businesses. This documents the </w:t>
       </w:r>
       <w:r>
         <w:rPr>
           <w:i/>
         </w:rPr>
-        <w:t>Bukedde</w:t>
-      </w:r>
-      <w:r>
-        <w:t xml:space="preserve"> 33,289; </w:t>
-      </w:r>
-      <w:r>
-        <w:rPr>
-          <w:i/>
-        </w:rPr>
-        <w:t>New Vision</w:t>
-      </w:r>
-      <w:r>
-        <w:t xml:space="preserve"> 23,636; </w:t>
-      </w:r>
-      <w:r>
-        <w:rPr>
-          <w:i/>
-        </w:rPr>
-        <w:t>Monitor</w:t>
-      </w:r>
-      <w:r>
-        <w:t xml:space="preserve"> 16,169 (ABC via Wikipedia [VERIFY original]).</w:t>
-      </w:r>
-    </w:p>
-    <w:p>
-      <w:pPr>
-        <w:pStyle w:val="ListBullet"/>
-      </w:pPr>
-      <w:r>
-        <w:rPr>
-          <w:b/>
-        </w:rPr>
-        <w:t>Ownership/finance structure:</w:t>
-      </w:r>
-      <w:r>
-        <w:t xml:space="preserve"> state-majority (53.3%) USE-listed (NVL) since 2004 [VERIFY via USE/CMA].</w:t>
-      </w:r>
-    </w:p>
-    <w:p>
-      <w:pPr>
-        <w:pStyle w:val="ListBullet"/>
-      </w:pPr>
-      <w:r>
-        <w:rPr>
-          <w:b/>
-        </w:rPr>
-        <w:t>Diversification:</w:t>
-      </w:r>
-      <w:r>
-        <w:t xml:space="preserve"> print → broadcast → digital → commercial printing → expos (launch years to verify per platform).</w:t>
-      </w:r>
-    </w:p>
-    <w:p>
-      <w:pPr>
-        <w:pStyle w:val="ListBullet"/>
-      </w:pPr>
-      <w:r>
-        <w:rPr>
-          <w:b/>
-        </w:rPr>
-        <w:t>Advertising footprint evolution (REAL, from the 6 gathered editions):</w:t>
-      </w:r>
-      <w:r>
-        <w:t xml:space="preserve"> 2007 click-through banners (Abacus African Vacations, Budget Safaris, Uganda Online Law Library); 2010 display banners for Kenya Airways, NAADS, Dahabshiil, auto importers, safari firms; by 2016 self-service </w:t>
-      </w:r>
-      <w:r>
-        <w:rPr>
-          <w:b/>
-        </w:rPr>
-        <w:t>"Book Advert"</w:t>
-      </w:r>
-      <w:r>
-        <w:t xml:space="preserve"> online booking; by 2026 a dedicated </w:t>
-      </w:r>
-      <w:r>
-        <w:rPr>
-          <w:b/>
-        </w:rPr>
-        <w:t>Advertising Rates page</w:t>
-      </w:r>
-      <w:r>
-        <w:t xml:space="preserve">, classifieds vertical, and expo businesses (Harvest Money, Bride &amp; Groom). This documents the </w:t>
-      </w:r>
-      <w:r>
-        <w:rPr>
-          <w:i/>
-        </w:rPr>
         <w:t>commercialisation</w:t>
       </w:r>
       <w:r>
-        <w:t xml:space="preserve"> leg of P2 across two decades even before revenue figures are obtained.</w:t>
+        <w:t xml:space="preserve"> leg of P2 across 24 years even before revenue figures are obtained.</w:t>
       </w:r>
     </w:p>
     <w:p>
@@ -9171,7 +11069,7 @@
         <w:rPr>
           <w:b/>
         </w:rPr>
-        <w:t>Table 4.8 (REAL): New Vision's digital evolution from the 6 gathered editions (platform archaeology)</w:t>
+        <w:t>Table 4.8 (REAL): New Vision's digital evolution from the 10 gathered editions (platform archaeology)</w:t>
       </w:r>
     </w:p>
     <w:tbl>
@@ -9181,17 +11079,19 @@
         <w:tblLook w:firstColumn="1" w:firstRow="1" w:lastColumn="0" w:lastRow="0" w:noHBand="0" w:noVBand="1" w:val="04A0"/>
       </w:tblPr>
       <w:tblGrid>
-        <w:gridCol w:w="1440"/>
-        <w:gridCol w:w="1440"/>
-        <w:gridCol w:w="1440"/>
-        <w:gridCol w:w="1440"/>
-        <w:gridCol w:w="1440"/>
-        <w:gridCol w:w="1440"/>
+        <w:gridCol w:w="1080"/>
+        <w:gridCol w:w="1080"/>
+        <w:gridCol w:w="1080"/>
+        <w:gridCol w:w="1080"/>
+        <w:gridCol w:w="1080"/>
+        <w:gridCol w:w="1080"/>
+        <w:gridCol w:w="1080"/>
+        <w:gridCol w:w="1080"/>
       </w:tblGrid>
       <w:tr>
         <w:tc>
           <w:tcPr>
-            <w:tcW w:type="dxa" w:w="1440"/>
+            <w:tcW w:type="dxa" w:w="1080"/>
           </w:tcPr>
           <w:p>
             <w:r>
@@ -9205,7 +11105,7 @@
         </w:tc>
         <w:tc>
           <w:tcPr>
-            <w:tcW w:type="dxa" w:w="1440"/>
+            <w:tcW w:type="dxa" w:w="1080"/>
           </w:tcPr>
           <w:p>
             <w:r>
@@ -9213,13 +11113,41 @@
                 <w:b/>
                 <w:sz w:val="20"/>
               </w:rPr>
+              <w:t>2002</w:t>
+            </w:r>
+          </w:p>
+        </w:tc>
+        <w:tc>
+          <w:tcPr>
+            <w:tcW w:type="dxa" w:w="1080"/>
+          </w:tcPr>
+          <w:p>
+            <w:r>
+              <w:rPr>
+                <w:b/>
+                <w:sz w:val="20"/>
+              </w:rPr>
+              <w:t>2005</w:t>
+            </w:r>
+          </w:p>
+        </w:tc>
+        <w:tc>
+          <w:tcPr>
+            <w:tcW w:type="dxa" w:w="1080"/>
+          </w:tcPr>
+          <w:p>
+            <w:r>
+              <w:rPr>
+                <w:b/>
+                <w:sz w:val="20"/>
+              </w:rPr>
               <w:t>2007</w:t>
             </w:r>
           </w:p>
         </w:tc>
         <w:tc>
           <w:tcPr>
-            <w:tcW w:type="dxa" w:w="1440"/>
+            <w:tcW w:type="dxa" w:w="1080"/>
           </w:tcPr>
           <w:p>
             <w:r>
@@ -9233,7 +11161,7 @@
         </w:tc>
         <w:tc>
           <w:tcPr>
-            <w:tcW w:type="dxa" w:w="1440"/>
+            <w:tcW w:type="dxa" w:w="1080"/>
           </w:tcPr>
           <w:p>
             <w:r>
@@ -9247,7 +11175,7 @@
         </w:tc>
         <w:tc>
           <w:tcPr>
-            <w:tcW w:type="dxa" w:w="1440"/>
+            <w:tcW w:type="dxa" w:w="1080"/>
           </w:tcPr>
           <w:p>
             <w:r>
@@ -9261,7 +11189,7 @@
         </w:tc>
         <w:tc>
           <w:tcPr>
-            <w:tcW w:type="dxa" w:w="1440"/>
+            <w:tcW w:type="dxa" w:w="1080"/>
           </w:tcPr>
           <w:p>
             <w:r>
@@ -9277,20 +11205,20 @@
       <w:tr>
         <w:tc>
           <w:tcPr>
-            <w:tcW w:type="dxa" w:w="1440"/>
-          </w:tcPr>
-          <w:p>
-            <w:r>
-              <w:rPr>
-                <w:sz w:val="20"/>
-              </w:rPr>
-              <w:t>Social/community</w:t>
-            </w:r>
-          </w:p>
-        </w:tc>
-        <w:tc>
-          <w:tcPr>
-            <w:tcW w:type="dxa" w:w="1440"/>
+            <w:tcW w:type="dxa" w:w="1080"/>
+          </w:tcPr>
+          <w:p>
+            <w:r>
+              <w:rPr>
+                <w:sz w:val="20"/>
+              </w:rPr>
+              <w:t>Reader engagement</w:t>
+            </w:r>
+          </w:p>
+        </w:tc>
+        <w:tc>
+          <w:tcPr>
+            <w:tcW w:type="dxa" w:w="1080"/>
           </w:tcPr>
           <w:p>
             <w:r>
@@ -9298,26 +11226,65 @@
                 <w:b/>
                 <w:sz w:val="20"/>
               </w:rPr>
-              <w:t>Weblogs (blogs.php)</w:t>
-            </w:r>
-          </w:p>
-        </w:tc>
-        <w:tc>
-          <w:tcPr>
-            <w:tcW w:type="dxa" w:w="1440"/>
-          </w:tcPr>
-          <w:p>
-            <w:r>
-              <w:rPr>
-                <w:sz w:val="20"/>
-              </w:rPr>
-              <w:t>Facebook page + @newvisionwire Twitter</w:t>
-            </w:r>
-          </w:p>
-        </w:tc>
-        <w:tc>
-          <w:tcPr>
-            <w:tcW w:type="dxa" w:w="1440"/>
+              <w:t>Bulletin board</w:t>
+            </w:r>
+            <w:r>
+              <w:rPr>
+                <w:sz w:val="20"/>
+              </w:rPr>
+              <w:t xml:space="preserve"> (54-post party debate)</w:t>
+            </w:r>
+          </w:p>
+        </w:tc>
+        <w:tc>
+          <w:tcPr>
+            <w:tcW w:type="dxa" w:w="1080"/>
+          </w:tcPr>
+          <w:p>
+            <w:r>
+              <w:rPr>
+                <w:b/>
+                <w:sz w:val="20"/>
+              </w:rPr>
+              <w:t>Forums: "Third Term?" 3,510 posts</w:t>
+            </w:r>
+            <w:r>
+              <w:rPr>
+                <w:sz w:val="20"/>
+              </w:rPr>
+              <w:t>; Federo 3,085</w:t>
+            </w:r>
+          </w:p>
+        </w:tc>
+        <w:tc>
+          <w:tcPr>
+            <w:tcW w:type="dxa" w:w="1080"/>
+          </w:tcPr>
+          <w:p>
+            <w:r>
+              <w:rPr>
+                <w:sz w:val="20"/>
+              </w:rPr>
+              <w:t>Weblogs</w:t>
+            </w:r>
+          </w:p>
+        </w:tc>
+        <w:tc>
+          <w:tcPr>
+            <w:tcW w:type="dxa" w:w="1080"/>
+          </w:tcPr>
+          <w:p>
+            <w:r>
+              <w:rPr>
+                <w:sz w:val="20"/>
+              </w:rPr>
+              <w:t>Weblogs</w:t>
+            </w:r>
+          </w:p>
+        </w:tc>
+        <w:tc>
+          <w:tcPr>
+            <w:tcW w:type="dxa" w:w="1080"/>
           </w:tcPr>
           <w:p>
             <w:r>
@@ -9330,20 +11297,20 @@
         </w:tc>
         <w:tc>
           <w:tcPr>
-            <w:tcW w:type="dxa" w:w="1440"/>
-          </w:tcPr>
-          <w:p>
-            <w:r>
-              <w:rPr>
-                <w:sz w:val="20"/>
-              </w:rPr>
-              <w:t>Disqus comments on stories</w:t>
-            </w:r>
-          </w:p>
-        </w:tc>
-        <w:tc>
-          <w:tcPr>
-            <w:tcW w:type="dxa" w:w="1440"/>
+            <w:tcW w:type="dxa" w:w="1080"/>
+          </w:tcPr>
+          <w:p>
+            <w:r>
+              <w:rPr>
+                <w:sz w:val="20"/>
+              </w:rPr>
+              <w:t>Disqus comments</w:t>
+            </w:r>
+          </w:p>
+        </w:tc>
+        <w:tc>
+          <w:tcPr>
+            <w:tcW w:type="dxa" w:w="1080"/>
           </w:tcPr>
           <w:p>
             <w:r>
@@ -9358,20 +11325,46 @@
       <w:tr>
         <w:tc>
           <w:tcPr>
-            <w:tcW w:type="dxa" w:w="1440"/>
-          </w:tcPr>
-          <w:p>
-            <w:r>
-              <w:rPr>
-                <w:sz w:val="20"/>
-              </w:rPr>
-              <w:t>E-paper / apps</w:t>
-            </w:r>
-          </w:p>
-        </w:tc>
-        <w:tc>
-          <w:tcPr>
-            <w:tcW w:type="dxa" w:w="1440"/>
+            <w:tcW w:type="dxa" w:w="1080"/>
+          </w:tcPr>
+          <w:p>
+            <w:r>
+              <w:rPr>
+                <w:sz w:val="20"/>
+              </w:rPr>
+              <w:t>News delivery</w:t>
+            </w:r>
+          </w:p>
+        </w:tc>
+        <w:tc>
+          <w:tcPr>
+            <w:tcW w:type="dxa" w:w="1080"/>
+          </w:tcPr>
+          <w:p>
+            <w:r>
+              <w:rPr>
+                <w:sz w:val="20"/>
+              </w:rPr>
+              <w:t>E-mail headlines newsletter; sister-title search</w:t>
+            </w:r>
+          </w:p>
+        </w:tc>
+        <w:tc>
+          <w:tcPr>
+            <w:tcW w:type="dxa" w:w="1080"/>
+          </w:tcPr>
+          <w:p>
+            <w:r>
+              <w:rPr>
+                <w:sz w:val="20"/>
+              </w:rPr>
+              <w:t>Latest-headlines module</w:t>
+            </w:r>
+          </w:p>
+        </w:tc>
+        <w:tc>
+          <w:tcPr>
+            <w:tcW w:type="dxa" w:w="1080"/>
           </w:tcPr>
           <w:p>
             <w:r>
@@ -9384,7 +11377,7 @@
         </w:tc>
         <w:tc>
           <w:tcPr>
-            <w:tcW w:type="dxa" w:w="1440"/>
+            <w:tcW w:type="dxa" w:w="1080"/>
           </w:tcPr>
           <w:p>
             <w:r>
@@ -9397,54 +11390,40 @@
         </w:tc>
         <w:tc>
           <w:tcPr>
-            <w:tcW w:type="dxa" w:w="1440"/>
-          </w:tcPr>
-          <w:p>
-            <w:r>
-              <w:rPr>
-                <w:sz w:val="20"/>
-              </w:rPr>
-              <w:t xml:space="preserve">E-Paper </w:t>
-            </w:r>
-            <w:r>
-              <w:rPr>
-                <w:b/>
-                <w:sz w:val="20"/>
-              </w:rPr>
-              <w:t>mobile + desktop apps</w:t>
-            </w:r>
-          </w:p>
-        </w:tc>
-        <w:tc>
-          <w:tcPr>
-            <w:tcW w:type="dxa" w:w="1440"/>
-          </w:tcPr>
-          <w:p>
-            <w:r>
-              <w:rPr>
-                <w:sz w:val="20"/>
-              </w:rPr>
-              <w:t>Epaper link (epaper.visiongroup.co.ug)</w:t>
-            </w:r>
-          </w:p>
-        </w:tc>
-        <w:tc>
-          <w:tcPr>
-            <w:tcW w:type="dxa" w:w="1440"/>
-          </w:tcPr>
-          <w:p>
-            <w:r>
-              <w:rPr>
-                <w:sz w:val="20"/>
-              </w:rPr>
-              <w:t xml:space="preserve">E-Paper + </w:t>
-            </w:r>
-            <w:r>
-              <w:rPr>
-                <w:b/>
-                <w:sz w:val="20"/>
-              </w:rPr>
-              <w:t>Premium paywall + login</w:t>
+            <w:tcW w:type="dxa" w:w="1080"/>
+          </w:tcPr>
+          <w:p>
+            <w:r>
+              <w:rPr>
+                <w:sz w:val="20"/>
+              </w:rPr>
+              <w:t>RSS/subscribe</w:t>
+            </w:r>
+          </w:p>
+        </w:tc>
+        <w:tc>
+          <w:tcPr>
+            <w:tcW w:type="dxa" w:w="1080"/>
+          </w:tcPr>
+          <w:p>
+            <w:r>
+              <w:rPr>
+                <w:sz w:val="20"/>
+              </w:rPr>
+              <w:t>NV TV + Podcasts sections</w:t>
+            </w:r>
+          </w:p>
+        </w:tc>
+        <w:tc>
+          <w:tcPr>
+            <w:tcW w:type="dxa" w:w="1080"/>
+          </w:tcPr>
+          <w:p>
+            <w:r>
+              <w:rPr>
+                <w:sz w:val="20"/>
+              </w:rPr>
+              <w:t>Podcasts + TV-on-air embed</w:t>
             </w:r>
           </w:p>
         </w:tc>
@@ -9452,20 +11431,20 @@
       <w:tr>
         <w:tc>
           <w:tcPr>
-            <w:tcW w:type="dxa" w:w="1440"/>
-          </w:tcPr>
-          <w:p>
-            <w:r>
-              <w:rPr>
-                <w:sz w:val="20"/>
-              </w:rPr>
-              <w:t>Multimedia</w:t>
-            </w:r>
-          </w:p>
-        </w:tc>
-        <w:tc>
-          <w:tcPr>
-            <w:tcW w:type="dxa" w:w="1440"/>
+            <w:tcW w:type="dxa" w:w="1080"/>
+          </w:tcPr>
+          <w:p>
+            <w:r>
+              <w:rPr>
+                <w:sz w:val="20"/>
+              </w:rPr>
+              <w:t>E-paper / apps</w:t>
+            </w:r>
+          </w:p>
+        </w:tc>
+        <w:tc>
+          <w:tcPr>
+            <w:tcW w:type="dxa" w:w="1080"/>
           </w:tcPr>
           <w:p>
             <w:r>
@@ -9478,7 +11457,7 @@
         </w:tc>
         <w:tc>
           <w:tcPr>
-            <w:tcW w:type="dxa" w:w="1440"/>
+            <w:tcW w:type="dxa" w:w="1080"/>
           </w:tcPr>
           <w:p>
             <w:r>
@@ -9491,47 +11470,80 @@
         </w:tc>
         <w:tc>
           <w:tcPr>
-            <w:tcW w:type="dxa" w:w="1440"/>
-          </w:tcPr>
-          <w:p>
-            <w:r>
-              <w:rPr>
-                <w:sz w:val="20"/>
-              </w:rPr>
-              <w:t xml:space="preserve">Video, galleries, </w:t>
+            <w:tcW w:type="dxa" w:w="1080"/>
+          </w:tcPr>
+          <w:p>
+            <w:r>
+              <w:rPr>
+                <w:sz w:val="20"/>
+              </w:rPr>
+              <w:t>—</w:t>
+            </w:r>
+          </w:p>
+        </w:tc>
+        <w:tc>
+          <w:tcPr>
+            <w:tcW w:type="dxa" w:w="1080"/>
+          </w:tcPr>
+          <w:p>
+            <w:r>
+              <w:rPr>
+                <w:sz w:val="20"/>
+              </w:rPr>
+              <w:t>—</w:t>
+            </w:r>
+          </w:p>
+        </w:tc>
+        <w:tc>
+          <w:tcPr>
+            <w:tcW w:type="dxa" w:w="1080"/>
+          </w:tcPr>
+          <w:p>
+            <w:r>
+              <w:rPr>
+                <w:sz w:val="20"/>
+              </w:rPr>
+              <w:t xml:space="preserve">E-Paper </w:t>
             </w:r>
             <w:r>
               <w:rPr>
                 <w:b/>
                 <w:sz w:val="20"/>
               </w:rPr>
-              <w:t>podcasts</w:t>
-            </w:r>
-          </w:p>
-        </w:tc>
-        <w:tc>
-          <w:tcPr>
-            <w:tcW w:type="dxa" w:w="1440"/>
-          </w:tcPr>
-          <w:p>
-            <w:r>
-              <w:rPr>
-                <w:sz w:val="20"/>
-              </w:rPr>
-              <w:t>NV TV + Podcasts sections</w:t>
-            </w:r>
-          </w:p>
-        </w:tc>
-        <w:tc>
-          <w:tcPr>
-            <w:tcW w:type="dxa" w:w="1440"/>
-          </w:tcPr>
-          <w:p>
-            <w:r>
-              <w:rPr>
-                <w:sz w:val="20"/>
-              </w:rPr>
-              <w:t>Podcasts + TV-on-air embed</w:t>
+              <w:t>mobile + desktop apps</w:t>
+            </w:r>
+          </w:p>
+        </w:tc>
+        <w:tc>
+          <w:tcPr>
+            <w:tcW w:type="dxa" w:w="1080"/>
+          </w:tcPr>
+          <w:p>
+            <w:r>
+              <w:rPr>
+                <w:sz w:val="20"/>
+              </w:rPr>
+              <w:t>Epaper link</w:t>
+            </w:r>
+          </w:p>
+        </w:tc>
+        <w:tc>
+          <w:tcPr>
+            <w:tcW w:type="dxa" w:w="1080"/>
+          </w:tcPr>
+          <w:p>
+            <w:r>
+              <w:rPr>
+                <w:sz w:val="20"/>
+              </w:rPr>
+              <w:t xml:space="preserve">E-Paper + </w:t>
+            </w:r>
+            <w:r>
+              <w:rPr>
+                <w:b/>
+                <w:sz w:val="20"/>
+              </w:rPr>
+              <w:t>Premium paywall + login</w:t>
             </w:r>
           </w:p>
         </w:tc>
@@ -9539,7 +11551,7 @@
       <w:tr>
         <w:tc>
           <w:tcPr>
-            <w:tcW w:type="dxa" w:w="1440"/>
+            <w:tcW w:type="dxa" w:w="1080"/>
           </w:tcPr>
           <w:p>
             <w:r>
@@ -9552,7 +11564,7 @@
         </w:tc>
         <w:tc>
           <w:tcPr>
-            <w:tcW w:type="dxa" w:w="1440"/>
+            <w:tcW w:type="dxa" w:w="1080"/>
           </w:tcPr>
           <w:p>
             <w:r>
@@ -9565,7 +11577,7 @@
         </w:tc>
         <w:tc>
           <w:tcPr>
-            <w:tcW w:type="dxa" w:w="1440"/>
+            <w:tcW w:type="dxa" w:w="1080"/>
           </w:tcPr>
           <w:p>
             <w:r>
@@ -9578,7 +11590,33 @@
         </w:tc>
         <w:tc>
           <w:tcPr>
-            <w:tcW w:type="dxa" w:w="1440"/>
+            <w:tcW w:type="dxa" w:w="1080"/>
+          </w:tcPr>
+          <w:p>
+            <w:r>
+              <w:rPr>
+                <w:sz w:val="20"/>
+              </w:rPr>
+              <w:t>—</w:t>
+            </w:r>
+          </w:p>
+        </w:tc>
+        <w:tc>
+          <w:tcPr>
+            <w:tcW w:type="dxa" w:w="1080"/>
+          </w:tcPr>
+          <w:p>
+            <w:r>
+              <w:rPr>
+                <w:sz w:val="20"/>
+              </w:rPr>
+              <w:t>—</w:t>
+            </w:r>
+          </w:p>
+        </w:tc>
+        <w:tc>
+          <w:tcPr>
+            <w:tcW w:type="dxa" w:w="1080"/>
           </w:tcPr>
           <w:p>
             <w:r>
@@ -9598,7 +11636,7 @@
         </w:tc>
         <w:tc>
           <w:tcPr>
-            <w:tcW w:type="dxa" w:w="1440"/>
+            <w:tcW w:type="dxa" w:w="1080"/>
           </w:tcPr>
           <w:p>
             <w:r>
@@ -9611,7 +11649,7 @@
         </w:tc>
         <w:tc>
           <w:tcPr>
-            <w:tcW w:type="dxa" w:w="1440"/>
+            <w:tcW w:type="dxa" w:w="1080"/>
           </w:tcPr>
           <w:p>
             <w:r>
@@ -9633,7 +11671,7 @@
       <w:tr>
         <w:tc>
           <w:tcPr>
-            <w:tcW w:type="dxa" w:w="1440"/>
+            <w:tcW w:type="dxa" w:w="1080"/>
           </w:tcPr>
           <w:p>
             <w:r>
@@ -9646,59 +11684,85 @@
         </w:tc>
         <w:tc>
           <w:tcPr>
-            <w:tcW w:type="dxa" w:w="1440"/>
-          </w:tcPr>
-          <w:p>
-            <w:r>
-              <w:rPr>
-                <w:sz w:val="20"/>
-              </w:rPr>
-              <w:t>Jobs.co.ug ("NEW"); sister titles</w:t>
-            </w:r>
-          </w:p>
-        </w:tc>
-        <w:tc>
-          <w:tcPr>
-            <w:tcW w:type="dxa" w:w="1440"/>
-          </w:tcPr>
-          <w:p>
-            <w:r>
-              <w:rPr>
-                <w:sz w:val="20"/>
-              </w:rPr>
-              <w:t>Jobs.co.ug; sister titles</w:t>
-            </w:r>
-          </w:p>
-        </w:tc>
-        <w:tc>
-          <w:tcPr>
-            <w:tcW w:type="dxa" w:w="1440"/>
-          </w:tcPr>
-          <w:p>
-            <w:r>
-              <w:rPr>
-                <w:sz w:val="20"/>
-              </w:rPr>
-              <w:t>Oil &amp; Gas desk; Pakasa; Supplements/Tenders</w:t>
-            </w:r>
-          </w:p>
-        </w:tc>
-        <w:tc>
-          <w:tcPr>
-            <w:tcW w:type="dxa" w:w="1440"/>
-          </w:tcPr>
-          <w:p>
-            <w:r>
-              <w:rPr>
-                <w:sz w:val="20"/>
-              </w:rPr>
-              <w:t>Best Farmers, Toto, Pakasa, University/Schools Guides, Tenders/Notices</w:t>
-            </w:r>
-          </w:p>
-        </w:tc>
-        <w:tc>
-          <w:tcPr>
-            <w:tcW w:type="dxa" w:w="1440"/>
+            <w:tcW w:type="dxa" w:w="1080"/>
+          </w:tcPr>
+          <w:p>
+            <w:r>
+              <w:rPr>
+                <w:sz w:val="20"/>
+              </w:rPr>
+              <w:t>Jobs; enteruganda.com portal; Archives page</w:t>
+            </w:r>
+          </w:p>
+        </w:tc>
+        <w:tc>
+          <w:tcPr>
+            <w:tcW w:type="dxa" w:w="1080"/>
+          </w:tcPr>
+          <w:p>
+            <w:r>
+              <w:rPr>
+                <w:sz w:val="20"/>
+              </w:rPr>
+              <w:t>Bukedde Luganda cross-promo</w:t>
+            </w:r>
+          </w:p>
+        </w:tc>
+        <w:tc>
+          <w:tcPr>
+            <w:tcW w:type="dxa" w:w="1080"/>
+          </w:tcPr>
+          <w:p>
+            <w:r>
+              <w:rPr>
+                <w:sz w:val="20"/>
+              </w:rPr>
+              <w:t>Jobs.co.ug ("NEW")</w:t>
+            </w:r>
+          </w:p>
+        </w:tc>
+        <w:tc>
+          <w:tcPr>
+            <w:tcW w:type="dxa" w:w="1080"/>
+          </w:tcPr>
+          <w:p>
+            <w:r>
+              <w:rPr>
+                <w:sz w:val="20"/>
+              </w:rPr>
+              <w:t>Jobs.co.ug</w:t>
+            </w:r>
+          </w:p>
+        </w:tc>
+        <w:tc>
+          <w:tcPr>
+            <w:tcW w:type="dxa" w:w="1080"/>
+          </w:tcPr>
+          <w:p>
+            <w:r>
+              <w:rPr>
+                <w:sz w:val="20"/>
+              </w:rPr>
+              <w:t>Oil &amp; Gas desk; Pakasa; Tenders</w:t>
+            </w:r>
+          </w:p>
+        </w:tc>
+        <w:tc>
+          <w:tcPr>
+            <w:tcW w:type="dxa" w:w="1080"/>
+          </w:tcPr>
+          <w:p>
+            <w:r>
+              <w:rPr>
+                <w:sz w:val="20"/>
+              </w:rPr>
+              <w:t>Best Farmers, Toto, University/Schools Guides</w:t>
+            </w:r>
+          </w:p>
+        </w:tc>
+        <w:tc>
+          <w:tcPr>
+            <w:tcW w:type="dxa" w:w="1080"/>
           </w:tcPr>
           <w:p>
             <w:r>
@@ -9713,88 +11777,7 @@
       <w:tr>
         <w:tc>
           <w:tcPr>
-            <w:tcW w:type="dxa" w:w="1440"/>
-          </w:tcPr>
-          <w:p>
-            <w:r>
-              <w:rPr>
-                <w:sz w:val="20"/>
-              </w:rPr>
-              <w:t>Languages</w:t>
-            </w:r>
-          </w:p>
-        </w:tc>
-        <w:tc>
-          <w:tcPr>
-            <w:tcW w:type="dxa" w:w="1440"/>
-          </w:tcPr>
-          <w:p>
-            <w:r>
-              <w:rPr>
-                <w:sz w:val="20"/>
-              </w:rPr>
-              <w:t>English + sisters</w:t>
-            </w:r>
-          </w:p>
-        </w:tc>
-        <w:tc>
-          <w:tcPr>
-            <w:tcW w:type="dxa" w:w="1440"/>
-          </w:tcPr>
-          <w:p>
-            <w:r>
-              <w:rPr>
-                <w:sz w:val="20"/>
-              </w:rPr>
-              <w:t>English + sisters</w:t>
-            </w:r>
-          </w:p>
-        </w:tc>
-        <w:tc>
-          <w:tcPr>
-            <w:tcW w:type="dxa" w:w="1440"/>
-          </w:tcPr>
-          <w:p>
-            <w:r>
-              <w:rPr>
-                <w:sz w:val="20"/>
-              </w:rPr>
-              <w:t>English (+ sisters)</w:t>
-            </w:r>
-          </w:p>
-        </w:tc>
-        <w:tc>
-          <w:tcPr>
-            <w:tcW w:type="dxa" w:w="1440"/>
-          </w:tcPr>
-          <w:p>
-            <w:r>
-              <w:rPr>
-                <w:sz w:val="20"/>
-              </w:rPr>
-              <w:t>English (+ sisters)</w:t>
-            </w:r>
-          </w:p>
-        </w:tc>
-        <w:tc>
-          <w:tcPr>
-            <w:tcW w:type="dxa" w:w="1440"/>
-          </w:tcPr>
-          <w:p>
-            <w:r>
-              <w:rPr>
-                <w:b/>
-                <w:sz w:val="20"/>
-              </w:rPr>
-              <w:t>3-language toggle: Runyankole/English/Luganda</w:t>
-            </w:r>
-          </w:p>
-        </w:tc>
-      </w:tr>
-      <w:tr>
-        <w:tc>
-          <w:tcPr>
-            <w:tcW w:type="dxa" w:w="1440"/>
+            <w:tcW w:type="dxa" w:w="1080"/>
           </w:tcPr>
           <w:p>
             <w:r>
@@ -9807,33 +11790,59 @@
         </w:tc>
         <w:tc>
           <w:tcPr>
-            <w:tcW w:type="dxa" w:w="1440"/>
-          </w:tcPr>
-          <w:p>
-            <w:r>
-              <w:rPr>
-                <w:sz w:val="20"/>
-              </w:rPr>
-              <w:t>Click-through banners (Abacus, Budget Safaris, Law Library)</w:t>
-            </w:r>
-          </w:p>
-        </w:tc>
-        <w:tc>
-          <w:tcPr>
-            <w:tcW w:type="dxa" w:w="1440"/>
-          </w:tcPr>
-          <w:p>
-            <w:r>
-              <w:rPr>
-                <w:sz w:val="20"/>
-              </w:rPr>
-              <w:t>Banners (Kenya Airways, NAADS, Dahabshiil)</w:t>
-            </w:r>
-          </w:p>
-        </w:tc>
-        <w:tc>
-          <w:tcPr>
-            <w:tcW w:type="dxa" w:w="1440"/>
+            <w:tcW w:type="dxa" w:w="1080"/>
+          </w:tcPr>
+          <w:p>
+            <w:r>
+              <w:rPr>
+                <w:sz w:val="20"/>
+              </w:rPr>
+              <w:t>Metropolitan Forex banner; banner-advertising page</w:t>
+            </w:r>
+          </w:p>
+        </w:tc>
+        <w:tc>
+          <w:tcPr>
+            <w:tcW w:type="dxa" w:w="1080"/>
+          </w:tcPr>
+          <w:p>
+            <w:r>
+              <w:rPr>
+                <w:sz w:val="20"/>
+              </w:rPr>
+              <w:t>ICS + Jomayi banners</w:t>
+            </w:r>
+          </w:p>
+        </w:tc>
+        <w:tc>
+          <w:tcPr>
+            <w:tcW w:type="dxa" w:w="1080"/>
+          </w:tcPr>
+          <w:p>
+            <w:r>
+              <w:rPr>
+                <w:sz w:val="20"/>
+              </w:rPr>
+              <w:t>Click-through banners (safari/law)</w:t>
+            </w:r>
+          </w:p>
+        </w:tc>
+        <w:tc>
+          <w:tcPr>
+            <w:tcW w:type="dxa" w:w="1080"/>
+          </w:tcPr>
+          <w:p>
+            <w:r>
+              <w:rPr>
+                <w:sz w:val="20"/>
+              </w:rPr>
+              <w:t>Kenya Airways, NAADS, Dahabshiil, undertakers</w:t>
+            </w:r>
+          </w:p>
+        </w:tc>
+        <w:tc>
+          <w:tcPr>
+            <w:tcW w:type="dxa" w:w="1080"/>
           </w:tcPr>
           <w:p>
             <w:r>
@@ -9846,7 +11855,7 @@
         </w:tc>
         <w:tc>
           <w:tcPr>
-            <w:tcW w:type="dxa" w:w="1440"/>
+            <w:tcW w:type="dxa" w:w="1080"/>
           </w:tcPr>
           <w:p>
             <w:r>
@@ -9859,7 +11868,7 @@
         </w:tc>
         <w:tc>
           <w:tcPr>
-            <w:tcW w:type="dxa" w:w="1440"/>
+            <w:tcW w:type="dxa" w:w="1080"/>
           </w:tcPr>
           <w:p>
             <w:r>
@@ -9881,7 +11890,25 @@
         <w:t>Reading:</w:t>
       </w:r>
       <w:r>
-        <w:t xml:space="preserve"> a directly observed 19-year digitalisation arc (blogs 2007 → social 2010 → apps 2016 → podcasts/paywall/multilingual 2026) — P4's </w:t>
+        <w:t xml:space="preserve"> a directly observed </w:t>
+      </w:r>
+      <w:r>
+        <w:rPr>
+          <w:b/>
+        </w:rPr>
+        <w:t>24-year digitalisation arc (2002 bulletin boards &amp; e-mail newsletters → 2005 mass forums → 2007–10 blogs &amp; social → 2016 apps &amp; podcasts → 2026 paywall &amp; multilingual toggle)</w:t>
+      </w:r>
+      <w:r>
+        <w:t xml:space="preserve"> — reader two-way engagement on a Ugandan news site </w:t>
+      </w:r>
+      <w:r>
+        <w:rPr>
+          <w:i/>
+        </w:rPr>
+        <w:t>predates social media by eight years</w:t>
+      </w:r>
+      <w:r>
+        <w:t xml:space="preserve">, and P4's </w:t>
       </w:r>
       <w:r>
         <w:rPr>
@@ -13612,7 +15639,7 @@
         <w:pStyle w:val="Heading2"/>
       </w:pPr>
       <w:r>
-        <w:t>UPDATE — Session 2 (20 Sep 2026): 3 more editions → 6 editions, n=48 items</w:t>
+        <w:t>UPDATE — Session 2 (20 Sep 2026): 3 more editions → 5 editions, n=48 items (Entry 6 was a failure; corrected count)</w:t>
       </w:r>
     </w:p>
     <w:p>
@@ -13700,7 +15727,364 @@
         <w:pStyle w:val="Heading3"/>
       </w:pPr>
       <w:r>
-        <w:t>Running totals (6 editions): n=48 items. POL 10, ELE 3, ECO 6, HEA 3, EDU 1, SEC 4, SPO 6, AGR 1, TOUR 1, ENV 2, ENT 2, INTL 4, GEN/EDI 5. Politics+elections 13/48 (27%). Development-flagged 14/48 (29%). Stance (n=12 classifiable): FAV 6 (50%) / UNF 3 (25%) / NEU 3 (25%). Women confirmed 2 + 1 probable /48.</w:t>
+        <w:t>Running totals (5 editions): n=48 items. POL 10, ELE 3, ECO 6, HEA 3, EDU 1, SEC 4, SPO 6, AGR 1, TOUR 1, ENV 2, ENT 2, INTL 4, GEN/EDI 5. Politics+elections 13/48 (27%). Development-flagged 14/48 (29%). Stance (n=12 classifiable): FAV 6 (50%) / UNF 3 (25%) / NEU 3 (25%). Women confirmed 2 + 1 probable /48.</w:t>
+      </w:r>
+    </w:p>
+    <w:p>
+      <w:pPr>
+        <w:pStyle w:val="Heading2"/>
+      </w:pPr>
+      <w:r>
+        <w:t>UPDATE — Session 3 (20 Sep 2026): 5 more editions → 10 editions, n=92 items</w:t>
+      </w:r>
+    </w:p>
+    <w:p>
+      <w:pPr>
+        <w:pStyle w:val="Heading3"/>
+      </w:pPr>
+      <w:r>
+        <w:t>Entry 7 — NV-WB-2002-01-17 ✅ CODED (5 items; paper dated "Thursday January 17, 2002")</w:t>
+      </w:r>
+    </w:p>
+    <w:p>
+      <w:pPr>
+        <w:pStyle w:val="ListBullet"/>
+      </w:pPr>
+      <w:r>
+        <w:t>URL: https://web.archive.org/web/20020118025728/http://newvision.co.ug/ (year-redirect "2001" landed here)</w:t>
+      </w:r>
+    </w:p>
+    <w:p>
+      <w:pPr>
+        <w:pStyle w:val="ListBullet"/>
+      </w:pPr>
+      <w:r>
+        <w:t>Verbatim headlines: "Govt Will Block Next Party Rally" (POL lead, FAV-to-state framing: multipartyists' Jan 26 rally "illegal and will be blocked" — Police; Okurut + Ofwono Opondo photo) | "Constitutional Commission Launches Website" (POL/DEV — Ugandans can submit views to Constitutional Review Commission from home/office/internet café; Geoffrey Kamali) | "Schools To Teach Sex Education" (HEA/DEV — govt HIV/AIDS strategy; Muhwezi + Japan Policy Research Council's Kiichi Inoue photo) | "Villa Sacking: Blame It On Hasule" (SPO, via enteruganda.com teaser) | "When 'Successful' Elections Went Wrong" (GEN, enteruganda teaser).</w:t>
+      </w:r>
+    </w:p>
+    <w:p>
+      <w:pPr>
+        <w:pStyle w:val="ListBullet"/>
+      </w:pPr>
+      <w:r>
+        <w:t xml:space="preserve">Digital evidence (GOLD): </w:t>
+      </w:r>
+      <w:r>
+        <w:rPr>
+          <w:b/>
+        </w:rPr>
+        <w:t>bulletin board</w:t>
+      </w:r>
+      <w:r>
+        <w:t xml:space="preserve"> with "Debate on restoration of political parties" (54 posts) — two-way reader engagement in 2002; e-mail headlines newsletter subscription; site search across New Vision/Bukedde/Orumuri/Rupiny/Etop/Sunday Vision; dedicated Advertising + Archives + Staff pages; sister-title nav; Metropolitan Forex Bureau banner; FOREX table (USD 1720/1750).</w:t>
+      </w:r>
+    </w:p>
+    <w:p>
+      <w:pPr>
+        <w:pStyle w:val="Heading3"/>
+      </w:pPr>
+      <w:r>
+        <w:t>Entry 8 — NV-WB-2005-01-01 ✅ CODED (9 items)</w:t>
+      </w:r>
+    </w:p>
+    <w:p>
+      <w:pPr>
+        <w:pStyle w:val="ListBullet"/>
+      </w:pPr>
+      <w:r>
+        <w:t>URL: https://web.archive.org/web/20050101093211/http://www.newvision.co.ug/ (year-redirect "2004")</w:t>
+      </w:r>
+    </w:p>
+    <w:p>
+      <w:pPr>
+        <w:pStyle w:val="ListBullet"/>
+      </w:pPr>
+      <w:r>
+        <w:t xml:space="preserve">Verbatim headlines: "[LRA] going to sign a peace deal today… Rugunda told reporters in Kitgum" (POL lead, NEU; partial capture) | "Britain has no stand on 3rd term" (POL, NEU — British High Commission; term-limits debate) | "DP factions fight" (POL, NEU — police quell UYD fighting, Rubaga) | "Rebels, govt talk peace" (POL, NEU — LRA met Acholi leaders + mediator </w:t>
+      </w:r>
+      <w:r>
+        <w:rPr>
+          <w:b/>
+        </w:rPr>
+        <w:t>Betty Bigombe</w:t>
+      </w:r>
+      <w:r>
+        <w:t xml:space="preserve"> in Palabek; WOMAN SOURCE) | "$2.3b earmarked for road development" (ECO/DEV — RSDP2 sh3,900b/10yrs; PS Charles Muganzi) | "Grain dealers to get 'best' price" (ECO/AGR/DEV — Uganda Grain Traders + trade ministry warehouse receipt system) | "Mubiru's New Year pledge" (SPO — Hassan Mubiru) | "Cranes in 700m funds drive" (SPO — FUFA 2006 WC/ANC budget) | "Use small dams for power" (ENV/ECO editorial, UNF — "readers have voted Syda Bbumba… worst performing minister due to increased load-shedding"; WOMAN SUBJECT — second reader-survey accountability story after Otafiire 2007).</w:t>
+      </w:r>
+    </w:p>
+    <w:p>
+      <w:pPr>
+        <w:pStyle w:val="ListBullet"/>
+      </w:pPr>
+      <w:r>
+        <w:t xml:space="preserve">Digital evidence (GOLD): discussion-board topics with post counts — "Third Term? </w:t>
+      </w:r>
+      <w:r>
+        <w:rPr>
+          <w:b/>
+        </w:rPr>
+        <w:t>3,510 posts</w:t>
+      </w:r>
+      <w:r>
+        <w:t>", "'Federo' 3,085", "LRA negotiating peace 1,080" — massive pre-social-media reader engagement ON a state paper's platform; Bukedde Luganda headlines cross-promoted; ICS + Jomayi banners.</w:t>
+      </w:r>
+    </w:p>
+    <w:p>
+      <w:pPr>
+        <w:pStyle w:val="Heading3"/>
+      </w:pPr>
+      <w:r>
+        <w:t>Entry 9 — NV-WB-2008-12-30 ✅ CODED (12 items)</w:t>
+      </w:r>
+    </w:p>
+    <w:p>
+      <w:pPr>
+        <w:pStyle w:val="ListBullet"/>
+      </w:pPr>
+      <w:r>
+        <w:t>URL: https://web.archive.org/web/20081230030840/http://newvision.co.ug/ (year-redirect "2008")</w:t>
+      </w:r>
+    </w:p>
+    <w:p>
+      <w:pPr>
+        <w:pStyle w:val="ListBullet"/>
+      </w:pPr>
+      <w:r>
+        <w:t xml:space="preserve">Verbatim headlines: "Kony massacres 100 more in Congo" (INTL lead — LRA in DRC/Sudan, toll 189) | "Museveni wows voters for Kawooya" (POL, FAV — Sembabule Woman MP NRM candidate; </w:t>
+      </w:r>
+      <w:r>
+        <w:rPr>
+          <w:b/>
+        </w:rPr>
+        <w:t>Anifa Kawooya</w:t>
+      </w:r>
+      <w:r>
+        <w:t xml:space="preserve">, WOMAN SUBJECT) | "FDC summons MP Beti Kamya" (POL, NEU — </w:t>
+      </w:r>
+      <w:r>
+        <w:rPr>
+          <w:b/>
+        </w:rPr>
+        <w:t>Beti Kamya</w:t>
+      </w:r>
+      <w:r>
+        <w:t>, WOMAN SUBJECT) | "AYA Hotel lift operator arrested" (SEC — 5 dead at Hilton construction site) | "Kiyonga, US envoy discuss Somalia" (INTL — amb. Steve Browning; Yusuf resignation) | "Kajubi sent back on remand" (SEC — Masaka murder suspect) | "Kiira thermal contract extended" (ECO/DEV — 50MW, averted 12-hr loadshedding) | "140 vehicles destroyed at Mombasa port" (ECO) | "Namboole turf safe from worshippers" (SPO) | "Sudan confident of CECAFA victory" (SPO) | "Juba talks were a huge relief to northern Uganda" (POL column, NEU) | "Enforce safety at construction sites" (GEN/DEV editorial).</w:t>
+      </w:r>
+    </w:p>
+    <w:p>
+      <w:pPr>
+        <w:pStyle w:val="ListBullet"/>
+      </w:pPr>
+      <w:r>
+        <w:t>Digital evidence: WEBLOGS continue; Alcon/Budget Safaris/Professional Undertakers/</w:t>
+      </w:r>
+      <w:r>
+        <w:rPr>
+          <w:b/>
+        </w:rPr>
+        <w:t>Dahabshiil</w:t>
+      </w:r>
+      <w:r>
+        <w:t xml:space="preserve"> (diaspora remittances) banners.</w:t>
+      </w:r>
+    </w:p>
+    <w:p>
+      <w:pPr>
+        <w:pStyle w:val="Heading3"/>
+      </w:pPr>
+      <w:r>
+        <w:t>Entry 10 — NV-WB-2010-01-05 ✅ CODED (11 items)</w:t>
+      </w:r>
+    </w:p>
+    <w:p>
+      <w:pPr>
+        <w:pStyle w:val="ListBullet"/>
+      </w:pPr>
+      <w:r>
+        <w:t>URL: https://web.archive.org/web/20100105235652/http://www.newvision.co.ug/ (year-redirect "2009")</w:t>
+      </w:r>
+    </w:p>
+    <w:p>
+      <w:pPr>
+        <w:pStyle w:val="ListBullet"/>
+      </w:pPr>
+      <w:r>
+        <w:t>Verbatim headlines: "Police fish out KCC's land title" (POL lead, UNF — Nakasero Market title traced to CID; Basajjabalaba affair) | "IGG to seize property of 3 leaders" (POL, UNF — wealth-not-matching-income) | "Army shop reopens" (POL, FAV — Defence Forces Shop Ltd duty-free for soldiers; Nyakairima/Mugume) | "NRM executive to meet next week" (POL, NEU — NEC at State House Entebbe) | "Museveni meets Mumbere in Rwakitura" (POL, FAV — Rwenzururu King Charles Wesley Mumbere) | "Sh193 million cigarettes impounded" (ECO — URA, Yumbe) | "Importers sue tax body" (ECO, UNF — textile importers vs URA "illegal taxes") | "Drogba sinks TZ" (SPO) | "Troubled Jogoos host unpredictable Cops" (SPO — SC Villa) | "How will the al-Qaeda carry out their next terrorist attack?" (INTL — Opio Oloya column) | "Diaspora department good for Uganda" (GEN/DEV editorial — Foreign Affairs; investment).</w:t>
+      </w:r>
+    </w:p>
+    <w:p>
+      <w:pPr>
+        <w:pStyle w:val="ListBullet"/>
+      </w:pPr>
+      <w:r>
+        <w:t>Digital evidence: WEBLOGS + JOBS persist into 2010; Professional Undertakers/Budget Safaris banners.</w:t>
+      </w:r>
+    </w:p>
+    <w:p>
+      <w:pPr>
+        <w:pStyle w:val="Heading3"/>
+      </w:pPr>
+      <w:r>
+        <w:t>Entry 11 — NV-WB-2011-07-15 ✅ CODED (7 items; partial — capture has 2 chunks)</w:t>
+      </w:r>
+    </w:p>
+    <w:p>
+      <w:pPr>
+        <w:pStyle w:val="ListBullet"/>
+      </w:pPr>
+      <w:r>
+        <w:t>URL: https://web.archive.org/web/20110715062336/http://www.newvision.co.ug/ (explicit mid-2011 timestamp)</w:t>
+      </w:r>
+    </w:p>
+    <w:p>
+      <w:pPr>
+        <w:pStyle w:val="ListBullet"/>
+      </w:pPr>
+      <w:r>
+        <w:t>Verbatim headlines: "Food shortage hits eastern Uganda" (AGR lead, DEV — drought/famine/livestock disease; govt assessment team) | "Public accountants ask for pay raise" (POL, NEU — AG Bwoch: higher pay "to reduce corruption") | "Lukwago, EC lawyer clash over bribery" (ELE, NEU — Rubaga North recount; Lukwago witness for Kasibante) | "MPs appeal for peace in South Sudan" (INTL — AU/UN appeal) | "Witness betrayed Kayanja for money" (SEC — Pastor Robert Kayanja case) | "Govt moves to cut power expenses" (ECO/DEV — thermal generators switched off; ERA) | "Abu Dhabi investors take over local bank" (ECO — BoU approves NBC majority).</w:t>
+      </w:r>
+    </w:p>
+    <w:p>
+      <w:pPr>
+        <w:pStyle w:val="ListBullet"/>
+      </w:pPr>
+      <w:r>
+        <w:t xml:space="preserve">Digital evidence: </w:t>
+      </w:r>
+      <w:r>
+        <w:rPr>
+          <w:b/>
+        </w:rPr>
+        <w:t>NAADS banner ad</w:t>
+      </w:r>
+      <w:r>
+        <w:t xml:space="preserve"> (govt agricultural campaign advertising on NV — P2 ownership/revenue nexus); internal klabom promo banner.</w:t>
+      </w:r>
+    </w:p>
+    <w:p>
+      <w:pPr>
+        <w:pStyle w:val="Heading3"/>
+      </w:pPr>
+      <w:r>
+        <w:t>Entries 12–17 — FAILED captures (logged; do not re-fetch as-is)</w:t>
+      </w:r>
+    </w:p>
+    <w:p>
+      <w:pPr>
+        <w:pStyle w:val="ListBullet"/>
+      </w:pPr>
+      <w:r>
+        <w:rPr>
+          <w:b/>
+        </w:rPr>
+        <w:t>1998</w:t>
+      </w:r>
+      <w:r>
+        <w:t xml:space="preserve"> year-redirect → capture 20000308155801: toolbar only, zero headlines. </w:t>
+      </w:r>
+      <w:r>
+        <w:rPr>
+          <w:b/>
+        </w:rPr>
+        <w:t>KEY FINDING: Wayback's earliest newvision.co.ug capture is 8 Mar 2000</w:t>
+      </w:r>
+      <w:r>
+        <w:t xml:space="preserve"> → 1986–1999 is genuinely library-only (Rung 1 mandatory).</w:t>
+      </w:r>
+    </w:p>
+    <w:p>
+      <w:pPr>
+        <w:pStyle w:val="ListBullet"/>
+      </w:pPr>
+      <w:r>
+        <w:rPr>
+          <w:b/>
+        </w:rPr>
+        <w:t>2003</w:t>
+      </w:r>
+      <w:r>
+        <w:t xml:space="preserve"> year-redirect → capture 20031228010826: HTTP 302 → sundayvision.co.ug (weekend redirect). Method note: avoid Fri–Sun timestamps pre-2005; retry 2003 midweek if needed.</w:t>
+      </w:r>
+    </w:p>
+    <w:p>
+      <w:pPr>
+        <w:pStyle w:val="ListBullet"/>
+      </w:pPr>
+      <w:r>
+        <w:rPr>
+          <w:b/>
+        </w:rPr>
+        <w:t>2012</w:t>
+      </w:r>
+      <w:r>
+        <w:t xml:space="preserve"> (20120101003342), </w:t>
+      </w:r>
+      <w:r>
+        <w:rPr>
+          <w:b/>
+        </w:rPr>
+        <w:t>2014</w:t>
+      </w:r>
+      <w:r>
+        <w:t xml:space="preserve"> (20140715023517), </w:t>
+      </w:r>
+      <w:r>
+        <w:rPr>
+          <w:b/>
+        </w:rPr>
+        <w:t>2015</w:t>
+      </w:r>
+      <w:r>
+        <w:t xml:space="preserve"> (20150101073232 + 20150815044415): toolbar + olympics.gif lightbox, no headlines — the 2012–2015 homepage era is mostly uncapturable. Workarounds for full study: specific story URLs from that era, or print archive.</w:t>
+      </w:r>
+    </w:p>
+    <w:p>
+      <w:pPr>
+        <w:pStyle w:val="Heading3"/>
+      </w:pPr>
+      <w:r>
+        <w:t>Running totals (10 editions): n=92 items</w:t>
+      </w:r>
+    </w:p>
+    <w:p>
+      <w:r>
+        <w:t xml:space="preserve">POL 26, ELE 3, ECO 14, HEA 4, EDU 1, SEC 7, SPO 13, AGR 2, TOUR 1, ENV 3, ENT 2, INTL 8, GEN 8. </w:t>
+      </w:r>
+      <w:r>
+        <w:rPr>
+          <w:b/>
+        </w:rPr>
+        <w:t>Politics+elections 29/92 (32%)</w:t>
+      </w:r>
+      <w:r>
+        <w:t xml:space="preserve">. </w:t>
+      </w:r>
+      <w:r>
+        <w:rPr>
+          <w:b/>
+        </w:rPr>
+        <w:t>Development-flagged 24/92 (26%)</w:t>
+      </w:r>
+      <w:r>
+        <w:t xml:space="preserve"> — range 0% (2019 year-end) to 56% (Jan 2016) by edition type. </w:t>
+      </w:r>
+      <w:r>
+        <w:rPr>
+          <w:b/>
+        </w:rPr>
+        <w:t>Stance (n=29 classifiable): FAV 10 (34%) / NEU 12 (41%) / UNF 7 (24%)</w:t>
+      </w:r>
+      <w:r>
+        <w:t xml:space="preserve">. </w:t>
+      </w:r>
+      <w:r>
+        <w:rPr>
+          <w:b/>
+        </w:rPr>
+        <w:t>Women confirmed 6 + 1 probable /92</w:t>
+      </w:r>
+      <w:r>
+        <w:t xml:space="preserve"> (Bigombe 2005, Bbumba 2005, Alaso 2007, Kawooya 2008, Kamya 2008, fake-doctor victims 2010).</w:t>
       </w:r>
     </w:p>
     <w:p>

</xml_diff>

<commit_message>
Add full Chapter 5 draft: preliminary conclusions from n=132 pilot (bounded-institution verdict, theory-by-theory outcomes, tiered recommendations)
Co-authored-by: arena-agent <297053741+arena-agent@users.noreply.github.com>
</commit_message>
<xml_diff>
--- a/research-proposal/New-Vision-40-Years-RESEARCH-PROPOSAL-FINAL.docx
+++ b/research-proposal/New-Vision-40-Years-RESEARCH-PROPOSAL-FINAL.docx
@@ -10689,7 +10689,7 @@
         <w:pStyle w:val="Heading1"/>
       </w:pPr>
       <w:r>
-        <w:t>CHAPTER FIVE: SUMMARY, CONCLUSIONS AND RECOMMENDATIONS — FRAMEWORK</w:t>
+        <w:t>CHAPTER FIVE: SUMMARY, CONCLUSIONS AND RECOMMENDATIONS (DRAFT)</w:t>
       </w:r>
     </w:p>
     <w:p>
@@ -10707,18 +10707,20 @@
         <w:rPr>
           <w:i/>
         </w:rPr>
-        <w:t xml:space="preserve"> SHELL to be completed after Chapter Four analysis.</w:t>
-      </w:r>
-    </w:p>
-    <w:p>
-      <w:pPr>
-        <w:ind w:left="480"/>
-      </w:pPr>
-      <w:r>
-        <w:rPr>
+        <w:t xml:space="preserve"> DRAFT built on the pilot's real archive evidence (14 editions, n=132 items, 2002–2026, every item URL-traceable) and desk sources. Framed as </w:t>
+      </w:r>
+      <w:r>
+        <w:rPr>
+          <w:b/>
           <w:i/>
         </w:rPr>
-        <w:t>Examiners read this chapter closely: every conclusion must trace to a Chapter Four finding, and every recommendation to a conclusion.</w:t>
+        <w:t>expected outcomes</w:t>
+      </w:r>
+      <w:r>
+        <w:rPr>
+          <w:i/>
+        </w:rPr>
+        <w:t xml:space="preserve"> for the proposal defence: confirm, revise, or refute each after the full 100-edition/40-reader/3-KII study. The Hypothetical-Projections file (never submitted) supplies the thresholds this chapter's conclusions will be checked against.</w:t>
       </w:r>
     </w:p>
     <w:p>
@@ -10730,11 +10732,41 @@
       </w:r>
     </w:p>
     <w:p>
+      <w:r>
+        <w:t>This study set out to assess the impacts of The New Vision newspaper across 40 years of publication (1986–2026), guided by four objectives: its influence on political discourse, its economic and industry contribution, its social-development contribution, and its digital-era sustainability. A convergent mixed-methods case study design combines quantitative content analysis of 100 editions stratified across four decades, a survey of 40 readers, three key-informant interviews, and a platform-evolution audit, all disciplined by an explicit Theory of Change (Appendix B) whose pathways and falsification rules were pre-specified. This chapter summarises the findings to date, draws preliminary conclusions organised as empirical, theoretical, and methodological, offers tiered recommendations, and proposes further research. At proposal stage, §5.2–§5.3 rest on the pilot's verifiable archive dataset (n=132 items across 14 editions, 2002–2026) and the public record; every claim is marked for confirmation by the full study.</w:t>
+      </w:r>
+    </w:p>
+    <w:p>
+      <w:pPr>
+        <w:pStyle w:val="Heading2"/>
+      </w:pPr>
+      <w:r>
+        <w:t>5.2 Summary of Key Findings (Preliminary, One Subsection per Objective)</w:t>
+      </w:r>
+    </w:p>
+    <w:p>
+      <w:pPr>
+        <w:pStyle w:val="Heading3"/>
+      </w:pPr>
+      <w:r>
+        <w:t>5.2.1 Political impacts — Research Question 1 (from §4.3)</w:t>
+      </w:r>
+    </w:p>
+    <w:p>
       <w:pPr>
         <w:pStyle w:val="ListBullet"/>
       </w:pPr>
       <w:r>
-        <w:t>Restate purpose, objectives, and methodology in brief (design, sample, methods — 1 page max).</w:t>
+        <w:t xml:space="preserve">Politics and elections account for </w:t>
+      </w:r>
+      <w:r>
+        <w:rPr>
+          <w:b/>
+        </w:rPr>
+        <w:t>34/132 coded items (26%)</w:t>
+      </w:r>
+      <w:r>
+        <w:t>, stable across eras: 28% in the restricted Movement era (1996–2005), 23% mid-period, 28% in 2016–2026 (Table 4.3a/b) — political content is a constant, not a phase (§4.3.4).</w:t>
       </w:r>
     </w:p>
     <w:p>
@@ -10742,7 +10774,362 @@
         <w:pStyle w:val="ListBullet"/>
       </w:pPr>
       <w:r>
-        <w:t>Roadmap the chapter.</w:t>
+        <w:t xml:space="preserve">Stance among the 36 classifiable political items is </w:t>
+      </w:r>
+      <w:r>
+        <w:rPr>
+          <w:b/>
+        </w:rPr>
+        <w:t>mixed, not monolithic: 42% favourable / 36% neutral / 22% critical</w:t>
+      </w:r>
+      <w:r>
+        <w:t xml:space="preserve"> of state actors (Table 4.4) — a first-blush refutation of the pure propaganda-model expectation (Herman &amp; Chomsky, 1988).</w:t>
+      </w:r>
+    </w:p>
+    <w:p>
+      <w:pPr>
+        <w:pStyle w:val="ListBullet"/>
+      </w:pPr>
+      <w:r>
+        <w:t xml:space="preserve">The criticism that does appear is </w:t>
+      </w:r>
+      <w:r>
+        <w:rPr>
+          <w:b/>
+        </w:rPr>
+        <w:t>accountability-typed rather than oppositional</w:t>
+      </w:r>
+      <w:r>
+        <w:t xml:space="preserve">: reader-voted "worst minister" surveys (Syda Bbumba 2005; Kahinda Otafiire 2007, from 3,077 reader responses), IG G property seizures and the KCC land-title affair (2010), courts halting the AGOA sackings (2003) — the paper criticises </w:t>
+      </w:r>
+      <w:r>
+        <w:rPr>
+          <w:i/>
+        </w:rPr>
+        <w:t>within</w:t>
+      </w:r>
+      <w:r>
+        <w:t xml:space="preserve"> the state framework more readily than it platforms frontal opposition critique.</w:t>
+      </w:r>
+    </w:p>
+    <w:p>
+      <w:pPr>
+        <w:pStyle w:val="ListBullet"/>
+      </w:pPr>
+      <w:r>
+        <w:t xml:space="preserve">A recurring </w:t>
+      </w:r>
+      <w:r>
+        <w:rPr>
+          <w:b/>
+        </w:rPr>
+        <w:t>favourable genre is identifiable</w:t>
+      </w:r>
+      <w:r>
+        <w:t>: the year-end presidential-address lead (2017, 2018, 2019) and presidential milestone/agency items (2026 birthday; 150 tractors to farmers) — structural, calendar-driven incumbency prominence (§4.3.4, Interpretation 1).</w:t>
+      </w:r>
+    </w:p>
+    <w:p>
+      <w:pPr>
+        <w:pStyle w:val="ListBullet"/>
+      </w:pPr>
+      <w:r>
+        <w:t xml:space="preserve">In the Movement-era sample the lead story itself was state control of opposition assembly — </w:t>
+      </w:r>
+      <w:r>
+        <w:rPr>
+          <w:i/>
+        </w:rPr>
+        <w:t>"Govt Will Block Next Party Rally"</w:t>
+      </w:r>
+      <w:r>
+        <w:t xml:space="preserve"> (2002) — framed as a police statement, illustrating ownership-era framing (Entman, 1993) at the front page.</w:t>
+      </w:r>
+    </w:p>
+    <w:p>
+      <w:pPr>
+        <w:pStyle w:val="ListBullet"/>
+      </w:pPr>
+      <w:r>
+        <w:rPr>
+          <w:b/>
+        </w:rPr>
+        <w:t>Print–online divergence</w:t>
+      </w:r>
+      <w:r>
+        <w:t>: the archived 20 Jan 2016 homepage carried 1 Museveni item of 9, versus ACME's (2016a) print finding of the New Vision front page leading with Museveni 15 of 31 days that month — the web agenda was more diversified than the print agenda in the same election window (§4.3.4, Interpretation 6).</w:t>
+      </w:r>
+    </w:p>
+    <w:p>
+      <w:pPr>
+        <w:pStyle w:val="ListBullet"/>
+      </w:pPr>
+      <w:r>
+        <w:t xml:space="preserve">The paper hosted contested political speech </w:t>
+      </w:r>
+      <w:r>
+        <w:rPr>
+          <w:b/>
+        </w:rPr>
+        <w:t>on its own platforms before social media</w:t>
+      </w:r>
+      <w:r>
+        <w:t>: discussion boards carried 2,146 posts on "To Be or Not to Be Gay" (2003), 3,510 on "Third Term?" and 3,085 on "Federo" (2005) (§4.6, Table 4.8).</w:t>
+      </w:r>
+    </w:p>
+    <w:p>
+      <w:pPr>
+        <w:pStyle w:val="Heading3"/>
+      </w:pPr>
+      <w:r>
+        <w:t>5.2.2 Economic/industry impacts — Research Question 2 (from §4.4)</w:t>
+      </w:r>
+    </w:p>
+    <w:p>
+      <w:pPr>
+        <w:pStyle w:val="ListBullet"/>
+      </w:pPr>
+      <w:r>
+        <w:t xml:space="preserve">The institution is Uganda's </w:t>
+      </w:r>
+      <w:r>
+        <w:rPr>
+          <w:b/>
+        </w:rPr>
+        <w:t>longest continuously publishing national title</w:t>
+      </w:r>
+      <w:r>
+        <w:t>, state-majority owned (53.3%) and USE-listed (NVL) since 2004, spanning print (The New Vision, Bukedde + three sister-language titles), broadcasting, commercial printing and expos (§4.2).</w:t>
+      </w:r>
+    </w:p>
+    <w:p>
+      <w:pPr>
+        <w:pStyle w:val="ListBullet"/>
+      </w:pPr>
+      <w:r>
+        <w:t>Documented market position: Q4 2019 ABC figures place Bukedde (33,289) and New Vision (23,636) first and second nationally, ahead of the Monitor (16,169) (§4.4.1).</w:t>
+      </w:r>
+    </w:p>
+    <w:p>
+      <w:pPr>
+        <w:pStyle w:val="ListBullet"/>
+      </w:pPr>
+      <w:r>
+        <w:t xml:space="preserve">A </w:t>
+      </w:r>
+      <w:r>
+        <w:rPr>
+          <w:b/>
+        </w:rPr>
+        <w:t>continuous advertiser footprint across 24 years</w:t>
+      </w:r>
+      <w:r>
+        <w:t xml:space="preserve"> is observable in the archive itself: forex-bureau banners and a dedicated banner-advertising page (2002); safari/hospital/energy-regulator advertisers (2003–2005); Kenya Airways, NAADS (government campaign), Dahabshiil (remittances) (2007–2011); Coca-Cola talent-franchise integration (2015); self-service "Book Advert" (2016); an advertising-rates page plus expo businesses (2026) (§4.4.1).</w:t>
+      </w:r>
+    </w:p>
+    <w:p>
+      <w:pPr>
+        <w:pStyle w:val="ListBullet"/>
+      </w:pPr>
+      <w:r>
+        <w:t xml:space="preserve">What the public record does </w:t>
+      </w:r>
+      <w:r>
+        <w:rPr>
+          <w:b/>
+        </w:rPr>
+        <w:t>not</w:t>
+      </w:r>
+      <w:r>
+        <w:t xml:space="preserve"> show — revenue series, employment headcounts, printing-division economics — is itself reported as a documented absence, defining the full study's KII and archive tasks (§4.4.2).</w:t>
+      </w:r>
+    </w:p>
+    <w:p>
+      <w:pPr>
+        <w:pStyle w:val="Heading3"/>
+      </w:pPr>
+      <w:r>
+        <w:t>5.2.3 Social/development impacts — Research Question 3 (from §4.5)</w:t>
+      </w:r>
+    </w:p>
+    <w:p>
+      <w:pPr>
+        <w:pStyle w:val="ListBullet"/>
+      </w:pPr>
+      <w:r>
+        <w:rPr>
+          <w:b/>
+        </w:rPr>
+        <w:t>Development-flagged content totals 33/132 items (25%)</w:t>
+      </w:r>
+      <w:r>
+        <w:t>, ranging from 0% (year-end review edition, 2019) to 56% (election-window edition, January 2016) — development journalism is a durable but edition-dependent commitment, confirming the need for stratified sampling in the full study (§4.3.4, Interpretation 2).</w:t>
+      </w:r>
+    </w:p>
+    <w:p>
+      <w:pPr>
+        <w:pStyle w:val="ListBullet"/>
+      </w:pPr>
+      <w:r>
+        <w:t>Health content recurs across every era sampled: the school sex-education HIV strategy (2002), the health-worker shortfall exposé (2010), health-insurance pledges at the presidential debate (2016), and rape-prevention training research (2015) — consistent with the sector's documented HIV-communication role (Nassanga, 2008; Obregon &amp; Waisbord, 2012).</w:t>
+      </w:r>
+    </w:p>
+    <w:p>
+      <w:pPr>
+        <w:pStyle w:val="ListBullet"/>
+      </w:pPr>
+      <w:r>
+        <w:t xml:space="preserve">A </w:t>
+      </w:r>
+      <w:r>
+        <w:rPr>
+          <w:b/>
+        </w:rPr>
+        <w:t>reader-impact loop is documented by the paper itself</w:t>
+      </w:r>
+      <w:r>
+        <w:t>: "New Vision reader builds house for 130-year-old woman" (2018), in which an MP acted on a New Vision report — a concrete, citable instance of the media-to-action pathway the survey's recall items will test at scale (§4.3.4, Interpretation 5).</w:t>
+      </w:r>
+    </w:p>
+    <w:p>
+      <w:pPr>
+        <w:pStyle w:val="ListBullet"/>
+      </w:pPr>
+      <w:r>
+        <w:rPr>
+          <w:b/>
+        </w:rPr>
+        <w:t>Multilingual inclusion is structural, not decorative</w:t>
+      </w:r>
+      <w:r>
+        <w:t>: Bukedde Luganda cross-promotion on the English site since at least 2002–2005, sister-language titles throughout, and a three-language site toggle (Runyankole/English/Luganda) by 2026 (§4.6).</w:t>
+      </w:r>
+    </w:p>
+    <w:p>
+      <w:pPr>
+        <w:pStyle w:val="ListBullet"/>
+      </w:pPr>
+      <w:r>
+        <w:rPr>
+          <w:b/>
+        </w:rPr>
+        <w:t>Women appear as confirmed sources/subjects in ~10% of items (13 of 132)</w:t>
+      </w:r>
+      <w:r>
+        <w:t xml:space="preserve"> — roughly half the UMWA/ACME industry baseline of ~20% (§4.3.2, §4.3.4) — with named individuals spanning politics (Bigombe, Alaso, Kawooya, Kamya, Ogwal), business (Bbumba), and community subjects.</w:t>
+      </w:r>
+    </w:p>
+    <w:p>
+      <w:pPr>
+        <w:pStyle w:val="Heading3"/>
+      </w:pPr>
+      <w:r>
+        <w:t>5.2.4 Digital transformation and sustainability — Research Question 4 (from §4.6)</w:t>
+      </w:r>
+    </w:p>
+    <w:p>
+      <w:pPr>
+        <w:pStyle w:val="ListBullet"/>
+      </w:pPr>
+      <w:r>
+        <w:t xml:space="preserve">A </w:t>
+      </w:r>
+      <w:r>
+        <w:rPr>
+          <w:b/>
+        </w:rPr>
+        <w:t>24-year digitalisation arc</w:t>
+      </w:r>
+      <w:r>
+        <w:t xml:space="preserve"> is directly observed from the archive: e-mail bulletins and bulletin boards (2002) → mass reader forums (2003–2005) → weblogs and social links (2007–2011) → a live-timestamp CMS (2015) → apps, podcasts, elections portal, live blogs (2016–2019) → Premium paywall, multilingual toggle and social distribution (2026) (Table 4.8).</w:t>
+      </w:r>
+    </w:p>
+    <w:p>
+      <w:pPr>
+        <w:pStyle w:val="ListBullet"/>
+      </w:pPr>
+      <w:r>
+        <w:rPr>
+          <w:b/>
+        </w:rPr>
+        <w:t>Two-way audience engagement predates social media in Uganda by roughly seven years</w:t>
+      </w:r>
+      <w:r>
+        <w:t xml:space="preserve"> — the 2003–2005 forums were, in effect, the country's earliest large-scale news comment spaces on a state-owned paper's own platform (§4.6).</w:t>
+      </w:r>
+    </w:p>
+    <w:p>
+      <w:pPr>
+        <w:pStyle w:val="ListBullet"/>
+      </w:pPr>
+      <w:r>
+        <w:t>The demand environment remains the binding constraint: 28% internet penetration, 72% rural population, median age 16.9 (DataReportal, 2025), inside Uganda's worst recorded press-freedom band (143rd, "very serious"; RSF, 2025) (§4.3.3, §4.6.2).</w:t>
+      </w:r>
+    </w:p>
+    <w:p>
+      <w:pPr>
+        <w:pStyle w:val="ListBullet"/>
+      </w:pPr>
+      <w:r>
+        <w:t xml:space="preserve">The open question is </w:t>
+      </w:r>
+      <w:r>
+        <w:rPr>
+          <w:b/>
+        </w:rPr>
+        <w:t>revenue</w:t>
+      </w:r>
+      <w:r>
+        <w:t>: the investment leg of the digital pathway is documented; whether the paywall/verticals strategy pays, for a young mostly-offline audience, is what the audit and willingness-to-pay items must resolve (§4.6.3).</w:t>
+      </w:r>
+    </w:p>
+    <w:p>
+      <w:pPr>
+        <w:pStyle w:val="Heading3"/>
+      </w:pPr>
+      <w:r>
+        <w:t>5.2.5 Comparative placement (from §4.7)</w:t>
+      </w:r>
+    </w:p>
+    <w:p>
+      <w:r>
+        <w:t xml:space="preserve">Against the desk baselines, the pilot sample is </w:t>
+      </w:r>
+      <w:r>
+        <w:rPr>
+          <w:i/>
+        </w:rPr>
+        <w:t>more diverse</w:t>
+      </w:r>
+      <w:r>
+        <w:t xml:space="preserve"> than ACME's print-front-page record (web ≠ print), </w:t>
+      </w:r>
+      <w:r>
+        <w:rPr>
+          <w:i/>
+        </w:rPr>
+        <w:t>less gender-inclusive</w:t>
+      </w:r>
+      <w:r>
+        <w:t xml:space="preserve"> than the industry average (10% vs 20%), </w:t>
+      </w:r>
+      <w:r>
+        <w:rPr>
+          <w:i/>
+        </w:rPr>
+        <w:t>consistent</w:t>
+      </w:r>
+      <w:r>
+        <w:t xml:space="preserve"> with the sector's development-journalism reputation, and </w:t>
+      </w:r>
+      <w:r>
+        <w:rPr>
+          <w:i/>
+        </w:rPr>
+        <w:t>earlier</w:t>
+      </w:r>
+      <w:r>
+        <w:t xml:space="preserve"> into digital community features than the "state media lag" narrative suggests.</w:t>
       </w:r>
     </w:p>
     <w:p>
@@ -10750,7 +11137,46 @@
         <w:pStyle w:val="Heading2"/>
       </w:pPr>
       <w:r>
-        <w:t>5.2 Summary of Key Findings (One Subsection Per Objective)</w:t>
+        <w:t>5.3 Conclusions (Preliminary)</w:t>
+      </w:r>
+    </w:p>
+    <w:p>
+      <w:pPr>
+        <w:pStyle w:val="Heading3"/>
+      </w:pPr>
+      <w:r>
+        <w:t>5.3.1 Empirical conclusions (expected outcome)</w:t>
+      </w:r>
+    </w:p>
+    <w:p>
+      <w:r>
+        <w:t xml:space="preserve">The evidence to date supports a </w:t>
+      </w:r>
+      <w:r>
+        <w:rPr>
+          <w:b/>
+        </w:rPr>
+        <w:t>"bounded institution" verdict</w:t>
+      </w:r>
+      <w:r>
+        <w:t xml:space="preserve">: across 24 of its 40 observable-online years, The New Vision appears as (a) an incumbency-leaning but accountability-capable political communicator; (b) a commercially durable, diversified media house whose market leadership is verifiable; (c) a genuine development communicator whose commitment varies by edition type; and (d) a surprisingly early and sustained digital adapter whose sustainability now hinges on monetisation rather than adoption. If the full study confirms these patterns at n=100 with the survey and KIIs, the 40-year impact of The New Vision is best characterised as </w:t>
+      </w:r>
+      <w:r>
+        <w:rPr>
+          <w:b/>
+        </w:rPr>
+        <w:t>indispensable developmental presence with constrained democratic contribution and unresolved digital sustainability</w:t>
+      </w:r>
+      <w:r>
+        <w:t>. The falsification rules in Appendix B state what contrary evidence would overturn each limb.</w:t>
+      </w:r>
+    </w:p>
+    <w:p>
+      <w:pPr>
+        <w:pStyle w:val="Heading3"/>
+      </w:pPr>
+      <w:r>
+        <w:t>5.3.2 Theoretical conclusions (expected outcome)</w:t>
       </w:r>
     </w:p>
     <w:p>
@@ -10758,7 +11184,13 @@
         <w:pStyle w:val="ListBullet"/>
       </w:pPr>
       <w:r>
-        <w:t>5.2.1 Political impacts (answer Research Question 1 in ~5–8 bullet findings, each citing §4.3 tables/figures).</w:t>
+        <w:rPr>
+          <w:b/>
+        </w:rPr>
+        <w:t>Development Media Theory — qualified vindication.</w:t>
+      </w:r>
+      <w:r>
+        <w:t xml:space="preserve"> Schramm's (1964) developmental mandate is visible in institutionalised formats (schools/ university guides, Harvest Money, best-farmers, health campaigns) totalling a quarter of items, but the 0–56% edition swing and top-down format support Wasserman's (2011) and Servaes's (1999) caution that African development journalism is real yet uneven and rarely participatory. The 2018 reader-impact story is the tradition's strongest single artifact in the sample.</w:t>
       </w:r>
     </w:p>
     <w:p>
@@ -10766,7 +11198,22 @@
         <w:pStyle w:val="ListBullet"/>
       </w:pPr>
       <w:r>
-        <w:t>5.2.2 Economic impacts (answer RQ2 from §4.4).</w:t>
+        <w:rPr>
+          <w:b/>
+        </w:rPr>
+        <w:t>Agenda-setting — supported with a spatial qualification.</w:t>
+      </w:r>
+      <w:r>
+        <w:t xml:space="preserve"> McCombs and Shaw (1972) hold in the print record (ACME 2016a) while the pilot's web record diverges; agenda-setting by a state daily appears </w:t>
+      </w:r>
+      <w:r>
+        <w:rPr>
+          <w:i/>
+        </w:rPr>
+        <w:t>platform-specific</w:t>
+      </w:r>
+      <w:r>
+        <w:t>, and calendar-driven attribute agenda-setting of the presidency (year-end address leads) fits McCombs's (2014) second level. Whether audiences' "most important problem" tracks the NV agenda is precisely what the survey will answer.</w:t>
       </w:r>
     </w:p>
     <w:p>
@@ -10774,7 +11221,22 @@
         <w:pStyle w:val="ListBullet"/>
       </w:pPr>
       <w:r>
-        <w:t>5.2.3 Social/development impacts (answer RQ3 from §4.5).</w:t>
+        <w:rPr>
+          <w:b/>
+        </w:rPr>
+        <w:t>Political economy — supported in bounded form.</w:t>
+      </w:r>
+      <w:r>
+        <w:t xml:space="preserve"> Ownership predicts the </w:t>
+      </w:r>
+      <w:r>
+        <w:rPr>
+          <w:i/>
+        </w:rPr>
+        <w:t>favourable genre</w:t>
+      </w:r>
+      <w:r>
+        <w:t xml:space="preserve"> and the 2002 front-page framing, but not total capture: accountability-typed criticism (22%) and 2003–2005 reader forums on the third-term debate coexist with state majority ownership (Herman &amp; Chomsky, 1988; Mosco, 2009). The KII question "what was not publishable" now carries specific probe material.</w:t>
       </w:r>
     </w:p>
     <w:p>
@@ -10782,7 +11244,49 @@
         <w:pStyle w:val="ListBullet"/>
       </w:pPr>
       <w:r>
-        <w:t>5.2.4 Digital transformation and sustainability (answer RQ4 from §4.6).</w:t>
+        <w:rPr>
+          <w:b/>
+        </w:rPr>
+        <w:t>Framing — testable frame inventory identified.</w:t>
+      </w:r>
+      <w:r>
+        <w:t xml:space="preserve"> The pilot surfaces recurring frames for the full n=100 test: </w:t>
+      </w:r>
+      <w:r>
+        <w:rPr>
+          <w:i/>
+        </w:rPr>
+        <w:t>stability/order</w:t>
+      </w:r>
+      <w:r>
+        <w:t xml:space="preserve"> (rally bans, security assurances), </w:t>
+      </w:r>
+      <w:r>
+        <w:rPr>
+          <w:i/>
+        </w:rPr>
+        <w:t>development progress</w:t>
+      </w:r>
+      <w:r>
+        <w:t xml:space="preserve"> (tractors, sorghum bonanza, roads), </w:t>
+      </w:r>
+      <w:r>
+        <w:rPr>
+          <w:i/>
+        </w:rPr>
+        <w:t>accountability/waste</w:t>
+      </w:r>
+      <w:r>
+        <w:t xml:space="preserve"> (IGG, unrecovered funds), </w:t>
+      </w:r>
+      <w:r>
+        <w:rPr>
+          <w:i/>
+        </w:rPr>
+        <w:t>national prestige</w:t>
+      </w:r>
+      <w:r>
+        <w:t xml:space="preserve"> (Cranes, birthdays, summits) (Entman, 1993).</w:t>
       </w:r>
     </w:p>
     <w:p>
@@ -10790,7 +11294,71 @@
         <w:pStyle w:val="ListBullet"/>
       </w:pPr>
       <w:r>
-        <w:t>5.2.5 Comparative placement (from §4.7).</w:t>
+        <w:rPr>
+          <w:b/>
+        </w:rPr>
+        <w:t>Uses and gratifications — audience agency is historical fact, not just theory.</w:t>
+      </w:r>
+      <w:r>
+        <w:t xml:space="preserve"> The 2002–2005 forums (thousands of posts on the most contested questions of the day) show Ugandan audiences already using a state paper's platform for political talk long before Facebook; Katz et al.'s (1973) framework applies to the archive itself, not only to the coming survey.</w:t>
+      </w:r>
+    </w:p>
+    <w:p>
+      <w:pPr>
+        <w:pStyle w:val="Heading3"/>
+      </w:pPr>
+      <w:r>
+        <w:t>5.3.3 Contribution to knowledge</w:t>
+      </w:r>
+    </w:p>
+    <w:p>
+      <w:r>
+        <w:t xml:space="preserve">The study's contribution, if the full study holds, is fivefold: (1) the </w:t>
+      </w:r>
+      <w:r>
+        <w:rPr>
+          <w:b/>
+        </w:rPr>
+        <w:t>first longitudinal content record</w:t>
+      </w:r>
+      <w:r>
+        <w:t xml:space="preserve"> of Uganda's state flagship spanning four decades, built on a URL-traceable public dataset; (2) the </w:t>
+      </w:r>
+      <w:r>
+        <w:rPr>
+          <w:b/>
+        </w:rPr>
+        <w:t>first platform archaeology (2002–2026)</w:t>
+      </w:r>
+      <w:r>
+        <w:t xml:space="preserve"> of any Ugandan newspaper, revising the assumption that state-media digital engagement is recent; (3) a </w:t>
+      </w:r>
+      <w:r>
+        <w:rPr>
+          <w:b/>
+        </w:rPr>
+        <w:t>replicable public-source protocol</w:t>
+      </w:r>
+      <w:r>
+        <w:t xml:space="preserve"> — capture, failure-logging, and stratification rules — for studying media where archives are closed; (4) documented </w:t>
+      </w:r>
+      <w:r>
+        <w:rPr>
+          <w:b/>
+        </w:rPr>
+        <w:t>print–online agenda divergence</w:t>
+      </w:r>
+      <w:r>
+        <w:t xml:space="preserve"> inside a single election window, a methodological caution for all Ugandan election-coverage research; and (5) a </w:t>
+      </w:r>
+      <w:r>
+        <w:rPr>
+          <w:b/>
+        </w:rPr>
+        <w:t>pre-registered Theory of Change with falsification rules</w:t>
+      </w:r>
+      <w:r>
+        <w:t xml:space="preserve"> for national-media impact assessment, adaptable to sister titles and to Monitor.</w:t>
       </w:r>
     </w:p>
     <w:p>
@@ -10798,94 +11366,86 @@
         <w:pStyle w:val="Heading2"/>
       </w:pPr>
       <w:r>
-        <w:t>5.3 Conclusions</w:t>
-      </w:r>
-    </w:p>
-    <w:p>
-      <w:r>
-        <w:t>Organised by (a) empirical conclusions, (b) theoretical conclusions, (c) methodological reflections:</w:t>
-      </w:r>
-    </w:p>
-    <w:p>
-      <w:pPr>
-        <w:pStyle w:val="ListBullet"/>
+        <w:t>5.4 Recommendations (Preliminary, to be confirmed by full findings)</w:t>
+      </w:r>
+    </w:p>
+    <w:p>
+      <w:pPr>
+        <w:pStyle w:val="ListNumber"/>
       </w:pPr>
       <w:r>
         <w:rPr>
           <w:b/>
         </w:rPr>
-        <w:t>5.3.1 Empirical conclusions:</w:t>
-      </w:r>
-      <w:r>
-        <w:t xml:space="preserve"> the overall 40-year verdict — e.g., indispensable development communicator with constrained democratic contribution? Multimedia success facing sustainability cliff? (To be written from evidence; avoid pre-judging in proposal.)</w:t>
-      </w:r>
-    </w:p>
-    <w:p>
-      <w:pPr>
-        <w:pStyle w:val="ListBullet"/>
+        <w:t>To the Government of Uganda (majority shareholder):</w:t>
+      </w:r>
+      <w:r>
+        <w:t xml:space="preserve"> convert the implicit ownership bargain into an explicit editorial-independence charter and public-service compact, given the evidence of calendar-driven incumbency genres coexisting with functional accountability journalism (Finding 5.2.1); and fund digitisation of the 1986–1999 bound volumes, since no online record of the paper's first 14 years exists (Finding 5.2.2; §4.1).</w:t>
+      </w:r>
+    </w:p>
+    <w:p>
+      <w:pPr>
+        <w:pStyle w:val="ListNumber"/>
       </w:pPr>
       <w:r>
         <w:rPr>
           <w:b/>
         </w:rPr>
-        <w:t>5.3.2 Theoretical conclusions:</w:t>
-      </w:r>
-      <w:r>
-        <w:t xml:space="preserve"> what does New Vision's 40 years teach us about each Chapter Two theory?</w:t>
-      </w:r>
-    </w:p>
-    <w:p>
-      <w:pPr>
-        <w:pStyle w:val="ListBullet"/>
-      </w:pPr>
-      <w:r>
-        <w:t>Development Media Theory: vindicated, qualified, or refuted in the Ugandan case? (cf. Servaes, 1999; Wasserman, 2011 participatory reformulations.)</w:t>
-      </w:r>
-    </w:p>
-    <w:p>
-      <w:pPr>
-        <w:pStyle w:val="ListBullet"/>
-      </w:pPr>
-      <w:r>
-        <w:t>Agenda-Setting: does a state-majority daily still set the agenda in a social-media age? (cf. Kalyango &amp; Onyechi, 2013; Banda, 2009 limits.)</w:t>
-      </w:r>
-    </w:p>
-    <w:p>
-      <w:pPr>
-        <w:pStyle w:val="ListBullet"/>
-      </w:pPr>
-      <w:r>
-        <w:t>Political Economy: how did ownership/advertising mechanisms operate in practice? (cf. Herman &amp; Chomsky, 1988; Mwesige, 2004; Nassanga, 2008.)</w:t>
-      </w:r>
-    </w:p>
-    <w:p>
-      <w:pPr>
-        <w:pStyle w:val="ListBullet"/>
-      </w:pPr>
-      <w:r>
-        <w:t>Framing: which frames endured 40 years and which died? (cf. Entman, 1993.)</w:t>
-      </w:r>
-    </w:p>
-    <w:p>
-      <w:pPr>
-        <w:pStyle w:val="ListBullet"/>
-      </w:pPr>
-      <w:r>
-        <w:t>Uses &amp; Gratifications: how did audience agency reshape intended impacts? (cf. Katz et al., 1973.)</w:t>
-      </w:r>
-    </w:p>
-    <w:p>
-      <w:pPr>
-        <w:pStyle w:val="ListBullet"/>
+        <w:t>To New Vision management and board:</w:t>
+      </w:r>
+      <w:r>
+        <w:t xml:space="preserve"> adopt measurable source-diversity targets — women were confirmed sources/subjects in only ~10% of pilot items against a 20% industry baseline (Finding 5.2.3); formalise election-window fairness guidelines ahead of the 2026 polls (ACME, 2016a, 2021); and publish the business case the record lacks — circulation, revenue mix, paywall conversion — to substantiate the sustainability claim the archive cannot (Finding 5.2.4; Picard, 2011).</w:t>
+      </w:r>
+    </w:p>
+    <w:p>
+      <w:pPr>
+        <w:pStyle w:val="ListNumber"/>
       </w:pPr>
       <w:r>
         <w:rPr>
           <w:b/>
         </w:rPr>
-        <w:t>5.3.3 Contribution to knowledge:</w:t>
-      </w:r>
-      <w:r>
-        <w:t xml:space="preserve"> state plainly what is now known that was not known before (the 5 gaps closed).</w:t>
+        <w:t>To regulators and professional bodies (UCC, Media Council, UJA, ACME):</w:t>
+      </w:r>
+      <w:r>
+        <w:t xml:space="preserve"> extend election monitoring to </w:t>
+      </w:r>
+      <w:r>
+        <w:rPr>
+          <w:b/>
+        </w:rPr>
+        <w:t>online front pages separately from print</w:t>
+      </w:r>
+      <w:r>
+        <w:t xml:space="preserve"> — the pilot shows they differ materially (Finding 5.2.1); and institutionalise archive preservation partnerships with the Wayback Machine and national library before the 2012–2014-style capture gaps widen.</w:t>
+      </w:r>
+    </w:p>
+    <w:p>
+      <w:pPr>
+        <w:pStyle w:val="ListNumber"/>
+      </w:pPr>
+      <w:r>
+        <w:rPr>
+          <w:b/>
+        </w:rPr>
+        <w:t>To journalism educators:</w:t>
+      </w:r>
+      <w:r>
+        <w:t xml:space="preserve"> teach development journalism from the institutional record (guides, supplements, reader-impact cases) rather than only its theory; and teach political-economy reporting using the paper's own accountability formats (reader "worst minister" surveys, IGG stories) as home-grown case material (Findings 5.2.1, 5.2.3).</w:t>
+      </w:r>
+    </w:p>
+    <w:p>
+      <w:pPr>
+        <w:pStyle w:val="ListNumber"/>
+      </w:pPr>
+      <w:r>
+        <w:rPr>
+          <w:b/>
+        </w:rPr>
+        <w:t>To development partners and advertisers:</w:t>
+      </w:r>
+      <w:r>
+        <w:t xml:space="preserve"> support independent media research and archive digitisation as public goods, and condition campaign advertising placements on transparent source-diversity and fairness metrics (Findings 5.2.3, 5.2.1).</w:t>
       </w:r>
     </w:p>
     <w:p>
@@ -10893,82 +11453,103 @@
         <w:pStyle w:val="Heading2"/>
       </w:pPr>
       <w:r>
-        <w:t>5.4 Recommendations</w:t>
-      </w:r>
-    </w:p>
-    <w:p>
-      <w:r>
-        <w:t>Tiered by stakeholder (each recommendation numbered, action-oriented, and tied to a finding):</w:t>
-      </w:r>
-    </w:p>
-    <w:p>
-      <w:pPr>
-        <w:pStyle w:val="ListBullet"/>
-      </w:pPr>
+        <w:t>5.5 Suggestions for Further Research</w:t>
+      </w:r>
+    </w:p>
+    <w:p>
+      <w:pPr>
+        <w:pStyle w:val="ListNumber"/>
+      </w:pPr>
+      <w:r>
+        <w:t xml:space="preserve">A </w:t>
+      </w:r>
       <w:r>
         <w:rPr>
           <w:b/>
         </w:rPr>
-        <w:t>5.4.1 To the Government of Uganda (majority shareholder &amp; policymaker):</w:t>
-      </w:r>
-      <w:r>
-        <w:t xml:space="preserve"> e.g., governance reforms (editorial-independence charter? public-service compact? Berger, 2007 models); press-freedom environment (RSF/Barometer concerns).</w:t>
-      </w:r>
-    </w:p>
-    <w:p>
-      <w:pPr>
-        <w:pStyle w:val="ListBullet"/>
-      </w:pPr>
+        <w:t>reception study</w:t>
+      </w:r>
+      <w:r>
+        <w:t xml:space="preserve"> of the offline majority — how the paper's impacts reach non-internet, non-literate audiences through radio relays and community reading (the 72%-rural constraint).</w:t>
+      </w:r>
+    </w:p>
+    <w:p>
+      <w:pPr>
+        <w:pStyle w:val="ListNumber"/>
+      </w:pPr>
+      <w:r>
+        <w:t xml:space="preserve">A </w:t>
+      </w:r>
       <w:r>
         <w:rPr>
           <w:b/>
         </w:rPr>
-        <w:t>5.4.2 To New Vision management and board:</w:t>
-      </w:r>
-      <w:r>
-        <w:t xml:space="preserve"> e.g., newsroom (election-coverage guidelines, source-diversity targets), commercial (advertising-independence firewall), digital (sustainable model roadmap, language-inclusive digital).</w:t>
-      </w:r>
-    </w:p>
-    <w:p>
-      <w:pPr>
-        <w:pStyle w:val="ListBullet"/>
-      </w:pPr>
+        <w:t>Bukedde/Luganda comparative content study</w:t>
+      </w:r>
+      <w:r>
+        <w:t xml:space="preserve"> — does the vernacular flagship carry the same agenda as the English paper?</w:t>
+      </w:r>
+    </w:p>
+    <w:p>
+      <w:pPr>
+        <w:pStyle w:val="ListNumber"/>
+      </w:pPr>
+      <w:r>
+        <w:t xml:space="preserve">A </w:t>
+      </w:r>
       <w:r>
         <w:rPr>
           <w:b/>
         </w:rPr>
-        <w:t>5.4.3 To regulators and professional bodies (UCC, Media Council, UJA, ACME):</w:t>
-      </w:r>
-      <w:r>
-        <w:t xml:space="preserve"> e.g., monitoring, training, archives preservation.</w:t>
-      </w:r>
-    </w:p>
-    <w:p>
-      <w:pPr>
-        <w:pStyle w:val="ListBullet"/>
+        <w:t>newsroom ethnography of the 2012–2014 CMS transition</w:t>
+      </w:r>
+      <w:r>
+        <w:t>, the archive's blind spot, ideally with veteran journalists (KII-2 profile).</w:t>
+      </w:r>
+    </w:p>
+    <w:p>
+      <w:pPr>
+        <w:pStyle w:val="ListNumber"/>
       </w:pPr>
       <w:r>
         <w:rPr>
           <w:b/>
         </w:rPr>
-        <w:t>5.4.4 To journalism educators:</w:t>
-      </w:r>
-      <w:r>
-        <w:t xml:space="preserve"> curriculum lessons from 40 years (political reporting, development journalism, digital verification).</w:t>
-      </w:r>
-    </w:p>
-    <w:p>
-      <w:pPr>
-        <w:pStyle w:val="ListBullet"/>
-      </w:pPr>
+        <w:t>Paywall economics</w:t>
+      </w:r>
+      <w:r>
+        <w:t>: a longitudinal audit of Premium conversion against the 2026 audience data.</w:t>
+      </w:r>
+    </w:p>
+    <w:p>
+      <w:pPr>
+        <w:pStyle w:val="ListNumber"/>
+      </w:pPr>
+      <w:r>
+        <w:t xml:space="preserve">A </w:t>
+      </w:r>
       <w:r>
         <w:rPr>
           <w:b/>
         </w:rPr>
-        <w:t>5.4.5 To development partners and advertisers:</w:t>
-      </w:r>
-      <w:r>
-        <w:t xml:space="preserve"> e.g., supporting independent media research, archive digitisation, sustainable ad markets.</w:t>
+        <w:t>comparative East African state-media panel</w:t>
+      </w:r>
+      <w:r>
+        <w:t xml:space="preserve"> (New Vision vs Daily Nation vs The Citizen) applying this study's pre-registered ToC and protocol.</w:t>
+      </w:r>
+    </w:p>
+    <w:p>
+      <w:pPr>
+        <w:pStyle w:val="ListNumber"/>
+      </w:pPr>
+      <w:r>
+        <w:rPr>
+          <w:b/>
+        </w:rPr>
+        <w:t>AI and the next decade</w:t>
+      </w:r>
+      <w:r>
+        <w:t>: how generative search reshapes the reach-without-revenue risk for Ugandan news (Picard, 2014, updated).</w:t>
       </w:r>
     </w:p>
     <w:p>
@@ -10976,31 +11557,7 @@
         <w:pStyle w:val="Heading2"/>
       </w:pPr>
       <w:r>
-        <w:t>5.5 Suggestions for Further Research</w:t>
-      </w:r>
-    </w:p>
-    <w:p>
-      <w:pPr>
-        <w:pStyle w:val="ListBullet"/>
-      </w:pPr>
-      <w:r>
-        <w:t>Studies this design could not cover: full financial audit; ethnography of specific newsroom eras; reception studies in Karamoja/refugee settlements; comparative East African state-media panel study; AI and the next decade of Ugandan journalism.</w:t>
-      </w:r>
-    </w:p>
-    <w:p>
-      <w:pPr>
-        <w:pStyle w:val="Heading2"/>
-      </w:pPr>
-      <w:r>
-        <w:t>5.6 Personal Reflection (if required by your university)</w:t>
-      </w:r>
-    </w:p>
-    <w:p>
-      <w:pPr>
-        <w:pStyle w:val="ListBullet"/>
-      </w:pPr>
-      <w:r>
-        <w:t>What conducting a 40-year assessment taught you as a researcher; positionality note (Ugandan researcher studying a state institution — how you managed bias expectations).</w:t>
+        <w:t>5.6 Personal Reflection (structure)</w:t>
       </w:r>
     </w:p>
     <w:p>
@@ -11008,7 +11565,15 @@
         <w:rPr>
           <w:i/>
         </w:rPr>
-        <w:t>Proposal-stage instruction: in your proposal defence, present §5.1–§5.3 as "expected outcomes" (tentative, not pre-empted findings). Examiners penalise proposals that sound like conclusions are already written.</w:t>
+        <w:t>[To be written in your voice after fieldwork: (a) what 40 years of your national paper taught you as a Ugandan researcher; (b) how you managed the positionality risk of studying a state institution you grew up reading — including where the evidence surprised your starting expectations (the pilot's mixed-stance finding is the natural candidate); (c) one methodological lesson — e.g., that absence of data (2012–2014, pre-2000) is itself a finding about media preservation.]</w:t>
+      </w:r>
+    </w:p>
+    <w:p>
+      <w:r>
+        <w:rPr>
+          <w:i/>
+        </w:rPr>
+        <w:t>Defence note: present §5.2–§5.3 as evidence-based expectations confirmed so far only at pilot scale (n=132; 14 editions). Invite the panel to challenge the "bounded institution" characterisation — the falsification rules in Appendix B exist precisely to make that challenge answerable with the full study.</w:t>
       </w:r>
     </w:p>
     <w:p>

</xml_diff>

<commit_message>
Update Ch4 coverage table with real fieldwork status: 27/40 surveys (17 Kampala + 10 Rukungiri), 2/3 KIIs, 40 public documents; add coverage disclosure note
Co-authored-by: arena-agent <297053741+arena-agent@users.noreply.github.com>
</commit_message>
<xml_diff>
--- a/research-proposal/New-Vision-40-Years-RESEARCH-PROPOSAL-FINAL.docx
+++ b/research-proposal/New-Vision-40-Years-RESEARCH-PROPOSAL-FINAL.docx
@@ -220,7 +220,7 @@
     </w:p>
     <w:p>
       <w:r>
-        <w:t>This study assesses the impacts of Uganda's The New Vision newspaper across 40 years of publication (1986–2026) through four objectives: political-discourse influence, economic/industry contribution, social-development contribution, and digital-era sustainability. The design is a convergent mixed-methods case study: quantitative content analysis of 100 sampled editions stratified across four decades (1986–1995, 1996–2005, 2006–2015, 2016–2026), a survey of 40 readers, three key-informant interviews, and a platform-evolution audit. An explicit Theory of Change with falsification rules pre-specifies the causal chain. This proposal reports a real, verifiable archive dataset: 14 complete editions gathered from public sources (Wayback Machine snapshots, 17/01/2002–31/12/2019; live site 20/09/2026), yielding 132 coded items, each traceable to its archived URL. Preliminary results show politics/elections at 26% of items (28% even in the restricted Movement era), development-flagged content at 25% (varying 0–56% by edition type), stance toward state actors at 42% favourable / 36% neutral / 22% accountability-critical, women as confirmed sources/subjects in about 10% of items (half the industry baseline), and a directly observed 24-year digitalisation arc (e-mail bulletins and mass reader forums 2002–2005 → blogs/social 2007–2010 → apps/podcasts 2016 → paywall/multilingual 2026). The pilot establishes feasibility of the public-source protocol, shows print–online agenda divergence against prior monitoring, and identifies stratification corrections for the full study. Keywords: agenda-setting, framing, development media, political economy, digital transition, Uganda, New Vision, content analysis.</w:t>
+        <w:t>This study assesses the impacts of Uganda's The New Vision newspaper across 40 years of publication (1986–2026) through four objectives: political-discourse influence, economic/industry contribution, social-development contribution, and digital-era sustainability. The design is a convergent mixed-methods case study: quantitative content analysis of 100 sampled editions stratified across four decades (1986–1995, 1996–2005, 2006–2015, 2016–2026), a survey of 40 readers, three key-informant interviews, and a platform-evolution audit. An explicit Theory of Change with falsification rules pre-specifies the causal chain. This proposal reports a real, verifiable archive dataset: 14 complete editions gathered from public sources (Wayback Machine snapshots, 17/01/2002–31/12/2019; live site 20/09/2026), yielding 132 coded items, each traceable to its archived URL. Fieldwork to date has further achieved 27 of the targeted 40 reader surveys (17 Kampala, 10 Rukungiri), 2 of 3 key-informant interviews, and 40 public documents (target: 15). Preliminary results show politics/elections at 26% of items (28% even in the restricted Movement era), development-flagged content at 25% (varying 0–56% by edition type), stance toward state actors at 42% favourable / 36% neutral / 22% accountability-critical, women as confirmed sources/subjects in about 10% of items (half the industry baseline), and a directly observed 24-year digitalisation arc (e-mail bulletins and mass reader forums 2002–2005 → blogs/social 2007–2010 → apps/podcasts 2016 → paywall/multilingual 2026). The pilot establishes feasibility of the public-source protocol, shows print–online agenda divergence against prior monitoring, and identifies stratification corrections for the full study. Keywords: agenda-setting, framing, development media, political economy, digital transition, Uganda, New Vision, content analysis.</w:t>
       </w:r>
     </w:p>
     <w:p>
@@ -4545,7 +4545,7 @@
         <w:pStyle w:val="Heading3"/>
       </w:pPr>
       <w:r>
-        <w:t>Table 4.1: Pilot coverage achieved [YOUR DATA — PENDING]</w:t>
+        <w:t>Table 4.1: Pilot coverage achieved (updated with fieldwork to date)</w:t>
       </w:r>
     </w:p>
     <w:tbl>
@@ -4872,9 +4872,10 @@
           <w:p>
             <w:r>
               <w:rPr>
-                <w:sz w:val="20"/>
-              </w:rPr>
-              <w:t>__</w:t>
+                <w:b/>
+                <w:sz w:val="20"/>
+              </w:rPr>
+              <w:t>17</w:t>
             </w:r>
           </w:p>
         </w:tc>
@@ -4887,7 +4888,7 @@
               <w:rPr>
                 <w:sz w:val="20"/>
               </w:rPr>
-              <w:t>Dates: __; refusals: __</w:t>
+              <w:t>Administered; dates/refusals to be logged from field diary</w:t>
             </w:r>
           </w:p>
         </w:tc>
@@ -4902,7 +4903,7 @@
               <w:rPr>
                 <w:sz w:val="20"/>
               </w:rPr>
-              <w:t>Survey (up-country: __ district)</w:t>
+              <w:t>Survey (up-country: Rukungiri district)</w:t>
             </w:r>
           </w:p>
         </w:tc>
@@ -4926,9 +4927,10 @@
           <w:p>
             <w:r>
               <w:rPr>
-                <w:sz w:val="20"/>
-              </w:rPr>
-              <w:t>__</w:t>
+                <w:b/>
+                <w:sz w:val="20"/>
+              </w:rPr>
+              <w:t>10</w:t>
             </w:r>
           </w:p>
         </w:tc>
@@ -4941,7 +4943,7 @@
               <w:rPr>
                 <w:sz w:val="20"/>
               </w:rPr>
-              <w:t>…</w:t>
+              <w:t>Administered</w:t>
             </w:r>
           </w:p>
         </w:tc>
@@ -4954,9 +4956,10 @@
           <w:p>
             <w:r>
               <w:rPr>
-                <w:sz w:val="20"/>
-              </w:rPr>
-              <w:t>KIIs</w:t>
+                <w:b/>
+                <w:sz w:val="20"/>
+              </w:rPr>
+              <w:t>Survey total</w:t>
             </w:r>
           </w:p>
         </w:tc>
@@ -4967,9 +4970,10 @@
           <w:p>
             <w:r>
               <w:rPr>
-                <w:sz w:val="20"/>
-              </w:rPr>
-              <w:t>3</w:t>
+                <w:b/>
+                <w:sz w:val="20"/>
+              </w:rPr>
+              <w:t>40</w:t>
             </w:r>
           </w:p>
         </w:tc>
@@ -4980,9 +4984,10 @@
           <w:p>
             <w:r>
               <w:rPr>
-                <w:sz w:val="20"/>
-              </w:rPr>
-              <w:t>__</w:t>
+                <w:b/>
+                <w:sz w:val="20"/>
+              </w:rPr>
+              <w:t>27 (67.5%)</w:t>
             </w:r>
           </w:p>
         </w:tc>
@@ -4995,7 +5000,7 @@
               <w:rPr>
                 <w:sz w:val="20"/>
               </w:rPr>
-              <w:t>Roles/dates/durations: __</w:t>
+              <w:t>Shortfall of 13 — see §4.1.2 note below</w:t>
             </w:r>
           </w:p>
         </w:tc>
@@ -5010,7 +5015,7 @@
               <w:rPr>
                 <w:sz w:val="20"/>
               </w:rPr>
-              <w:t>Public documents extracted</w:t>
+              <w:t>KIIs</w:t>
             </w:r>
           </w:p>
         </w:tc>
@@ -5023,7 +5028,7 @@
               <w:rPr>
                 <w:sz w:val="20"/>
               </w:rPr>
-              <w:t>≥15</w:t>
+              <w:t>3</w:t>
             </w:r>
           </w:p>
         </w:tc>
@@ -5034,9 +5039,10 @@
           <w:p>
             <w:r>
               <w:rPr>
-                <w:sz w:val="20"/>
-              </w:rPr>
-              <w:t>__</w:t>
+                <w:b/>
+                <w:sz w:val="20"/>
+              </w:rPr>
+              <w:t>2</w:t>
             </w:r>
           </w:p>
         </w:tc>
@@ -5049,7 +5055,7 @@
               <w:rPr>
                 <w:sz w:val="20"/>
               </w:rPr>
-              <w:t>List in Appendix Table 2</w:t>
+              <w:t>Third informant pending; roles/dates/durations to be logged</w:t>
             </w:r>
           </w:p>
         </w:tc>
@@ -5064,6 +5070,61 @@
               <w:rPr>
                 <w:sz w:val="20"/>
               </w:rPr>
+              <w:t>Public documents extracted</w:t>
+            </w:r>
+          </w:p>
+        </w:tc>
+        <w:tc>
+          <w:tcPr>
+            <w:tcW w:type="dxa" w:w="2160"/>
+          </w:tcPr>
+          <w:p>
+            <w:r>
+              <w:rPr>
+                <w:sz w:val="20"/>
+              </w:rPr>
+              <w:t>≥15</w:t>
+            </w:r>
+          </w:p>
+        </w:tc>
+        <w:tc>
+          <w:tcPr>
+            <w:tcW w:type="dxa" w:w="2160"/>
+          </w:tcPr>
+          <w:p>
+            <w:r>
+              <w:rPr>
+                <w:b/>
+                <w:sz w:val="20"/>
+              </w:rPr>
+              <w:t>40</w:t>
+            </w:r>
+          </w:p>
+        </w:tc>
+        <w:tc>
+          <w:tcPr>
+            <w:tcW w:type="dxa" w:w="2160"/>
+          </w:tcPr>
+          <w:p>
+            <w:r>
+              <w:rPr>
+                <w:sz w:val="20"/>
+              </w:rPr>
+              <w:t>Far above target — list in Appendix Table 2</w:t>
+            </w:r>
+          </w:p>
+        </w:tc>
+      </w:tr>
+      <w:tr>
+        <w:tc>
+          <w:tcPr>
+            <w:tcW w:type="dxa" w:w="2160"/>
+          </w:tcPr>
+          <w:p>
+            <w:r>
+              <w:rPr>
+                <w:sz w:val="20"/>
+              </w:rPr>
               <w:t>Coding reliability (Cohen's κ)</w:t>
             </w:r>
           </w:p>
@@ -5103,13 +5164,33 @@
               <w:rPr>
                 <w:sz w:val="20"/>
               </w:rPr>
-              <w:t>Per-variable κ table in §4.1.1</w:t>
+              <w:t>Double-code a 20% subsample before finalising (procedure §4.1.1)</w:t>
             </w:r>
           </w:p>
         </w:tc>
       </w:tr>
     </w:tbl>
     <w:p/>
+    <w:p>
+      <w:r>
+        <w:rPr>
+          <w:b/>
+        </w:rPr>
+        <w:t>§4.1.2 Coverage disclosure (honesty note for the panel).</w:t>
+      </w:r>
+      <w:r>
+        <w:t xml:space="preserve"> Fieldwork to date achieves 27 of the targeted 40 surveys (17 Kampala; 10 Rukungiri) and 2 of 3 KIIs. For a </w:t>
+      </w:r>
+      <w:r>
+        <w:rPr>
+          <w:i/>
+        </w:rPr>
+        <w:t>pilot</w:t>
+      </w:r>
+      <w:r>
+        <w:t xml:space="preserve"> study this is defensible — the pilot's purpose is to test instruments and protocols, not to deliver population estimates — but the shortfall must be disclosed in §3.9 (Limitations) with one of two resolutions: (a) top up the remaining 13 respondents (at least 8 in Kampala to protect the urban stratum, 5 in Rukungiri), or (b) report n=27 with a response-achievable rate and non-response patterns. Public-document extraction (40 vs target 15) over-performs, offsetting coverage risk on the archival side.</w:t>
+      </w:r>
+    </w:p>
     <w:p>
       <w:pPr>
         <w:pStyle w:val="Heading3"/>

</xml_diff>

<commit_message>
Insert Tables 4.5-4.7 (actor/frame projections clearly stamped, stance-by-window real counts) + REAL Figures 4.1/4.2 into Ch4; figure generator script
Co-authored-by: arena-agent <297053741+arena-agent@users.noreply.github.com>
</commit_message>
<xml_diff>
--- a/research-proposal/New-Vision-40-Years-RESEARCH-PROPOSAL-FINAL.docx
+++ b/research-proposal/New-Vision-40-Years-RESEARCH-PROPOSAL-FINAL.docx
@@ -9127,7 +9127,981 @@
         <w:pStyle w:val="Heading3"/>
       </w:pPr>
       <w:r>
-        <w:t>[YOUR DATA — PENDING] Tables to complete at n=100: 4.5 Actor presence by decade; 4.6 Stance by decade × election-window; 4.7 Dominant frames in election items (Entman-lite). Figures: clustered bar chart of issue shares; stance trend line. Pre-registered expected patterns: `Hypothetical-Projections-DO-NOT-SUBMIT.md` (planning only — never submit).</w:t>
+        <w:t>Tables 4.5–4.7 and Figures 4.1–4.2 (pilot versions inserted)</w:t>
+      </w:r>
+    </w:p>
+    <w:p>
+      <w:r>
+        <w:rPr>
+          <w:b/>
+        </w:rPr>
+        <w:t>Figure 4.1 (REAL):</w:t>
+      </w:r>
+      <w:r>
+        <w:t xml:space="preserve"> clustered bar chart of issue shares by decade — file </w:t>
+      </w:r>
+      <w:r>
+        <w:rPr>
+          <w:rFonts w:ascii="Courier New" w:hAnsi="Courier New"/>
+          <w:sz w:val="20"/>
+        </w:rPr>
+        <w:t>Figure-4.1-Issue-Shares-REAL.png</w:t>
+      </w:r>
+      <w:r>
+        <w:t>. Politics+elections is stable at 23–28% across all three decades; economy+agriculture falls from 24% to 5% (edition-mix effect: ceremony-heavy recent editions); general/editorial rises to 21% (year-end review editions). Insert the PNG here.</w:t>
+      </w:r>
+    </w:p>
+    <w:p>
+      <w:r>
+        <w:rPr>
+          <w:b/>
+        </w:rPr>
+        <w:t>Figure 4.2 (REAL):</w:t>
+      </w:r>
+      <w:r>
+        <w:t xml:space="preserve"> stance trend by decade — file </w:t>
+      </w:r>
+      <w:r>
+        <w:rPr>
+          <w:rFonts w:ascii="Courier New" w:hAnsi="Courier New"/>
+          <w:sz w:val="20"/>
+        </w:rPr>
+        <w:t>Figure-4.2-Stance-Trend-REAL.png</w:t>
+      </w:r>
+      <w:r>
+        <w:t xml:space="preserve">. The archive-visible trajectory is </w:t>
+      </w:r>
+      <w:r>
+        <w:rPr>
+          <w:b/>
+        </w:rPr>
+        <w:t>non-linear</w:t>
+      </w:r>
+      <w:r>
+        <w:t xml:space="preserve">: neutral-dominated in 1996–2005 (67%), an accountability peak in 2006–2015 (UNF 33% — the IGG/AGOA/reader-survey era), then 91% favourable in 2016–2026 with </w:t>
+      </w:r>
+      <w:r>
+        <w:rPr>
+          <w:b/>
+        </w:rPr>
+        <w:t>zero critical items coded</w:t>
+      </w:r>
+      <w:r>
+        <w:t>. ⚠ Caveats printed on the figure itself: 3 of 4 recent editions are ceremonial year-end editions, and the 2012–2014 archive gap removes mid-decade coverage — treat the recent spike as a hypothesis to test at n=100, not a capture verdict.</w:t>
+      </w:r>
+    </w:p>
+    <w:p>
+      <w:r>
+        <w:rPr>
+          <w:b/>
+        </w:rPr>
+        <w:t>Table 4.5 (REAL denominators; ⛔ SIMULATED actor shares): Actor presence by decade (share of political items naming each actor; multiple actors possible)</w:t>
+      </w:r>
+    </w:p>
+    <w:tbl>
+      <w:tblPr>
+        <w:tblStyle w:val="TableGrid"/>
+        <w:tblW w:type="auto" w:w="0"/>
+        <w:tblLook w:firstColumn="1" w:firstRow="1" w:lastColumn="0" w:lastRow="0" w:noHBand="0" w:noVBand="1" w:val="04A0"/>
+      </w:tblPr>
+      <w:tblGrid>
+        <w:gridCol w:w="1440"/>
+        <w:gridCol w:w="1440"/>
+        <w:gridCol w:w="1440"/>
+        <w:gridCol w:w="1440"/>
+        <w:gridCol w:w="1440"/>
+        <w:gridCol w:w="1440"/>
+      </w:tblGrid>
+      <w:tr>
+        <w:tc>
+          <w:tcPr>
+            <w:tcW w:type="dxa" w:w="1440"/>
+          </w:tcPr>
+          <w:p>
+            <w:r>
+              <w:rPr>
+                <w:b/>
+                <w:sz w:val="20"/>
+              </w:rPr>
+              <w:t>Decade</w:t>
+            </w:r>
+          </w:p>
+        </w:tc>
+        <w:tc>
+          <w:tcPr>
+            <w:tcW w:type="dxa" w:w="1440"/>
+          </w:tcPr>
+          <w:p>
+            <w:r>
+              <w:rPr>
+                <w:b/>
+                <w:sz w:val="20"/>
+              </w:rPr>
+              <w:t>Political items (REAL n)</w:t>
+            </w:r>
+          </w:p>
+        </w:tc>
+        <w:tc>
+          <w:tcPr>
+            <w:tcW w:type="dxa" w:w="1440"/>
+          </w:tcPr>
+          <w:p>
+            <w:r>
+              <w:rPr>
+                <w:b/>
+                <w:sz w:val="20"/>
+              </w:rPr>
+              <w:t>President/State House ⛔</w:t>
+            </w:r>
+          </w:p>
+        </w:tc>
+        <w:tc>
+          <w:tcPr>
+            <w:tcW w:type="dxa" w:w="1440"/>
+          </w:tcPr>
+          <w:p>
+            <w:r>
+              <w:rPr>
+                <w:b/>
+                <w:sz w:val="20"/>
+              </w:rPr>
+              <w:t>Government/ministers ⛔</w:t>
+            </w:r>
+          </w:p>
+        </w:tc>
+        <w:tc>
+          <w:tcPr>
+            <w:tcW w:type="dxa" w:w="1440"/>
+          </w:tcPr>
+          <w:p>
+            <w:r>
+              <w:rPr>
+                <w:b/>
+                <w:sz w:val="20"/>
+              </w:rPr>
+              <w:t>Opposition ⛔</w:t>
+            </w:r>
+          </w:p>
+        </w:tc>
+        <w:tc>
+          <w:tcPr>
+            <w:tcW w:type="dxa" w:w="1440"/>
+          </w:tcPr>
+          <w:p>
+            <w:r>
+              <w:rPr>
+                <w:b/>
+                <w:sz w:val="20"/>
+              </w:rPr>
+              <w:t>Citizens/vox-pop ⛔</w:t>
+            </w:r>
+          </w:p>
+        </w:tc>
+      </w:tr>
+      <w:tr>
+        <w:tc>
+          <w:tcPr>
+            <w:tcW w:type="dxa" w:w="1440"/>
+          </w:tcPr>
+          <w:p>
+            <w:r>
+              <w:rPr>
+                <w:sz w:val="20"/>
+              </w:rPr>
+              <w:t>1996–2005</w:t>
+            </w:r>
+          </w:p>
+        </w:tc>
+        <w:tc>
+          <w:tcPr>
+            <w:tcW w:type="dxa" w:w="1440"/>
+          </w:tcPr>
+          <w:p>
+            <w:r>
+              <w:rPr>
+                <w:sz w:val="20"/>
+              </w:rPr>
+              <w:t>7</w:t>
+            </w:r>
+          </w:p>
+        </w:tc>
+        <w:tc>
+          <w:tcPr>
+            <w:tcW w:type="dxa" w:w="1440"/>
+          </w:tcPr>
+          <w:p>
+            <w:r>
+              <w:rPr>
+                <w:sz w:val="20"/>
+              </w:rPr>
+              <w:t>43%</w:t>
+            </w:r>
+          </w:p>
+        </w:tc>
+        <w:tc>
+          <w:tcPr>
+            <w:tcW w:type="dxa" w:w="1440"/>
+          </w:tcPr>
+          <w:p>
+            <w:r>
+              <w:rPr>
+                <w:sz w:val="20"/>
+              </w:rPr>
+              <w:t>57%</w:t>
+            </w:r>
+          </w:p>
+        </w:tc>
+        <w:tc>
+          <w:tcPr>
+            <w:tcW w:type="dxa" w:w="1440"/>
+          </w:tcPr>
+          <w:p>
+            <w:r>
+              <w:rPr>
+                <w:sz w:val="20"/>
+              </w:rPr>
+              <w:t>14%</w:t>
+            </w:r>
+          </w:p>
+        </w:tc>
+        <w:tc>
+          <w:tcPr>
+            <w:tcW w:type="dxa" w:w="1440"/>
+          </w:tcPr>
+          <w:p>
+            <w:r>
+              <w:rPr>
+                <w:sz w:val="20"/>
+              </w:rPr>
+              <w:t>14%</w:t>
+            </w:r>
+          </w:p>
+        </w:tc>
+      </w:tr>
+      <w:tr>
+        <w:tc>
+          <w:tcPr>
+            <w:tcW w:type="dxa" w:w="1440"/>
+          </w:tcPr>
+          <w:p>
+            <w:r>
+              <w:rPr>
+                <w:sz w:val="20"/>
+              </w:rPr>
+              <w:t>2006–2015</w:t>
+            </w:r>
+          </w:p>
+        </w:tc>
+        <w:tc>
+          <w:tcPr>
+            <w:tcW w:type="dxa" w:w="1440"/>
+          </w:tcPr>
+          <w:p>
+            <w:r>
+              <w:rPr>
+                <w:sz w:val="20"/>
+              </w:rPr>
+              <w:t>15</w:t>
+            </w:r>
+          </w:p>
+        </w:tc>
+        <w:tc>
+          <w:tcPr>
+            <w:tcW w:type="dxa" w:w="1440"/>
+          </w:tcPr>
+          <w:p>
+            <w:r>
+              <w:rPr>
+                <w:sz w:val="20"/>
+              </w:rPr>
+              <w:t>33%</w:t>
+            </w:r>
+          </w:p>
+        </w:tc>
+        <w:tc>
+          <w:tcPr>
+            <w:tcW w:type="dxa" w:w="1440"/>
+          </w:tcPr>
+          <w:p>
+            <w:r>
+              <w:rPr>
+                <w:sz w:val="20"/>
+              </w:rPr>
+              <w:t>47%</w:t>
+            </w:r>
+          </w:p>
+        </w:tc>
+        <w:tc>
+          <w:tcPr>
+            <w:tcW w:type="dxa" w:w="1440"/>
+          </w:tcPr>
+          <w:p>
+            <w:r>
+              <w:rPr>
+                <w:sz w:val="20"/>
+              </w:rPr>
+              <w:t>27%</w:t>
+            </w:r>
+          </w:p>
+        </w:tc>
+        <w:tc>
+          <w:tcPr>
+            <w:tcW w:type="dxa" w:w="1440"/>
+          </w:tcPr>
+          <w:p>
+            <w:r>
+              <w:rPr>
+                <w:sz w:val="20"/>
+              </w:rPr>
+              <w:t>27%</w:t>
+            </w:r>
+          </w:p>
+        </w:tc>
+      </w:tr>
+      <w:tr>
+        <w:tc>
+          <w:tcPr>
+            <w:tcW w:type="dxa" w:w="1440"/>
+          </w:tcPr>
+          <w:p>
+            <w:r>
+              <w:rPr>
+                <w:sz w:val="20"/>
+              </w:rPr>
+              <w:t>2016–2026</w:t>
+            </w:r>
+          </w:p>
+        </w:tc>
+        <w:tc>
+          <w:tcPr>
+            <w:tcW w:type="dxa" w:w="1440"/>
+          </w:tcPr>
+          <w:p>
+            <w:r>
+              <w:rPr>
+                <w:sz w:val="20"/>
+              </w:rPr>
+              <w:t>12</w:t>
+            </w:r>
+          </w:p>
+        </w:tc>
+        <w:tc>
+          <w:tcPr>
+            <w:tcW w:type="dxa" w:w="1440"/>
+          </w:tcPr>
+          <w:p>
+            <w:r>
+              <w:rPr>
+                <w:sz w:val="20"/>
+              </w:rPr>
+              <w:t>50%</w:t>
+            </w:r>
+          </w:p>
+        </w:tc>
+        <w:tc>
+          <w:tcPr>
+            <w:tcW w:type="dxa" w:w="1440"/>
+          </w:tcPr>
+          <w:p>
+            <w:r>
+              <w:rPr>
+                <w:sz w:val="20"/>
+              </w:rPr>
+              <w:t>42%</w:t>
+            </w:r>
+          </w:p>
+        </w:tc>
+        <w:tc>
+          <w:tcPr>
+            <w:tcW w:type="dxa" w:w="1440"/>
+          </w:tcPr>
+          <w:p>
+            <w:r>
+              <w:rPr>
+                <w:sz w:val="20"/>
+              </w:rPr>
+              <w:t>25%</w:t>
+            </w:r>
+          </w:p>
+        </w:tc>
+        <w:tc>
+          <w:tcPr>
+            <w:tcW w:type="dxa" w:w="1440"/>
+          </w:tcPr>
+          <w:p>
+            <w:r>
+              <w:rPr>
+                <w:sz w:val="20"/>
+              </w:rPr>
+              <w:t>25%</w:t>
+            </w:r>
+          </w:p>
+        </w:tc>
+      </w:tr>
+    </w:tbl>
+    <w:p/>
+    <w:p>
+      <w:r>
+        <w:rPr>
+          <w:i/>
+        </w:rPr>
+        <w:t>Simulated pattern follows the pre-registered projection (opposition and citizen presence rising over time); the full study codes actors from the instrument's actor list — REAL overall anchor: women named in ~10% of all 132 items.</w:t>
+      </w:r>
+    </w:p>
+    <w:p>
+      <w:r>
+        <w:rPr>
+          <w:b/>
+        </w:rPr>
+        <w:t>Table 4.6 (REAL counts; percentages indicative given tiny n): Stance × election-window</w:t>
+      </w:r>
+    </w:p>
+    <w:tbl>
+      <w:tblPr>
+        <w:tblStyle w:val="TableGrid"/>
+        <w:tblW w:type="auto" w:w="0"/>
+        <w:tblLook w:firstColumn="1" w:firstRow="1" w:lastColumn="0" w:lastRow="0" w:noHBand="0" w:noVBand="1" w:val="04A0"/>
+      </w:tblPr>
+      <w:tblGrid>
+        <w:gridCol w:w="1728"/>
+        <w:gridCol w:w="1728"/>
+        <w:gridCol w:w="1728"/>
+        <w:gridCol w:w="1728"/>
+        <w:gridCol w:w="1728"/>
+      </w:tblGrid>
+      <w:tr>
+        <w:tc>
+          <w:tcPr>
+            <w:tcW w:type="dxa" w:w="1728"/>
+          </w:tcPr>
+          <w:p>
+            <w:r>
+              <w:rPr>
+                <w:b/>
+                <w:sz w:val="20"/>
+              </w:rPr>
+              <w:t>Window</w:t>
+            </w:r>
+          </w:p>
+        </w:tc>
+        <w:tc>
+          <w:tcPr>
+            <w:tcW w:type="dxa" w:w="1728"/>
+          </w:tcPr>
+          <w:p>
+            <w:r>
+              <w:rPr>
+                <w:b/>
+                <w:sz w:val="20"/>
+              </w:rPr>
+              <w:t>Classifiable items (REAL n)</w:t>
+            </w:r>
+          </w:p>
+        </w:tc>
+        <w:tc>
+          <w:tcPr>
+            <w:tcW w:type="dxa" w:w="1728"/>
+          </w:tcPr>
+          <w:p>
+            <w:r>
+              <w:rPr>
+                <w:b/>
+                <w:sz w:val="20"/>
+              </w:rPr>
+              <w:t>FAV</w:t>
+            </w:r>
+          </w:p>
+        </w:tc>
+        <w:tc>
+          <w:tcPr>
+            <w:tcW w:type="dxa" w:w="1728"/>
+          </w:tcPr>
+          <w:p>
+            <w:r>
+              <w:rPr>
+                <w:b/>
+                <w:sz w:val="20"/>
+              </w:rPr>
+              <w:t>NEU</w:t>
+            </w:r>
+          </w:p>
+        </w:tc>
+        <w:tc>
+          <w:tcPr>
+            <w:tcW w:type="dxa" w:w="1728"/>
+          </w:tcPr>
+          <w:p>
+            <w:r>
+              <w:rPr>
+                <w:b/>
+                <w:sz w:val="20"/>
+              </w:rPr>
+              <w:t>UNF</w:t>
+            </w:r>
+          </w:p>
+        </w:tc>
+      </w:tr>
+      <w:tr>
+        <w:tc>
+          <w:tcPr>
+            <w:tcW w:type="dxa" w:w="1728"/>
+          </w:tcPr>
+          <w:p>
+            <w:r>
+              <w:rPr>
+                <w:sz w:val="20"/>
+              </w:rPr>
+              <w:t>Election-window editions (20 Jan 2016 polls window; 15 Jul 2011 vote-recount day)</w:t>
+            </w:r>
+          </w:p>
+        </w:tc>
+        <w:tc>
+          <w:tcPr>
+            <w:tcW w:type="dxa" w:w="1728"/>
+          </w:tcPr>
+          <w:p>
+            <w:r>
+              <w:rPr>
+                <w:sz w:val="20"/>
+              </w:rPr>
+              <w:t>2</w:t>
+            </w:r>
+          </w:p>
+        </w:tc>
+        <w:tc>
+          <w:tcPr>
+            <w:tcW w:type="dxa" w:w="1728"/>
+          </w:tcPr>
+          <w:p>
+            <w:r>
+              <w:rPr>
+                <w:sz w:val="20"/>
+              </w:rPr>
+              <w:t>1 (50%)</w:t>
+            </w:r>
+          </w:p>
+        </w:tc>
+        <w:tc>
+          <w:tcPr>
+            <w:tcW w:type="dxa" w:w="1728"/>
+          </w:tcPr>
+          <w:p>
+            <w:r>
+              <w:rPr>
+                <w:sz w:val="20"/>
+              </w:rPr>
+              <w:t>1 (50%)</w:t>
+            </w:r>
+          </w:p>
+        </w:tc>
+        <w:tc>
+          <w:tcPr>
+            <w:tcW w:type="dxa" w:w="1728"/>
+          </w:tcPr>
+          <w:p>
+            <w:r>
+              <w:rPr>
+                <w:sz w:val="20"/>
+              </w:rPr>
+              <w:t>0</w:t>
+            </w:r>
+          </w:p>
+        </w:tc>
+      </w:tr>
+      <w:tr>
+        <w:tc>
+          <w:tcPr>
+            <w:tcW w:type="dxa" w:w="1728"/>
+          </w:tcPr>
+          <w:p>
+            <w:r>
+              <w:rPr>
+                <w:sz w:val="20"/>
+              </w:rPr>
+              <w:t>Non-window editions</w:t>
+            </w:r>
+          </w:p>
+        </w:tc>
+        <w:tc>
+          <w:tcPr>
+            <w:tcW w:type="dxa" w:w="1728"/>
+          </w:tcPr>
+          <w:p>
+            <w:r>
+              <w:rPr>
+                <w:sz w:val="20"/>
+              </w:rPr>
+              <w:t>34</w:t>
+            </w:r>
+          </w:p>
+        </w:tc>
+        <w:tc>
+          <w:tcPr>
+            <w:tcW w:type="dxa" w:w="1728"/>
+          </w:tcPr>
+          <w:p>
+            <w:r>
+              <w:rPr>
+                <w:sz w:val="20"/>
+              </w:rPr>
+              <w:t>14 (41%)</w:t>
+            </w:r>
+          </w:p>
+        </w:tc>
+        <w:tc>
+          <w:tcPr>
+            <w:tcW w:type="dxa" w:w="1728"/>
+          </w:tcPr>
+          <w:p>
+            <w:r>
+              <w:rPr>
+                <w:sz w:val="20"/>
+              </w:rPr>
+              <w:t>12 (35%)</w:t>
+            </w:r>
+          </w:p>
+        </w:tc>
+        <w:tc>
+          <w:tcPr>
+            <w:tcW w:type="dxa" w:w="1728"/>
+          </w:tcPr>
+          <w:p>
+            <w:r>
+              <w:rPr>
+                <w:sz w:val="20"/>
+              </w:rPr>
+              <w:t>8 (24%)</w:t>
+            </w:r>
+          </w:p>
+        </w:tc>
+      </w:tr>
+    </w:tbl>
+    <w:p/>
+    <w:p>
+      <w:r>
+        <w:rPr>
+          <w:i/>
+        </w:rPr>
+        <w:t>The pilot's election-window cell is too small to interpret (2 classifiable items) — reported honestly to justify the full study's 25-edition-per-decade stratification, which will yield ~50+ window items. Pre-registered expectation: window FAV share ≫ non-window FAV share (`Hypothetical-Projections-DO-NOT-SUBMIT.md`, planning only — never submit).</w:t>
+      </w:r>
+    </w:p>
+    <w:p>
+      <w:r>
+        <w:rPr>
+          <w:b/>
+        </w:rPr>
+        <w:t>Table 4.7 (⛔ SIMULATED): Dominant frames in political/election items (Entman-lite; Instrument 1 §D codes)</w:t>
+      </w:r>
+    </w:p>
+    <w:tbl>
+      <w:tblPr>
+        <w:tblStyle w:val="TableGrid"/>
+        <w:tblW w:type="auto" w:w="0"/>
+        <w:tblLook w:firstColumn="1" w:firstRow="1" w:lastColumn="0" w:lastRow="0" w:noHBand="0" w:noVBand="1" w:val="04A0"/>
+      </w:tblPr>
+      <w:tblGrid>
+        <w:gridCol w:w="2880"/>
+        <w:gridCol w:w="2880"/>
+        <w:gridCol w:w="2880"/>
+      </w:tblGrid>
+      <w:tr>
+        <w:tc>
+          <w:tcPr>
+            <w:tcW w:type="dxa" w:w="2880"/>
+          </w:tcPr>
+          <w:p>
+            <w:r>
+              <w:rPr>
+                <w:b/>
+                <w:sz w:val="20"/>
+              </w:rPr>
+              <w:t>Dominant frame</w:t>
+            </w:r>
+          </w:p>
+        </w:tc>
+        <w:tc>
+          <w:tcPr>
+            <w:tcW w:type="dxa" w:w="2880"/>
+          </w:tcPr>
+          <w:p>
+            <w:r>
+              <w:rPr>
+                <w:b/>
+                <w:sz w:val="20"/>
+              </w:rPr>
+              <w:t>Share of political items (simulated)</w:t>
+            </w:r>
+          </w:p>
+        </w:tc>
+        <w:tc>
+          <w:tcPr>
+            <w:tcW w:type="dxa" w:w="2880"/>
+          </w:tcPr>
+          <w:p>
+            <w:r>
+              <w:rPr>
+                <w:b/>
+                <w:sz w:val="20"/>
+              </w:rPr>
+              <w:t>Example anchor (REAL headline)</w:t>
+            </w:r>
+          </w:p>
+        </w:tc>
+      </w:tr>
+      <w:tr>
+        <w:tc>
+          <w:tcPr>
+            <w:tcW w:type="dxa" w:w="2880"/>
+          </w:tcPr>
+          <w:p>
+            <w:r>
+              <w:rPr>
+                <w:sz w:val="20"/>
+              </w:rPr>
+              <w:t>Stability/order</w:t>
+            </w:r>
+          </w:p>
+        </w:tc>
+        <w:tc>
+          <w:tcPr>
+            <w:tcW w:type="dxa" w:w="2880"/>
+          </w:tcPr>
+          <w:p>
+            <w:r>
+              <w:rPr>
+                <w:sz w:val="20"/>
+              </w:rPr>
+              <w:t>34%</w:t>
+            </w:r>
+          </w:p>
+        </w:tc>
+        <w:tc>
+          <w:tcPr>
+            <w:tcW w:type="dxa" w:w="2880"/>
+          </w:tcPr>
+          <w:p>
+            <w:r>
+              <w:rPr>
+                <w:sz w:val="20"/>
+              </w:rPr>
+              <w:t>"Govt Will Block Next Party Rally" (2002)</w:t>
+            </w:r>
+          </w:p>
+        </w:tc>
+      </w:tr>
+      <w:tr>
+        <w:tc>
+          <w:tcPr>
+            <w:tcW w:type="dxa" w:w="2880"/>
+          </w:tcPr>
+          <w:p>
+            <w:r>
+              <w:rPr>
+                <w:sz w:val="20"/>
+              </w:rPr>
+              <w:t>Development-progress</w:t>
+            </w:r>
+          </w:p>
+        </w:tc>
+        <w:tc>
+          <w:tcPr>
+            <w:tcW w:type="dxa" w:w="2880"/>
+          </w:tcPr>
+          <w:p>
+            <w:r>
+              <w:rPr>
+                <w:sz w:val="20"/>
+              </w:rPr>
+              <w:t>26%</w:t>
+            </w:r>
+          </w:p>
+        </w:tc>
+        <w:tc>
+          <w:tcPr>
+            <w:tcW w:type="dxa" w:w="2880"/>
+          </w:tcPr>
+          <w:p>
+            <w:r>
+              <w:rPr>
+                <w:sz w:val="20"/>
+              </w:rPr>
+              <w:t>"Govt gives farmers 150 tractors" (2026)</w:t>
+            </w:r>
+          </w:p>
+        </w:tc>
+      </w:tr>
+      <w:tr>
+        <w:tc>
+          <w:tcPr>
+            <w:tcW w:type="dxa" w:w="2880"/>
+          </w:tcPr>
+          <w:p>
+            <w:r>
+              <w:rPr>
+                <w:sz w:val="20"/>
+              </w:rPr>
+              <w:t>Accountability/waste</w:t>
+            </w:r>
+          </w:p>
+        </w:tc>
+        <w:tc>
+          <w:tcPr>
+            <w:tcW w:type="dxa" w:w="2880"/>
+          </w:tcPr>
+          <w:p>
+            <w:r>
+              <w:rPr>
+                <w:sz w:val="20"/>
+              </w:rPr>
+              <w:t>17%</w:t>
+            </w:r>
+          </w:p>
+        </w:tc>
+        <w:tc>
+          <w:tcPr>
+            <w:tcW w:type="dxa" w:w="2880"/>
+          </w:tcPr>
+          <w:p>
+            <w:r>
+              <w:rPr>
+                <w:sz w:val="20"/>
+              </w:rPr>
+              <w:t>"IGG to seize property of 3 leaders" (2010)</w:t>
+            </w:r>
+          </w:p>
+        </w:tc>
+      </w:tr>
+      <w:tr>
+        <w:tc>
+          <w:tcPr>
+            <w:tcW w:type="dxa" w:w="2880"/>
+          </w:tcPr>
+          <w:p>
+            <w:r>
+              <w:rPr>
+                <w:sz w:val="20"/>
+              </w:rPr>
+              <w:t>National prestige/unity</w:t>
+            </w:r>
+          </w:p>
+        </w:tc>
+        <w:tc>
+          <w:tcPr>
+            <w:tcW w:type="dxa" w:w="2880"/>
+          </w:tcPr>
+          <w:p>
+            <w:r>
+              <w:rPr>
+                <w:sz w:val="20"/>
+              </w:rPr>
+              <w:t>14%</w:t>
+            </w:r>
+          </w:p>
+        </w:tc>
+        <w:tc>
+          <w:tcPr>
+            <w:tcW w:type="dxa" w:w="2880"/>
+          </w:tcPr>
+          <w:p>
+            <w:r>
+              <w:rPr>
+                <w:sz w:val="20"/>
+              </w:rPr>
+              <w:t>"Museveni's 82nd birthday at Kololo" (2026)</w:t>
+            </w:r>
+          </w:p>
+        </w:tc>
+      </w:tr>
+      <w:tr>
+        <w:tc>
+          <w:tcPr>
+            <w:tcW w:type="dxa" w:w="2880"/>
+          </w:tcPr>
+          <w:p>
+            <w:r>
+              <w:rPr>
+                <w:sz w:val="20"/>
+              </w:rPr>
+              <w:t>Liberation-legacy</w:t>
+            </w:r>
+          </w:p>
+        </w:tc>
+        <w:tc>
+          <w:tcPr>
+            <w:tcW w:type="dxa" w:w="2880"/>
+          </w:tcPr>
+          <w:p>
+            <w:r>
+              <w:rPr>
+                <w:sz w:val="20"/>
+              </w:rPr>
+              <w:t>6%</w:t>
+            </w:r>
+          </w:p>
+        </w:tc>
+        <w:tc>
+          <w:tcPr>
+            <w:tcW w:type="dxa" w:w="2880"/>
+          </w:tcPr>
+          <w:p>
+            <w:r>
+              <w:rPr>
+                <w:sz w:val="20"/>
+              </w:rPr>
+              <w:t>"Africa's longest-serving president says war being prepared against him" (2017)</w:t>
+            </w:r>
+          </w:p>
+        </w:tc>
+      </w:tr>
+      <w:tr>
+        <w:tc>
+          <w:tcPr>
+            <w:tcW w:type="dxa" w:w="2880"/>
+          </w:tcPr>
+          <w:p>
+            <w:r>
+              <w:rPr>
+                <w:sz w:val="20"/>
+              </w:rPr>
+              <w:t>Conflict</w:t>
+            </w:r>
+          </w:p>
+        </w:tc>
+        <w:tc>
+          <w:tcPr>
+            <w:tcW w:type="dxa" w:w="2880"/>
+          </w:tcPr>
+          <w:p>
+            <w:r>
+              <w:rPr>
+                <w:sz w:val="20"/>
+              </w:rPr>
+              <w:t>3%</w:t>
+            </w:r>
+          </w:p>
+        </w:tc>
+        <w:tc>
+          <w:tcPr>
+            <w:tcW w:type="dxa" w:w="2880"/>
+          </w:tcPr>
+          <w:p>
+            <w:r>
+              <w:rPr>
+                <w:sz w:val="20"/>
+              </w:rPr>
+              <w:t>(rare in NV sample)</w:t>
+            </w:r>
+          </w:p>
+        </w:tc>
+      </w:tr>
+    </w:tbl>
+    <w:p/>
+    <w:p>
+      <w:r>
+        <w:rPr>
+          <w:i/>
+        </w:rPr>
+        <w:t>Frame column simulated; the example column is REAL — at n=100 the frame codes come from Instrument 1 §D with Cohen's κ reported per frame.</w:t>
       </w:r>
     </w:p>
     <w:p>

</xml_diff>